<commit_message>
Refine high risk SEF KYC approval flow
</commit_message>
<xml_diff>
--- a/backend/templates/kyc-part-1-template.docx
+++ b/backend/templates/kyc-part-1-template.docx
@@ -385,6 +385,11 @@
           </w:tcPr>
           <w:p>
             <w:r>
+              <w:rPr>
+                <w:rFonts w:ascii="Times New Roman" w:hAnsi="Times New Roman" w:cs="Times New Roman"/>
+                <w:sz w:val="18"/>
+                <w:szCs w:val="18"/>
+              </w:rPr>
               <w:t xml:space="preserve">{legalName}</w:t>
             </w:r>
           </w:p>
@@ -517,6 +522,11 @@
           </w:tcPr>
           <w:p>
             <w:r>
+              <w:rPr>
+                <w:rFonts w:ascii="Times New Roman" w:hAnsi="Times New Roman" w:cs="Times New Roman"/>
+                <w:sz w:val="18"/>
+                <w:szCs w:val="18"/>
+              </w:rPr>
               <w:t xml:space="preserve">{commercialRegistrationNo}</w:t>
             </w:r>
           </w:p>
@@ -648,6 +658,11 @@
           </w:tcPr>
           <w:p>
             <w:r>
+              <w:rPr>
+                <w:rFonts w:ascii="Times New Roman" w:hAnsi="Times New Roman" w:cs="Times New Roman"/>
+                <w:sz w:val="18"/>
+                <w:szCs w:val="18"/>
+              </w:rPr>
               <w:t xml:space="preserve">{taxIdentificationNo}</w:t>
             </w:r>
           </w:p>
@@ -756,8 +771,14 @@
           </w:tcPr>
           <w:p>
             <w:r>
-              <w:t xml:space="preserve">Date: {dateOfIncorporation}
-Country: {countryOfIncorporation}</w:t>
+              <w:rPr>
+                <w:rFonts w:ascii="Times New Roman" w:hAnsi="Times New Roman" w:cs="Times New Roman"/>
+                <w:sz w:val="18"/>
+                <w:szCs w:val="18"/>
+              </w:rPr>
+              <w:t xml:space="preserve">Date: {dateOfIncorporation}</w:t>
+              <w:br/>
+              <w:t xml:space="preserve">Country: {countryOfIncorporation}</w:t>
             </w:r>
           </w:p>
         </w:tc>
@@ -843,6 +864,11 @@
           </w:tcPr>
           <w:p>
             <w:r>
+              <w:rPr>
+                <w:rFonts w:ascii="Times New Roman" w:hAnsi="Times New Roman" w:cs="Times New Roman"/>
+                <w:sz w:val="18"/>
+                <w:szCs w:val="18"/>
+              </w:rPr>
               <w:t xml:space="preserve">{legalForm}</w:t>
             </w:r>
           </w:p>
@@ -936,6 +962,11 @@
           </w:tcPr>
           <w:p>
             <w:r>
+              <w:rPr>
+                <w:rFonts w:ascii="Times New Roman" w:hAnsi="Times New Roman" w:cs="Times New Roman"/>
+                <w:sz w:val="18"/>
+                <w:szCs w:val="18"/>
+              </w:rPr>
               <w:t xml:space="preserve">{registeredOfficeAddress}</w:t>
             </w:r>
           </w:p>
@@ -1022,6 +1053,11 @@
           </w:tcPr>
           <w:p>
             <w:r>
+              <w:rPr>
+                <w:rFonts w:ascii="Times New Roman" w:hAnsi="Times New Roman" w:cs="Times New Roman"/>
+                <w:sz w:val="18"/>
+                <w:szCs w:val="18"/>
+              </w:rPr>
               <w:t xml:space="preserve">{telephone}</w:t>
             </w:r>
           </w:p>
@@ -1100,6 +1136,11 @@
           </w:tcPr>
           <w:p>
             <w:r>
+              <w:rPr>
+                <w:rFonts w:ascii="Times New Roman" w:hAnsi="Times New Roman" w:cs="Times New Roman"/>
+                <w:sz w:val="18"/>
+                <w:szCs w:val="18"/>
+              </w:rPr>
               <w:t xml:space="preserve">{email}</w:t>
             </w:r>
           </w:p>
@@ -1171,6 +1212,11 @@
           </w:tcPr>
           <w:p>
             <w:r>
+              <w:rPr>
+                <w:rFonts w:ascii="Times New Roman" w:hAnsi="Times New Roman" w:cs="Times New Roman"/>
+                <w:sz w:val="18"/>
+                <w:szCs w:val="18"/>
+              </w:rPr>
               <w:t xml:space="preserve">{website}</w:t>
             </w:r>
           </w:p>
@@ -1337,6 +1383,11 @@
           </w:tcPr>
           <w:p>
             <w:r>
+              <w:rPr>
+                <w:rFonts w:ascii="Times New Roman" w:hAnsi="Times New Roman" w:cs="Times New Roman"/>
+                <w:sz w:val="18"/>
+                <w:szCs w:val="18"/>
+              </w:rPr>
               <w:t xml:space="preserve">{businessNature}</w:t>
             </w:r>
           </w:p>
@@ -1415,6 +1466,11 @@
           </w:tcPr>
           <w:p>
             <w:r>
+              <w:rPr>
+                <w:rFonts w:ascii="Times New Roman" w:hAnsi="Times New Roman" w:cs="Times New Roman"/>
+                <w:sz w:val="18"/>
+                <w:szCs w:val="18"/>
+              </w:rPr>
               <w:t xml:space="preserve">{licenseActivities}</w:t>
             </w:r>
           </w:p>
@@ -1493,6 +1549,11 @@
           </w:tcPr>
           <w:p>
             <w:r>
+              <w:rPr>
+                <w:rFonts w:ascii="Times New Roman" w:hAnsi="Times New Roman" w:cs="Times New Roman"/>
+                <w:sz w:val="18"/>
+                <w:szCs w:val="18"/>
+              </w:rPr>
               <w:t xml:space="preserve">{relatedIndustry}</w:t>
             </w:r>
           </w:p>
@@ -1676,6 +1737,11 @@
           </w:tcPr>
           <w:p>
             <w:r>
+              <w:rPr>
+                <w:rFonts w:ascii="Times New Roman" w:hAnsi="Times New Roman" w:cs="Times New Roman"/>
+                <w:sz w:val="18"/>
+                <w:szCs w:val="18"/>
+              </w:rPr>
               <w:t xml:space="preserve">{prospectiveService}</w:t>
             </w:r>
           </w:p>
@@ -2080,6 +2146,11 @@
           </w:tcPr>
           <w:p>
             <w:r>
+              <w:rPr>
+                <w:rFonts w:ascii="Times New Roman" w:hAnsi="Times New Roman" w:cs="Times New Roman"/>
+                <w:sz w:val="18"/>
+                <w:szCs w:val="18"/>
+              </w:rPr>
               <w:t xml:space="preserve">{#shareholders}{shareholderNo}</w:t>
             </w:r>
           </w:p>
@@ -2093,6 +2164,11 @@
           </w:tcPr>
           <w:p>
             <w:r>
+              <w:rPr>
+                <w:rFonts w:ascii="Times New Roman" w:hAnsi="Times New Roman" w:cs="Times New Roman"/>
+                <w:sz w:val="18"/>
+                <w:szCs w:val="18"/>
+              </w:rPr>
               <w:t xml:space="preserve">{shareholderFullName}</w:t>
             </w:r>
           </w:p>
@@ -2106,6 +2182,11 @@
           </w:tcPr>
           <w:p>
             <w:r>
+              <w:rPr>
+                <w:rFonts w:ascii="Times New Roman" w:hAnsi="Times New Roman" w:cs="Times New Roman"/>
+                <w:sz w:val="18"/>
+                <w:szCs w:val="18"/>
+              </w:rPr>
               <w:t xml:space="preserve">{shareholderNationality}</w:t>
             </w:r>
           </w:p>
@@ -2119,6 +2200,11 @@
           </w:tcPr>
           <w:p>
             <w:r>
+              <w:rPr>
+                <w:rFonts w:ascii="Times New Roman" w:hAnsi="Times New Roman" w:cs="Times New Roman"/>
+                <w:sz w:val="18"/>
+                <w:szCs w:val="18"/>
+              </w:rPr>
               <w:t xml:space="preserve">{shareholderDateOfBirth}</w:t>
             </w:r>
           </w:p>
@@ -2132,6 +2218,11 @@
           </w:tcPr>
           <w:p>
             <w:r>
+              <w:rPr>
+                <w:rFonts w:ascii="Times New Roman" w:hAnsi="Times New Roman" w:cs="Times New Roman"/>
+                <w:sz w:val="18"/>
+                <w:szCs w:val="18"/>
+              </w:rPr>
               <w:t xml:space="preserve">{shareholderIdentityNumber}</w:t>
             </w:r>
           </w:p>
@@ -2145,6 +2236,11 @@
           </w:tcPr>
           <w:p>
             <w:r>
+              <w:rPr>
+                <w:rFonts w:ascii="Times New Roman" w:hAnsi="Times New Roman" w:cs="Times New Roman"/>
+                <w:sz w:val="18"/>
+                <w:szCs w:val="18"/>
+              </w:rPr>
               <w:t xml:space="preserve">{shareholderOwnershipPercentage}</w:t>
             </w:r>
           </w:p>
@@ -2158,6 +2254,11 @@
           </w:tcPr>
           <w:p>
             <w:r>
+              <w:rPr>
+                <w:rFonts w:ascii="Times New Roman" w:hAnsi="Times New Roman" w:cs="Times New Roman"/>
+                <w:sz w:val="18"/>
+                <w:szCs w:val="18"/>
+              </w:rPr>
               <w:t xml:space="preserve">{shareholderResidenceAddress}{/shareholders}</w:t>
             </w:r>
           </w:p>
@@ -2300,6 +2401,11 @@
           </w:tcPr>
           <w:p>
             <w:r>
+              <w:rPr>
+                <w:rFonts w:ascii="Times New Roman" w:hAnsi="Times New Roman" w:cs="Times New Roman"/>
+                <w:sz w:val="18"/>
+                <w:szCs w:val="18"/>
+              </w:rPr>
               <w:t xml:space="preserve">{totalOwnershipPercentage}</w:t>
             </w:r>
           </w:p>
@@ -2621,170 +2727,23 @@
       </w:pPr>
     </w:p>
     <w:p>
-      <w:pPr>
-        <w:pStyle w:val="BodyText"/>
-        <w:tabs>
-          <w:tab w:val="left" w:pos="1077"/>
-          <w:tab w:val="left" w:pos="1533"/>
-        </w:tabs>
-        <w:spacing w:before="7"/>
-        <w:ind w:left="165"/>
-        <w:rPr>
-          <w:rFonts w:asciiTheme="majorHAnsi" w:hAnsiTheme="majorHAnsi"/>
-        </w:rPr>
-      </w:pPr>
-      <w:r>
-        <w:rPr>
-          <w:rFonts w:asciiTheme="majorHAnsi" w:hAnsiTheme="majorHAnsi"/>
-          <w:spacing w:val="-5"/>
-        </w:rPr>
-        <w:t>Yes</w:t>
-      </w:r>
-      <w:r>
-        <w:rPr>
-          <w:rFonts w:asciiTheme="majorHAnsi" w:hAnsiTheme="majorHAnsi"/>
-        </w:rPr>
-        <w:t xml:space="preserve"> </w:t>
-      </w:r>
-      <w:r>
-        <w:rPr>
-          <w:rFonts w:ascii="Segoe UI Symbol" w:hAnsi="Segoe UI Symbol" w:cs="Segoe UI Symbol"/>
-          <w:spacing w:val="-12"/>
-        </w:rPr>
-        <w:t>☐</w:t>
-      </w:r>
-      <w:r>
-        <w:rPr>
-          <w:rFonts w:asciiTheme="majorHAnsi" w:hAnsiTheme="majorHAnsi"/>
-        </w:rPr>
-        <w:tab/>
-      </w:r>
-      <w:r>
-        <w:rPr>
-          <w:rFonts w:asciiTheme="majorHAnsi" w:hAnsiTheme="majorHAnsi"/>
-          <w:spacing w:val="-5"/>
-        </w:rPr>
-        <w:t>No</w:t>
-      </w:r>
-      <w:r>
-        <w:rPr>
-          <w:rFonts w:asciiTheme="majorHAnsi" w:hAnsiTheme="majorHAnsi"/>
-        </w:rPr>
-        <w:t xml:space="preserve"> </w:t>
-      </w:r>
-      <w:r>
-        <w:rPr>
-          <w:rFonts w:ascii="Segoe UI Symbol" w:hAnsi="Segoe UI Symbol" w:cs="Segoe UI Symbol"/>
-          <w:spacing w:val="-12"/>
-        </w:rPr>
-        <w:t>☐</w:t>
-      </w:r>
-    </w:p>
-    <w:p>
-      <w:pPr>
-        <w:pStyle w:val="BodyText"/>
-        <w:spacing w:before="176" w:line="434" w:lineRule="auto"/>
-        <w:ind w:left="165" w:right="4730"/>
-        <w:rPr>
-          <w:rFonts w:asciiTheme="majorHAnsi" w:hAnsiTheme="majorHAnsi"/>
-        </w:rPr>
-      </w:pPr>
-      <w:r>
-        <w:rPr>
-          <w:rFonts w:asciiTheme="majorHAnsi" w:hAnsiTheme="majorHAnsi"/>
-        </w:rPr>
-        <w:t>If</w:t>
-      </w:r>
-      <w:r>
-        <w:rPr>
-          <w:rFonts w:asciiTheme="majorHAnsi" w:hAnsiTheme="majorHAnsi"/>
-          <w:spacing w:val="-6"/>
-        </w:rPr>
-        <w:t xml:space="preserve"> </w:t>
-      </w:r>
-      <w:r>
-        <w:rPr>
-          <w:rFonts w:asciiTheme="majorHAnsi" w:hAnsiTheme="majorHAnsi"/>
-        </w:rPr>
-        <w:t>yes,</w:t>
-      </w:r>
-      <w:r>
-        <w:rPr>
-          <w:rFonts w:asciiTheme="majorHAnsi" w:hAnsiTheme="majorHAnsi"/>
-          <w:spacing w:val="-6"/>
-        </w:rPr>
-        <w:t xml:space="preserve"> </w:t>
-      </w:r>
-      <w:r>
-        <w:rPr>
-          <w:rFonts w:asciiTheme="majorHAnsi" w:hAnsiTheme="majorHAnsi"/>
-        </w:rPr>
-        <w:t>please</w:t>
-      </w:r>
-      <w:r>
-        <w:rPr>
-          <w:rFonts w:asciiTheme="majorHAnsi" w:hAnsiTheme="majorHAnsi"/>
-          <w:spacing w:val="-5"/>
-        </w:rPr>
-        <w:t xml:space="preserve"> </w:t>
-      </w:r>
-      <w:r>
-        <w:rPr>
-          <w:rFonts w:asciiTheme="majorHAnsi" w:hAnsiTheme="majorHAnsi"/>
-        </w:rPr>
-        <w:t>provide</w:t>
-      </w:r>
-      <w:r>
-        <w:rPr>
-          <w:rFonts w:asciiTheme="majorHAnsi" w:hAnsiTheme="majorHAnsi"/>
-          <w:spacing w:val="-5"/>
-        </w:rPr>
-        <w:t xml:space="preserve"> </w:t>
-      </w:r>
-      <w:r>
-        <w:rPr>
-          <w:rFonts w:asciiTheme="majorHAnsi" w:hAnsiTheme="majorHAnsi"/>
-        </w:rPr>
-        <w:t>UBOs/Group</w:t>
-      </w:r>
-      <w:r>
-        <w:rPr>
-          <w:rFonts w:asciiTheme="majorHAnsi" w:hAnsiTheme="majorHAnsi"/>
-          <w:spacing w:val="-4"/>
-        </w:rPr>
-        <w:t xml:space="preserve"> </w:t>
-      </w:r>
-      <w:r>
-        <w:rPr>
-          <w:rFonts w:asciiTheme="majorHAnsi" w:hAnsiTheme="majorHAnsi"/>
-        </w:rPr>
-        <w:t>structure</w:t>
-      </w:r>
-      <w:r>
-        <w:rPr>
-          <w:rFonts w:asciiTheme="majorHAnsi" w:hAnsiTheme="majorHAnsi"/>
-          <w:spacing w:val="-5"/>
-        </w:rPr>
-        <w:t xml:space="preserve"> </w:t>
-      </w:r>
-      <w:r>
-        <w:rPr>
-          <w:rFonts w:asciiTheme="majorHAnsi" w:hAnsiTheme="majorHAnsi"/>
-        </w:rPr>
-        <w:t>and</w:t>
-      </w:r>
-      <w:r>
-        <w:rPr>
-          <w:rFonts w:asciiTheme="majorHAnsi" w:hAnsiTheme="majorHAnsi"/>
-          <w:spacing w:val="-4"/>
-        </w:rPr>
-        <w:t xml:space="preserve"> </w:t>
-      </w:r>
-      <w:r>
-        <w:rPr>
-          <w:rFonts w:asciiTheme="majorHAnsi" w:hAnsiTheme="majorHAnsi"/>
-        </w:rPr>
-        <w:t>details. UBOs/ Group structure:</w:t>
+      <w:r>
+        <w:rPr>
+          <w:rFonts w:ascii="Times New Roman" w:hAnsi="Times New Roman" w:cs="Times New Roman"/>
+          <w:sz w:val="18"/>
+          <w:szCs w:val="18"/>
+        </w:rPr>
+        <w:t xml:space="preserve">Yes {uboDifferentYes}    No {uboDifferentNo}</w:t>
+      </w:r>
+    </w:p>
+    <w:p>
+      <w:r>
+        <w:rPr>
+          <w:rFonts w:ascii="Times New Roman" w:hAnsi="Times New Roman" w:cs="Times New Roman"/>
+          <w:sz w:val="18"/>
+          <w:szCs w:val="18"/>
+        </w:rPr>
+        <w:t xml:space="preserve">If yes, please provide UBOs/Group structure and details. UBOs/ Group structure: {uboGroupStructureNotes}</w:t>
       </w:r>
     </w:p>
     <w:p>
@@ -3245,6 +3204,11 @@
           </w:tcPr>
           <w:p>
             <w:r>
+              <w:rPr>
+                <w:rFonts w:ascii="Times New Roman" w:hAnsi="Times New Roman" w:cs="Times New Roman"/>
+                <w:sz w:val="18"/>
+                <w:szCs w:val="18"/>
+              </w:rPr>
               <w:t xml:space="preserve">{#ubos}{uboNo}</w:t>
             </w:r>
           </w:p>
@@ -3258,6 +3222,11 @@
           </w:tcPr>
           <w:p>
             <w:r>
+              <w:rPr>
+                <w:rFonts w:ascii="Times New Roman" w:hAnsi="Times New Roman" w:cs="Times New Roman"/>
+                <w:sz w:val="18"/>
+                <w:szCs w:val="18"/>
+              </w:rPr>
               <w:t xml:space="preserve">{uboFullName}</w:t>
             </w:r>
           </w:p>
@@ -3271,6 +3240,11 @@
           </w:tcPr>
           <w:p>
             <w:r>
+              <w:rPr>
+                <w:rFonts w:ascii="Times New Roman" w:hAnsi="Times New Roman" w:cs="Times New Roman"/>
+                <w:sz w:val="18"/>
+                <w:szCs w:val="18"/>
+              </w:rPr>
               <w:t xml:space="preserve">{uboNationality}</w:t>
             </w:r>
           </w:p>
@@ -3284,6 +3258,11 @@
           </w:tcPr>
           <w:p>
             <w:r>
+              <w:rPr>
+                <w:rFonts w:ascii="Times New Roman" w:hAnsi="Times New Roman" w:cs="Times New Roman"/>
+                <w:sz w:val="18"/>
+                <w:szCs w:val="18"/>
+              </w:rPr>
               <w:t xml:space="preserve">{uboDateOfBirth}</w:t>
             </w:r>
           </w:p>
@@ -3297,6 +3276,11 @@
           </w:tcPr>
           <w:p>
             <w:r>
+              <w:rPr>
+                <w:rFonts w:ascii="Times New Roman" w:hAnsi="Times New Roman" w:cs="Times New Roman"/>
+                <w:sz w:val="18"/>
+                <w:szCs w:val="18"/>
+              </w:rPr>
               <w:t xml:space="preserve">{uboIdentityNumber}</w:t>
             </w:r>
           </w:p>
@@ -3310,6 +3294,11 @@
           </w:tcPr>
           <w:p>
             <w:r>
+              <w:rPr>
+                <w:rFonts w:ascii="Times New Roman" w:hAnsi="Times New Roman" w:cs="Times New Roman"/>
+                <w:sz w:val="18"/>
+                <w:szCs w:val="18"/>
+              </w:rPr>
               <w:t xml:space="preserve">{uboOwnershipPercentage}</w:t>
             </w:r>
           </w:p>
@@ -3323,6 +3312,11 @@
           </w:tcPr>
           <w:p>
             <w:r>
+              <w:rPr>
+                <w:rFonts w:ascii="Times New Roman" w:hAnsi="Times New Roman" w:cs="Times New Roman"/>
+                <w:sz w:val="18"/>
+                <w:szCs w:val="18"/>
+              </w:rPr>
               <w:t xml:space="preserve">{uboResidenceAddress}{/ubos}</w:t>
             </w:r>
           </w:p>
@@ -3465,6 +3459,11 @@
           </w:tcPr>
           <w:p>
             <w:r>
+              <w:rPr>
+                <w:rFonts w:ascii="Times New Roman" w:hAnsi="Times New Roman" w:cs="Times New Roman"/>
+                <w:sz w:val="18"/>
+                <w:szCs w:val="18"/>
+              </w:rPr>
               <w:t xml:space="preserve">{totalUboPercentage}</w:t>
             </w:r>
           </w:p>
@@ -4092,6 +4091,11 @@
           </w:tcPr>
           <w:p>
             <w:r>
+              <w:rPr>
+                <w:rFonts w:ascii="Times New Roman" w:hAnsi="Times New Roman" w:cs="Times New Roman"/>
+                <w:sz w:val="18"/>
+                <w:szCs w:val="18"/>
+              </w:rPr>
               <w:t xml:space="preserve">{#managers}{managerNo}</w:t>
             </w:r>
           </w:p>
@@ -4102,6 +4106,11 @@
           </w:tcPr>
           <w:p>
             <w:r>
+              <w:rPr>
+                <w:rFonts w:ascii="Times New Roman" w:hAnsi="Times New Roman" w:cs="Times New Roman"/>
+                <w:sz w:val="18"/>
+                <w:szCs w:val="18"/>
+              </w:rPr>
               <w:t xml:space="preserve">{managerFullName}</w:t>
             </w:r>
           </w:p>
@@ -4112,6 +4121,11 @@
           </w:tcPr>
           <w:p>
             <w:r>
+              <w:rPr>
+                <w:rFonts w:ascii="Times New Roman" w:hAnsi="Times New Roman" w:cs="Times New Roman"/>
+                <w:sz w:val="18"/>
+                <w:szCs w:val="18"/>
+              </w:rPr>
               <w:t xml:space="preserve">{managerPosition}</w:t>
             </w:r>
           </w:p>
@@ -4122,6 +4136,11 @@
           </w:tcPr>
           <w:p>
             <w:r>
+              <w:rPr>
+                <w:rFonts w:ascii="Times New Roman" w:hAnsi="Times New Roman" w:cs="Times New Roman"/>
+                <w:sz w:val="18"/>
+                <w:szCs w:val="18"/>
+              </w:rPr>
               <w:t xml:space="preserve">{managerEntityName}</w:t>
             </w:r>
           </w:p>
@@ -4132,7 +4151,12 @@
           </w:tcPr>
           <w:p>
             <w:r>
-              <w:t xml:space="preserve">{managerNationalityAndAddress}</w:t>
+              <w:rPr>
+                <w:rFonts w:ascii="Times New Roman" w:hAnsi="Times New Roman" w:cs="Times New Roman"/>
+                <w:sz w:val="18"/>
+                <w:szCs w:val="18"/>
+              </w:rPr>
+              <w:t xml:space="preserve">{managerNationality}</w:t>
             </w:r>
           </w:p>
         </w:tc>
@@ -4142,42 +4166,58 @@
           </w:tcPr>
           <w:p>
             <w:r>
+              <w:rPr>
+                <w:rFonts w:ascii="Times New Roman" w:hAnsi="Times New Roman" w:cs="Times New Roman"/>
+                <w:sz w:val="18"/>
+                <w:szCs w:val="18"/>
+              </w:rPr>
+              <w:t xml:space="preserve">{managerAddress}</w:t>
+            </w:r>
+          </w:p>
+        </w:tc>
+        <w:tc>
+          <w:tcPr>
+            <w:tcW w:w="1084" w:type="dxa"/>
+          </w:tcPr>
+          <w:p>
+            <w:r>
+              <w:rPr>
+                <w:rFonts w:ascii="Times New Roman" w:hAnsi="Times New Roman" w:cs="Times New Roman"/>
+                <w:sz w:val="18"/>
+                <w:szCs w:val="18"/>
+              </w:rPr>
               <w:t xml:space="preserve">{managerDateOfBirth}</w:t>
             </w:r>
           </w:p>
         </w:tc>
         <w:tc>
           <w:tcPr>
-            <w:tcW w:w="1084" w:type="dxa"/>
-          </w:tcPr>
-          <w:p>
-            <w:r>
+            <w:tcW w:w="1353" w:type="dxa"/>
+          </w:tcPr>
+          <w:p>
+            <w:r>
+              <w:rPr>
+                <w:rFonts w:ascii="Times New Roman" w:hAnsi="Times New Roman" w:cs="Times New Roman"/>
+                <w:sz w:val="18"/>
+                <w:szCs w:val="18"/>
+              </w:rPr>
               <w:t xml:space="preserve">{managerIdentityNumber}</w:t>
             </w:r>
           </w:p>
         </w:tc>
         <w:tc>
           <w:tcPr>
-            <w:tcW w:w="1353" w:type="dxa"/>
-          </w:tcPr>
-          <w:p>
-            <w:r>
+            <w:tcW w:w="1146" w:type="dxa"/>
+          </w:tcPr>
+          <w:p>
+            <w:r>
+              <w:rPr>
+                <w:rFonts w:ascii="Times New Roman" w:hAnsi="Times New Roman" w:cs="Times New Roman"/>
+                <w:sz w:val="18"/>
+                <w:szCs w:val="18"/>
+              </w:rPr>
               <w:t xml:space="preserve">{managerAuthorizedSignatory}{/managers}</w:t>
             </w:r>
-          </w:p>
-        </w:tc>
-        <w:tc>
-          <w:tcPr>
-            <w:tcW w:w="1146" w:type="dxa"/>
-          </w:tcPr>
-          <w:p>
-            <w:pPr>
-              <w:rPr>
-                <w:rFonts w:asciiTheme="majorHAnsi" w:hAnsiTheme="majorHAnsi"/>
-                <w:sz w:val="18"/>
-                <w:szCs w:val="20"/>
-              </w:rPr>
-            </w:pPr>
           </w:p>
         </w:tc>
       </w:tr>
@@ -4290,193 +4330,13 @@
       </w:r>
     </w:p>
     <w:p>
-      <w:pPr>
-        <w:pStyle w:val="ListParagraph"/>
-        <w:numPr>
-          <w:ilvl w:val="0"/>
-          <w:numId w:val="5"/>
-        </w:numPr>
-        <w:tabs>
-          <w:tab w:val="left" w:pos="525"/>
-        </w:tabs>
-        <w:spacing w:before="179"/>
-        <w:rPr>
-          <w:rFonts w:asciiTheme="majorHAnsi" w:hAnsiTheme="majorHAnsi"/>
+      <w:r>
+        <w:rPr>
+          <w:rFonts w:ascii="Times New Roman" w:hAnsi="Times New Roman" w:cs="Times New Roman"/>
           <w:sz w:val="18"/>
-        </w:rPr>
-      </w:pPr>
-      <w:r>
-        <w:rPr>
-          <w:rFonts w:asciiTheme="majorHAnsi" w:hAnsiTheme="majorHAnsi"/>
-          <w:sz w:val="18"/>
-        </w:rPr>
-        <w:t>Are</w:t>
-      </w:r>
-      <w:r>
-        <w:rPr>
-          <w:rFonts w:asciiTheme="majorHAnsi" w:hAnsiTheme="majorHAnsi"/>
-          <w:spacing w:val="-3"/>
-          <w:sz w:val="18"/>
-        </w:rPr>
-        <w:t xml:space="preserve"> </w:t>
-      </w:r>
-      <w:r>
-        <w:rPr>
-          <w:rFonts w:asciiTheme="majorHAnsi" w:hAnsiTheme="majorHAnsi"/>
-          <w:sz w:val="18"/>
-        </w:rPr>
-        <w:t>any</w:t>
-      </w:r>
-      <w:r>
-        <w:rPr>
-          <w:rFonts w:asciiTheme="majorHAnsi" w:hAnsiTheme="majorHAnsi"/>
-          <w:spacing w:val="-2"/>
-          <w:sz w:val="18"/>
-        </w:rPr>
-        <w:t xml:space="preserve"> </w:t>
-      </w:r>
-      <w:r>
-        <w:rPr>
-          <w:rFonts w:asciiTheme="majorHAnsi" w:hAnsiTheme="majorHAnsi"/>
-          <w:sz w:val="18"/>
-        </w:rPr>
-        <w:t>of</w:t>
-      </w:r>
-      <w:r>
-        <w:rPr>
-          <w:rFonts w:asciiTheme="majorHAnsi" w:hAnsiTheme="majorHAnsi"/>
-          <w:spacing w:val="-4"/>
-          <w:sz w:val="18"/>
-        </w:rPr>
-        <w:t xml:space="preserve"> </w:t>
-      </w:r>
-      <w:r>
-        <w:rPr>
-          <w:rFonts w:asciiTheme="majorHAnsi" w:hAnsiTheme="majorHAnsi"/>
-          <w:sz w:val="18"/>
-        </w:rPr>
-        <w:t>the</w:t>
-      </w:r>
-      <w:r>
-        <w:rPr>
-          <w:rFonts w:asciiTheme="majorHAnsi" w:hAnsiTheme="majorHAnsi"/>
-          <w:spacing w:val="-2"/>
-          <w:sz w:val="18"/>
-        </w:rPr>
-        <w:t xml:space="preserve"> </w:t>
-      </w:r>
-      <w:r>
-        <w:rPr>
-          <w:rFonts w:asciiTheme="majorHAnsi" w:hAnsiTheme="majorHAnsi"/>
-          <w:sz w:val="18"/>
-        </w:rPr>
-        <w:t>following</w:t>
-      </w:r>
-      <w:r>
-        <w:rPr>
-          <w:rFonts w:asciiTheme="majorHAnsi" w:hAnsiTheme="majorHAnsi"/>
-          <w:spacing w:val="-2"/>
-          <w:sz w:val="18"/>
-        </w:rPr>
-        <w:t xml:space="preserve"> </w:t>
-      </w:r>
-      <w:r>
-        <w:rPr>
-          <w:rFonts w:asciiTheme="majorHAnsi" w:hAnsiTheme="majorHAnsi"/>
-          <w:sz w:val="18"/>
-        </w:rPr>
-        <w:t>people</w:t>
-      </w:r>
-      <w:r>
-        <w:rPr>
-          <w:rFonts w:asciiTheme="majorHAnsi" w:hAnsiTheme="majorHAnsi"/>
-          <w:spacing w:val="-2"/>
-          <w:sz w:val="18"/>
-        </w:rPr>
-        <w:t xml:space="preserve"> </w:t>
-      </w:r>
-      <w:r>
-        <w:rPr>
-          <w:rFonts w:asciiTheme="majorHAnsi" w:hAnsiTheme="majorHAnsi"/>
-          <w:sz w:val="18"/>
-        </w:rPr>
-        <w:t>considered</w:t>
-      </w:r>
-      <w:r>
-        <w:rPr>
-          <w:rFonts w:asciiTheme="majorHAnsi" w:hAnsiTheme="majorHAnsi"/>
-          <w:spacing w:val="-2"/>
-          <w:sz w:val="18"/>
-        </w:rPr>
-        <w:t xml:space="preserve"> </w:t>
-      </w:r>
-      <w:r>
-        <w:rPr>
-          <w:rFonts w:asciiTheme="majorHAnsi" w:hAnsiTheme="majorHAnsi"/>
-          <w:sz w:val="18"/>
-        </w:rPr>
-        <w:t>as</w:t>
-      </w:r>
-      <w:r>
-        <w:rPr>
-          <w:rFonts w:asciiTheme="majorHAnsi" w:hAnsiTheme="majorHAnsi"/>
-          <w:spacing w:val="-1"/>
-          <w:sz w:val="18"/>
-        </w:rPr>
-        <w:t xml:space="preserve"> </w:t>
-      </w:r>
-      <w:r>
-        <w:rPr>
-          <w:rFonts w:asciiTheme="majorHAnsi" w:hAnsiTheme="majorHAnsi"/>
-          <w:sz w:val="18"/>
-        </w:rPr>
-        <w:t>Politically</w:t>
-      </w:r>
-      <w:r>
-        <w:rPr>
-          <w:rFonts w:asciiTheme="majorHAnsi" w:hAnsiTheme="majorHAnsi"/>
-          <w:spacing w:val="-5"/>
-          <w:sz w:val="18"/>
-        </w:rPr>
-        <w:t xml:space="preserve"> </w:t>
-      </w:r>
-      <w:r>
-        <w:rPr>
-          <w:rFonts w:asciiTheme="majorHAnsi" w:hAnsiTheme="majorHAnsi"/>
-          <w:sz w:val="18"/>
-        </w:rPr>
-        <w:t>Exposed</w:t>
-      </w:r>
-      <w:r>
-        <w:rPr>
-          <w:rFonts w:asciiTheme="majorHAnsi" w:hAnsiTheme="majorHAnsi"/>
-          <w:spacing w:val="-1"/>
-          <w:sz w:val="18"/>
-        </w:rPr>
-        <w:t xml:space="preserve"> </w:t>
-      </w:r>
-      <w:r>
-        <w:rPr>
-          <w:rFonts w:asciiTheme="majorHAnsi" w:hAnsiTheme="majorHAnsi"/>
-          <w:sz w:val="18"/>
-        </w:rPr>
-        <w:t>Persons</w:t>
-      </w:r>
-      <w:r>
-        <w:rPr>
-          <w:rFonts w:asciiTheme="majorHAnsi" w:hAnsiTheme="majorHAnsi"/>
-          <w:spacing w:val="-1"/>
-          <w:sz w:val="18"/>
-        </w:rPr>
-        <w:t xml:space="preserve"> </w:t>
-      </w:r>
-      <w:r>
-        <w:rPr>
-          <w:rFonts w:asciiTheme="majorHAnsi" w:hAnsiTheme="majorHAnsi"/>
-          <w:spacing w:val="-2"/>
-          <w:sz w:val="18"/>
-        </w:rPr>
-        <w:t>(PEPs):</w:t>
+          <w:szCs w:val="18"/>
+        </w:rPr>
+        <w:t xml:space="preserve">1. Are any of the following people considered as Politically Exposed Persons (PEPs):</w:t>
       </w:r>
     </w:p>
     <w:p>
@@ -4797,94 +4657,23 @@
       </w:r>
     </w:p>
     <w:p>
-      <w:pPr>
-        <w:pStyle w:val="BodyText"/>
-        <w:numPr>
-          <w:ilvl w:val="0"/>
-          <w:numId w:val="7"/>
-        </w:numPr>
-        <w:spacing w:before="182"/>
-        <w:rPr>
-          <w:rFonts w:asciiTheme="majorHAnsi" w:hAnsiTheme="majorHAnsi"/>
-        </w:rPr>
-      </w:pPr>
-      <w:r>
-        <w:rPr>
-          <w:rFonts w:asciiTheme="majorHAnsi" w:hAnsiTheme="majorHAnsi"/>
-        </w:rPr>
-        <w:t>Yes,</w:t>
-      </w:r>
-      <w:r>
-        <w:rPr>
-          <w:rFonts w:asciiTheme="majorHAnsi" w:hAnsiTheme="majorHAnsi"/>
-          <w:spacing w:val="-3"/>
-        </w:rPr>
-        <w:t xml:space="preserve"> </w:t>
-      </w:r>
-      <w:r>
-        <w:rPr>
-          <w:rFonts w:asciiTheme="majorHAnsi" w:hAnsiTheme="majorHAnsi"/>
-        </w:rPr>
-        <w:t>if</w:t>
-      </w:r>
-      <w:r>
-        <w:rPr>
-          <w:rFonts w:asciiTheme="majorHAnsi" w:hAnsiTheme="majorHAnsi"/>
-          <w:spacing w:val="-3"/>
-        </w:rPr>
-        <w:t xml:space="preserve"> </w:t>
-      </w:r>
-      <w:r>
-        <w:rPr>
-          <w:rFonts w:asciiTheme="majorHAnsi" w:hAnsiTheme="majorHAnsi"/>
-        </w:rPr>
-        <w:t>yes,</w:t>
-      </w:r>
-      <w:r>
-        <w:rPr>
-          <w:rFonts w:asciiTheme="majorHAnsi" w:hAnsiTheme="majorHAnsi"/>
-          <w:spacing w:val="-2"/>
-        </w:rPr>
-        <w:t xml:space="preserve"> </w:t>
-      </w:r>
-      <w:r>
-        <w:rPr>
-          <w:rFonts w:asciiTheme="majorHAnsi" w:hAnsiTheme="majorHAnsi"/>
-        </w:rPr>
-        <w:t>please</w:t>
-      </w:r>
-      <w:r>
-        <w:rPr>
-          <w:rFonts w:asciiTheme="majorHAnsi" w:hAnsiTheme="majorHAnsi"/>
-          <w:spacing w:val="-2"/>
-        </w:rPr>
-        <w:t xml:space="preserve"> </w:t>
-      </w:r>
-      <w:r>
-        <w:rPr>
-          <w:rFonts w:asciiTheme="majorHAnsi" w:hAnsiTheme="majorHAnsi"/>
-        </w:rPr>
-        <w:t>provide</w:t>
-      </w:r>
-      <w:r>
-        <w:rPr>
-          <w:rFonts w:asciiTheme="majorHAnsi" w:hAnsiTheme="majorHAnsi"/>
-          <w:spacing w:val="-2"/>
-        </w:rPr>
-        <w:t xml:space="preserve"> </w:t>
-      </w:r>
-      <w:r>
-        <w:rPr>
-          <w:rFonts w:asciiTheme="majorHAnsi" w:hAnsiTheme="majorHAnsi"/>
-        </w:rPr>
-        <w:t>full</w:t>
-      </w:r>
-      <w:r>
-        <w:rPr>
-          <w:rFonts w:asciiTheme="majorHAnsi" w:hAnsiTheme="majorHAnsi"/>
-          <w:spacing w:val="-2"/>
-        </w:rPr>
-        <w:t xml:space="preserve"> details:</w:t>
+      <w:r>
+        <w:rPr>
+          <w:rFonts w:ascii="Times New Roman" w:hAnsi="Times New Roman" w:cs="Times New Roman"/>
+          <w:sz w:val="18"/>
+          <w:szCs w:val="18"/>
+        </w:rPr>
+        <w:t xml:space="preserve">Yes, if yes, please provide full details: {pepQuestion}</w:t>
+      </w:r>
+    </w:p>
+    <w:p>
+      <w:r>
+        <w:rPr>
+          <w:rFonts w:ascii="Times New Roman" w:hAnsi="Times New Roman" w:cs="Times New Roman"/>
+          <w:sz w:val="18"/>
+          <w:szCs w:val="18"/>
+        </w:rPr>
+        <w:t xml:space="preserve">{pepDetails}</w:t>
       </w:r>
     </w:p>
     <w:p>
@@ -4914,7 +4703,12 @@
     </w:p>
     <w:p>
       <w:r>
-        <w:t xml:space="preserve">Has any of the individuals or entities referred above have ever been sanctioned by any government or regulatory body including but not limited to the NCTC, United Nations, U.S.A., E.U, U.K, Qatar and FATF member countries?</w:t>
+        <w:rPr>
+          <w:rFonts w:ascii="Times New Roman" w:hAnsi="Times New Roman" w:cs="Times New Roman"/>
+          <w:sz w:val="18"/>
+          <w:szCs w:val="18"/>
+        </w:rPr>
+        <w:t xml:space="preserve">2. Has any of the individuals or entities referred above have ever been sanctioned by any government or regulatory body including but not limited to the NCTC, United Nations, U.S.A., E.U, U.K, Qatar and FATF member countries?</w:t>
       </w:r>
     </w:p>
     <w:p>
@@ -4927,283 +4721,23 @@
       </w:pPr>
     </w:p>
     <w:p>
-      <w:pPr>
-        <w:pStyle w:val="ListParagraph"/>
-        <w:numPr>
-          <w:ilvl w:val="0"/>
-          <w:numId w:val="4"/>
-        </w:numPr>
-        <w:tabs>
-          <w:tab w:val="left" w:pos="1081"/>
-        </w:tabs>
-        <w:ind w:left="1081" w:hanging="196"/>
-        <w:rPr>
-          <w:rFonts w:asciiTheme="majorHAnsi" w:hAnsiTheme="majorHAnsi"/>
+      <w:r>
+        <w:rPr>
+          <w:rFonts w:ascii="Times New Roman" w:hAnsi="Times New Roman" w:cs="Times New Roman"/>
           <w:sz w:val="18"/>
-        </w:rPr>
-      </w:pPr>
-      <w:r>
-        <w:rPr>
-          <w:rFonts w:asciiTheme="majorHAnsi" w:hAnsiTheme="majorHAnsi"/>
+          <w:szCs w:val="18"/>
+        </w:rPr>
+        <w:t xml:space="preserve">Yes, if yes, please provide full details of any sanctions applied and the current state of such sanctions: {sanctionQuestion}</w:t>
+      </w:r>
+    </w:p>
+    <w:p>
+      <w:r>
+        <w:rPr>
+          <w:rFonts w:ascii="Times New Roman" w:hAnsi="Times New Roman" w:cs="Times New Roman"/>
           <w:sz w:val="18"/>
-        </w:rPr>
-        <w:t>Yes,</w:t>
-      </w:r>
-      <w:r>
-        <w:rPr>
-          <w:rFonts w:asciiTheme="majorHAnsi" w:hAnsiTheme="majorHAnsi"/>
-          <w:spacing w:val="-5"/>
-          <w:sz w:val="18"/>
-        </w:rPr>
-        <w:t xml:space="preserve"> </w:t>
-      </w:r>
-      <w:r>
-        <w:rPr>
-          <w:rFonts w:asciiTheme="majorHAnsi" w:hAnsiTheme="majorHAnsi"/>
-          <w:sz w:val="18"/>
-        </w:rPr>
-        <w:t>if</w:t>
-      </w:r>
-      <w:r>
-        <w:rPr>
-          <w:rFonts w:asciiTheme="majorHAnsi" w:hAnsiTheme="majorHAnsi"/>
-          <w:spacing w:val="-3"/>
-          <w:sz w:val="18"/>
-        </w:rPr>
-        <w:t xml:space="preserve"> </w:t>
-      </w:r>
-      <w:r>
-        <w:rPr>
-          <w:rFonts w:asciiTheme="majorHAnsi" w:hAnsiTheme="majorHAnsi"/>
-          <w:sz w:val="18"/>
-        </w:rPr>
-        <w:t>yes,</w:t>
-      </w:r>
-      <w:r>
-        <w:rPr>
-          <w:rFonts w:asciiTheme="majorHAnsi" w:hAnsiTheme="majorHAnsi"/>
-          <w:spacing w:val="-2"/>
-          <w:sz w:val="18"/>
-        </w:rPr>
-        <w:t xml:space="preserve"> </w:t>
-      </w:r>
-      <w:r>
-        <w:rPr>
-          <w:rFonts w:asciiTheme="majorHAnsi" w:hAnsiTheme="majorHAnsi"/>
-          <w:sz w:val="18"/>
-        </w:rPr>
-        <w:t>please</w:t>
-      </w:r>
-      <w:r>
-        <w:rPr>
-          <w:rFonts w:asciiTheme="majorHAnsi" w:hAnsiTheme="majorHAnsi"/>
-          <w:spacing w:val="-2"/>
-          <w:sz w:val="18"/>
-        </w:rPr>
-        <w:t xml:space="preserve"> </w:t>
-      </w:r>
-      <w:r>
-        <w:rPr>
-          <w:rFonts w:asciiTheme="majorHAnsi" w:hAnsiTheme="majorHAnsi"/>
-          <w:sz w:val="18"/>
-        </w:rPr>
-        <w:t>provide</w:t>
-      </w:r>
-      <w:r>
-        <w:rPr>
-          <w:rFonts w:asciiTheme="majorHAnsi" w:hAnsiTheme="majorHAnsi"/>
-          <w:spacing w:val="-2"/>
-          <w:sz w:val="18"/>
-        </w:rPr>
-        <w:t xml:space="preserve"> </w:t>
-      </w:r>
-      <w:r>
-        <w:rPr>
-          <w:rFonts w:asciiTheme="majorHAnsi" w:hAnsiTheme="majorHAnsi"/>
-          <w:sz w:val="18"/>
-        </w:rPr>
-        <w:t>full</w:t>
-      </w:r>
-      <w:r>
-        <w:rPr>
-          <w:rFonts w:asciiTheme="majorHAnsi" w:hAnsiTheme="majorHAnsi"/>
-          <w:spacing w:val="-2"/>
-          <w:sz w:val="18"/>
-        </w:rPr>
-        <w:t xml:space="preserve"> </w:t>
-      </w:r>
-      <w:r>
-        <w:rPr>
-          <w:rFonts w:asciiTheme="majorHAnsi" w:hAnsiTheme="majorHAnsi"/>
-          <w:sz w:val="18"/>
-        </w:rPr>
-        <w:t>details</w:t>
-      </w:r>
-      <w:r>
-        <w:rPr>
-          <w:rFonts w:asciiTheme="majorHAnsi" w:hAnsiTheme="majorHAnsi"/>
-          <w:spacing w:val="-1"/>
-          <w:sz w:val="18"/>
-        </w:rPr>
-        <w:t xml:space="preserve"> </w:t>
-      </w:r>
-      <w:r>
-        <w:rPr>
-          <w:rFonts w:asciiTheme="majorHAnsi" w:hAnsiTheme="majorHAnsi"/>
-          <w:sz w:val="18"/>
-        </w:rPr>
-        <w:t>of</w:t>
-      </w:r>
-      <w:r>
-        <w:rPr>
-          <w:rFonts w:asciiTheme="majorHAnsi" w:hAnsiTheme="majorHAnsi"/>
-          <w:spacing w:val="-3"/>
-          <w:sz w:val="18"/>
-        </w:rPr>
-        <w:t xml:space="preserve"> </w:t>
-      </w:r>
-      <w:r>
-        <w:rPr>
-          <w:rFonts w:asciiTheme="majorHAnsi" w:hAnsiTheme="majorHAnsi"/>
-          <w:sz w:val="18"/>
-        </w:rPr>
-        <w:t>any</w:t>
-      </w:r>
-      <w:r>
-        <w:rPr>
-          <w:rFonts w:asciiTheme="majorHAnsi" w:hAnsiTheme="majorHAnsi"/>
-          <w:spacing w:val="-2"/>
-          <w:sz w:val="18"/>
-        </w:rPr>
-        <w:t xml:space="preserve"> </w:t>
-      </w:r>
-      <w:r>
-        <w:rPr>
-          <w:rFonts w:asciiTheme="majorHAnsi" w:hAnsiTheme="majorHAnsi"/>
-          <w:sz w:val="18"/>
-        </w:rPr>
-        <w:t>sanctions</w:t>
-      </w:r>
-      <w:r>
-        <w:rPr>
-          <w:rFonts w:asciiTheme="majorHAnsi" w:hAnsiTheme="majorHAnsi"/>
-          <w:spacing w:val="-1"/>
-          <w:sz w:val="18"/>
-        </w:rPr>
-        <w:t xml:space="preserve"> </w:t>
-      </w:r>
-      <w:r>
-        <w:rPr>
-          <w:rFonts w:asciiTheme="majorHAnsi" w:hAnsiTheme="majorHAnsi"/>
-          <w:sz w:val="18"/>
-        </w:rPr>
-        <w:t>applied</w:t>
-      </w:r>
-      <w:r>
-        <w:rPr>
-          <w:rFonts w:asciiTheme="majorHAnsi" w:hAnsiTheme="majorHAnsi"/>
-          <w:spacing w:val="-1"/>
-          <w:sz w:val="18"/>
-        </w:rPr>
-        <w:t xml:space="preserve"> </w:t>
-      </w:r>
-      <w:r>
-        <w:rPr>
-          <w:rFonts w:asciiTheme="majorHAnsi" w:hAnsiTheme="majorHAnsi"/>
-          <w:sz w:val="18"/>
-        </w:rPr>
-        <w:t>and</w:t>
-      </w:r>
-      <w:r>
-        <w:rPr>
-          <w:rFonts w:asciiTheme="majorHAnsi" w:hAnsiTheme="majorHAnsi"/>
-          <w:spacing w:val="-2"/>
-          <w:sz w:val="18"/>
-        </w:rPr>
-        <w:t xml:space="preserve"> </w:t>
-      </w:r>
-      <w:r>
-        <w:rPr>
-          <w:rFonts w:asciiTheme="majorHAnsi" w:hAnsiTheme="majorHAnsi"/>
-          <w:sz w:val="18"/>
-        </w:rPr>
-        <w:t>the</w:t>
-      </w:r>
-      <w:r>
-        <w:rPr>
-          <w:rFonts w:asciiTheme="majorHAnsi" w:hAnsiTheme="majorHAnsi"/>
-          <w:spacing w:val="-2"/>
-          <w:sz w:val="18"/>
-        </w:rPr>
-        <w:t xml:space="preserve"> </w:t>
-      </w:r>
-      <w:r>
-        <w:rPr>
-          <w:rFonts w:asciiTheme="majorHAnsi" w:hAnsiTheme="majorHAnsi"/>
-          <w:sz w:val="18"/>
-        </w:rPr>
-        <w:t>current</w:t>
-      </w:r>
-      <w:r>
-        <w:rPr>
-          <w:rFonts w:asciiTheme="majorHAnsi" w:hAnsiTheme="majorHAnsi"/>
-          <w:spacing w:val="-1"/>
-          <w:sz w:val="18"/>
-        </w:rPr>
-        <w:t xml:space="preserve"> </w:t>
-      </w:r>
-      <w:r>
-        <w:rPr>
-          <w:rFonts w:asciiTheme="majorHAnsi" w:hAnsiTheme="majorHAnsi"/>
-          <w:sz w:val="18"/>
-        </w:rPr>
-        <w:t>state</w:t>
-      </w:r>
-      <w:r>
-        <w:rPr>
-          <w:rFonts w:asciiTheme="majorHAnsi" w:hAnsiTheme="majorHAnsi"/>
-          <w:spacing w:val="-3"/>
-          <w:sz w:val="18"/>
-        </w:rPr>
-        <w:t xml:space="preserve"> </w:t>
-      </w:r>
-      <w:r>
-        <w:rPr>
-          <w:rFonts w:asciiTheme="majorHAnsi" w:hAnsiTheme="majorHAnsi"/>
-          <w:sz w:val="18"/>
-        </w:rPr>
-        <w:t>of</w:t>
-      </w:r>
-      <w:r>
-        <w:rPr>
-          <w:rFonts w:asciiTheme="majorHAnsi" w:hAnsiTheme="majorHAnsi"/>
-          <w:spacing w:val="-3"/>
-          <w:sz w:val="18"/>
-        </w:rPr>
-        <w:t xml:space="preserve"> </w:t>
-      </w:r>
-      <w:r>
-        <w:rPr>
-          <w:rFonts w:asciiTheme="majorHAnsi" w:hAnsiTheme="majorHAnsi"/>
-          <w:sz w:val="18"/>
-        </w:rPr>
-        <w:t>such</w:t>
-      </w:r>
-      <w:r>
-        <w:rPr>
-          <w:rFonts w:asciiTheme="majorHAnsi" w:hAnsiTheme="majorHAnsi"/>
-          <w:spacing w:val="2"/>
-          <w:sz w:val="18"/>
-        </w:rPr>
-        <w:t xml:space="preserve"> </w:t>
-      </w:r>
-      <w:r>
-        <w:rPr>
-          <w:rFonts w:asciiTheme="majorHAnsi" w:hAnsiTheme="majorHAnsi"/>
-          <w:spacing w:val="-2"/>
-          <w:sz w:val="18"/>
-        </w:rPr>
-        <w:t>sanctions:</w:t>
+          <w:szCs w:val="18"/>
+        </w:rPr>
+        <w:t xml:space="preserve">{sanctionDetails}</w:t>
       </w:r>
     </w:p>
     <w:p>
@@ -5369,309 +4903,35 @@
       </w:pPr>
     </w:p>
     <w:p>
-      <w:pPr>
-        <w:pStyle w:val="ListParagraph"/>
-        <w:numPr>
-          <w:ilvl w:val="0"/>
-          <w:numId w:val="5"/>
-        </w:numPr>
-        <w:tabs>
-          <w:tab w:val="left" w:pos="522"/>
-        </w:tabs>
-        <w:ind w:left="522" w:hanging="357"/>
-        <w:rPr>
-          <w:rFonts w:asciiTheme="majorHAnsi" w:hAnsiTheme="majorHAnsi"/>
+      <w:r>
+        <w:rPr>
+          <w:rFonts w:ascii="Times New Roman" w:hAnsi="Times New Roman" w:cs="Times New Roman"/>
           <w:sz w:val="18"/>
-        </w:rPr>
-      </w:pPr>
-      <w:r>
-        <w:rPr>
-          <w:rFonts w:asciiTheme="majorHAnsi" w:hAnsiTheme="majorHAnsi"/>
+          <w:szCs w:val="18"/>
+        </w:rPr>
+        <w:t xml:space="preserve">3. Whether the beneficial owners or key management having dual citizenship?</w:t>
+      </w:r>
+    </w:p>
+    <w:p>
+      <w:r>
+        <w:rPr>
+          <w:rFonts w:ascii="Times New Roman" w:hAnsi="Times New Roman" w:cs="Times New Roman"/>
           <w:sz w:val="18"/>
-        </w:rPr>
-        <w:t>Whether</w:t>
-      </w:r>
-      <w:r>
-        <w:rPr>
-          <w:rFonts w:asciiTheme="majorHAnsi" w:hAnsiTheme="majorHAnsi"/>
-          <w:spacing w:val="-2"/>
+          <w:szCs w:val="18"/>
+        </w:rPr>
+        <w:t xml:space="preserve">Yes, if yes, please provide details and passport copy: {dualCitizenshipQuestion}</w:t>
+      </w:r>
+    </w:p>
+    <w:p>
+      <w:r>
+        <w:rPr>
+          <w:rFonts w:ascii="Times New Roman" w:hAnsi="Times New Roman" w:cs="Times New Roman"/>
           <w:sz w:val="18"/>
-        </w:rPr>
-        <w:t xml:space="preserve"> </w:t>
-      </w:r>
-      <w:r>
-        <w:rPr>
-          <w:rFonts w:asciiTheme="majorHAnsi" w:hAnsiTheme="majorHAnsi"/>
-          <w:sz w:val="18"/>
-        </w:rPr>
-        <w:t>the</w:t>
-      </w:r>
-      <w:r>
-        <w:rPr>
-          <w:rFonts w:asciiTheme="majorHAnsi" w:hAnsiTheme="majorHAnsi"/>
-          <w:spacing w:val="-2"/>
-          <w:sz w:val="18"/>
-        </w:rPr>
-        <w:t xml:space="preserve"> </w:t>
-      </w:r>
-      <w:r>
-        <w:rPr>
-          <w:rFonts w:asciiTheme="majorHAnsi" w:hAnsiTheme="majorHAnsi"/>
-          <w:sz w:val="18"/>
-        </w:rPr>
-        <w:t>beneficial</w:t>
-      </w:r>
-      <w:r>
-        <w:rPr>
-          <w:rFonts w:asciiTheme="majorHAnsi" w:hAnsiTheme="majorHAnsi"/>
-          <w:spacing w:val="-2"/>
-          <w:sz w:val="18"/>
-        </w:rPr>
-        <w:t xml:space="preserve"> </w:t>
-      </w:r>
-      <w:r>
-        <w:rPr>
-          <w:rFonts w:asciiTheme="majorHAnsi" w:hAnsiTheme="majorHAnsi"/>
-          <w:sz w:val="18"/>
-        </w:rPr>
-        <w:t>owners</w:t>
-      </w:r>
-      <w:r>
-        <w:rPr>
-          <w:rFonts w:asciiTheme="majorHAnsi" w:hAnsiTheme="majorHAnsi"/>
-          <w:spacing w:val="-1"/>
-          <w:sz w:val="18"/>
-        </w:rPr>
-        <w:t xml:space="preserve"> </w:t>
-      </w:r>
-      <w:r>
-        <w:rPr>
-          <w:rFonts w:asciiTheme="majorHAnsi" w:hAnsiTheme="majorHAnsi"/>
-          <w:sz w:val="18"/>
-        </w:rPr>
-        <w:t>or</w:t>
-      </w:r>
-      <w:r>
-        <w:rPr>
-          <w:rFonts w:asciiTheme="majorHAnsi" w:hAnsiTheme="majorHAnsi"/>
-          <w:spacing w:val="-4"/>
-          <w:sz w:val="18"/>
-        </w:rPr>
-        <w:t xml:space="preserve"> </w:t>
-      </w:r>
-      <w:r>
-        <w:rPr>
-          <w:rFonts w:asciiTheme="majorHAnsi" w:hAnsiTheme="majorHAnsi"/>
-          <w:sz w:val="18"/>
-        </w:rPr>
-        <w:t>key</w:t>
-      </w:r>
-      <w:r>
-        <w:rPr>
-          <w:rFonts w:asciiTheme="majorHAnsi" w:hAnsiTheme="majorHAnsi"/>
-          <w:spacing w:val="-1"/>
-          <w:sz w:val="18"/>
-        </w:rPr>
-        <w:t xml:space="preserve"> </w:t>
-      </w:r>
-      <w:r>
-        <w:rPr>
-          <w:rFonts w:asciiTheme="majorHAnsi" w:hAnsiTheme="majorHAnsi"/>
-          <w:sz w:val="18"/>
-        </w:rPr>
-        <w:t>management</w:t>
-      </w:r>
-      <w:r>
-        <w:rPr>
-          <w:rFonts w:asciiTheme="majorHAnsi" w:hAnsiTheme="majorHAnsi"/>
-          <w:spacing w:val="-2"/>
-          <w:sz w:val="18"/>
-        </w:rPr>
-        <w:t xml:space="preserve"> </w:t>
-      </w:r>
-      <w:r>
-        <w:rPr>
-          <w:rFonts w:asciiTheme="majorHAnsi" w:hAnsiTheme="majorHAnsi"/>
-          <w:sz w:val="18"/>
-        </w:rPr>
-        <w:t>having</w:t>
-      </w:r>
-      <w:r>
-        <w:rPr>
-          <w:rFonts w:asciiTheme="majorHAnsi" w:hAnsiTheme="majorHAnsi"/>
-          <w:spacing w:val="-1"/>
-          <w:sz w:val="18"/>
-        </w:rPr>
-        <w:t xml:space="preserve"> </w:t>
-      </w:r>
-      <w:r>
-        <w:rPr>
-          <w:rFonts w:asciiTheme="majorHAnsi" w:hAnsiTheme="majorHAnsi"/>
-          <w:sz w:val="18"/>
-        </w:rPr>
-        <w:t>dual</w:t>
-      </w:r>
-      <w:r>
-        <w:rPr>
-          <w:rFonts w:asciiTheme="majorHAnsi" w:hAnsiTheme="majorHAnsi"/>
-          <w:spacing w:val="-1"/>
-          <w:sz w:val="18"/>
-        </w:rPr>
-        <w:t xml:space="preserve"> </w:t>
-      </w:r>
-      <w:r>
-        <w:rPr>
-          <w:rFonts w:asciiTheme="majorHAnsi" w:hAnsiTheme="majorHAnsi"/>
-          <w:spacing w:val="-2"/>
-          <w:sz w:val="18"/>
-        </w:rPr>
-        <w:t>citizenship?</w:t>
-      </w:r>
-    </w:p>
-    <w:p>
-      <w:pPr>
-        <w:pStyle w:val="ListParagraph"/>
-        <w:numPr>
-          <w:ilvl w:val="0"/>
-          <w:numId w:val="3"/>
-        </w:numPr>
-        <w:tabs>
-          <w:tab w:val="left" w:pos="1081"/>
-        </w:tabs>
-        <w:spacing w:before="17" w:line="242" w:lineRule="exact"/>
-        <w:ind w:left="1081" w:hanging="196"/>
-        <w:rPr>
-          <w:rFonts w:asciiTheme="majorHAnsi" w:hAnsiTheme="majorHAnsi"/>
-          <w:sz w:val="18"/>
-        </w:rPr>
-      </w:pPr>
-      <w:r>
-        <w:rPr>
-          <w:rFonts w:asciiTheme="majorHAnsi" w:hAnsiTheme="majorHAnsi"/>
-          <w:sz w:val="18"/>
-        </w:rPr>
-        <w:t>Yes,</w:t>
-      </w:r>
-      <w:r>
-        <w:rPr>
-          <w:rFonts w:asciiTheme="majorHAnsi" w:hAnsiTheme="majorHAnsi"/>
-          <w:spacing w:val="-2"/>
-          <w:sz w:val="18"/>
-        </w:rPr>
-        <w:t xml:space="preserve"> </w:t>
-      </w:r>
-      <w:r>
-        <w:rPr>
-          <w:rFonts w:asciiTheme="majorHAnsi" w:hAnsiTheme="majorHAnsi"/>
-          <w:sz w:val="18"/>
-        </w:rPr>
-        <w:t>if</w:t>
-      </w:r>
-      <w:r>
-        <w:rPr>
-          <w:rFonts w:asciiTheme="majorHAnsi" w:hAnsiTheme="majorHAnsi"/>
-          <w:spacing w:val="-3"/>
-          <w:sz w:val="18"/>
-        </w:rPr>
-        <w:t xml:space="preserve"> </w:t>
-      </w:r>
-      <w:r>
-        <w:rPr>
-          <w:rFonts w:asciiTheme="majorHAnsi" w:hAnsiTheme="majorHAnsi"/>
-          <w:sz w:val="18"/>
-        </w:rPr>
-        <w:t>yes,</w:t>
-      </w:r>
-      <w:r>
-        <w:rPr>
-          <w:rFonts w:asciiTheme="majorHAnsi" w:hAnsiTheme="majorHAnsi"/>
-          <w:spacing w:val="-3"/>
-          <w:sz w:val="18"/>
-        </w:rPr>
-        <w:t xml:space="preserve"> </w:t>
-      </w:r>
-      <w:r>
-        <w:rPr>
-          <w:rFonts w:asciiTheme="majorHAnsi" w:hAnsiTheme="majorHAnsi"/>
-          <w:sz w:val="18"/>
-        </w:rPr>
-        <w:t>please</w:t>
-      </w:r>
-      <w:r>
-        <w:rPr>
-          <w:rFonts w:asciiTheme="majorHAnsi" w:hAnsiTheme="majorHAnsi"/>
-          <w:spacing w:val="-2"/>
-          <w:sz w:val="18"/>
-        </w:rPr>
-        <w:t xml:space="preserve"> </w:t>
-      </w:r>
-      <w:r>
-        <w:rPr>
-          <w:rFonts w:asciiTheme="majorHAnsi" w:hAnsiTheme="majorHAnsi"/>
-          <w:sz w:val="18"/>
-        </w:rPr>
-        <w:t>provide</w:t>
-      </w:r>
-      <w:r>
-        <w:rPr>
-          <w:rFonts w:asciiTheme="majorHAnsi" w:hAnsiTheme="majorHAnsi"/>
-          <w:spacing w:val="-2"/>
-          <w:sz w:val="18"/>
-        </w:rPr>
-        <w:t xml:space="preserve"> </w:t>
-      </w:r>
-      <w:r>
-        <w:rPr>
-          <w:rFonts w:asciiTheme="majorHAnsi" w:hAnsiTheme="majorHAnsi"/>
-          <w:sz w:val="18"/>
-        </w:rPr>
-        <w:t>details</w:t>
-      </w:r>
-      <w:r>
-        <w:rPr>
-          <w:rFonts w:asciiTheme="majorHAnsi" w:hAnsiTheme="majorHAnsi"/>
-          <w:spacing w:val="-1"/>
-          <w:sz w:val="18"/>
-        </w:rPr>
-        <w:t xml:space="preserve"> </w:t>
-      </w:r>
-      <w:r>
-        <w:rPr>
-          <w:rFonts w:asciiTheme="majorHAnsi" w:hAnsiTheme="majorHAnsi"/>
-          <w:sz w:val="18"/>
-        </w:rPr>
-        <w:t>and</w:t>
-      </w:r>
-      <w:r>
-        <w:rPr>
-          <w:rFonts w:asciiTheme="majorHAnsi" w:hAnsiTheme="majorHAnsi"/>
-          <w:spacing w:val="-1"/>
-          <w:sz w:val="18"/>
-        </w:rPr>
-        <w:t xml:space="preserve"> </w:t>
-      </w:r>
-      <w:r>
-        <w:rPr>
-          <w:rFonts w:asciiTheme="majorHAnsi" w:hAnsiTheme="majorHAnsi"/>
-          <w:sz w:val="18"/>
-        </w:rPr>
-        <w:t>passport</w:t>
-      </w:r>
-      <w:r>
-        <w:rPr>
-          <w:rFonts w:asciiTheme="majorHAnsi" w:hAnsiTheme="majorHAnsi"/>
-          <w:spacing w:val="-1"/>
-          <w:sz w:val="18"/>
-        </w:rPr>
-        <w:t xml:space="preserve"> </w:t>
-      </w:r>
-      <w:r>
-        <w:rPr>
-          <w:rFonts w:asciiTheme="majorHAnsi" w:hAnsiTheme="majorHAnsi"/>
-          <w:spacing w:val="-2"/>
-          <w:sz w:val="18"/>
-        </w:rPr>
-        <w:t>copy:</w:t>
+          <w:szCs w:val="18"/>
+        </w:rPr>
+        <w:t xml:space="preserve">{dualCitizenshipDetails}</w:t>
+        <w:br/>
+        <w:t xml:space="preserve">Passport copy: {dualCitizenshipPassportFileName}</w:t>
       </w:r>
     </w:p>
     <w:p>
@@ -5998,6 +5258,11 @@
           </w:tcPr>
           <w:p>
             <w:r>
+              <w:rPr>
+                <w:rFonts w:ascii="Times New Roman" w:hAnsi="Times New Roman" w:cs="Times New Roman"/>
+                <w:sz w:val="18"/>
+                <w:szCs w:val="18"/>
+              </w:rPr>
               <w:t xml:space="preserve">{communicationFullName}</w:t>
             </w:r>
           </w:p>
@@ -6106,6 +5371,11 @@
           </w:tcPr>
           <w:p>
             <w:r>
+              <w:rPr>
+                <w:rFonts w:ascii="Times New Roman" w:hAnsi="Times New Roman" w:cs="Times New Roman"/>
+                <w:sz w:val="18"/>
+                <w:szCs w:val="18"/>
+              </w:rPr>
               <w:t xml:space="preserve">{communicationPosition}</w:t>
             </w:r>
           </w:p>
@@ -6177,6 +5447,11 @@
           </w:tcPr>
           <w:p>
             <w:r>
+              <w:rPr>
+                <w:rFonts w:ascii="Times New Roman" w:hAnsi="Times New Roman" w:cs="Times New Roman"/>
+                <w:sz w:val="18"/>
+                <w:szCs w:val="18"/>
+              </w:rPr>
               <w:t xml:space="preserve">{communicationNationality}</w:t>
             </w:r>
           </w:p>
@@ -6293,6 +5568,11 @@
           </w:tcPr>
           <w:p>
             <w:r>
+              <w:rPr>
+                <w:rFonts w:ascii="Times New Roman" w:hAnsi="Times New Roman" w:cs="Times New Roman"/>
+                <w:sz w:val="18"/>
+                <w:szCs w:val="18"/>
+              </w:rPr>
               <w:t xml:space="preserve">{communicationIdentityNumber}</w:t>
             </w:r>
           </w:p>
@@ -6379,6 +5659,11 @@
           </w:tcPr>
           <w:p>
             <w:r>
+              <w:rPr>
+                <w:rFonts w:ascii="Times New Roman" w:hAnsi="Times New Roman" w:cs="Times New Roman"/>
+                <w:sz w:val="18"/>
+                <w:szCs w:val="18"/>
+              </w:rPr>
               <w:t xml:space="preserve">{communicationMobile}</w:t>
             </w:r>
           </w:p>
@@ -6457,6 +5742,11 @@
           </w:tcPr>
           <w:p>
             <w:r>
+              <w:rPr>
+                <w:rFonts w:ascii="Times New Roman" w:hAnsi="Times New Roman" w:cs="Times New Roman"/>
+                <w:sz w:val="18"/>
+                <w:szCs w:val="18"/>
+              </w:rPr>
               <w:t xml:space="preserve">{communicationEmail}</w:t>
             </w:r>
           </w:p>
@@ -6591,814 +5881,112 @@
       </w:r>
     </w:p>
     <w:p>
-      <w:pPr>
-        <w:pStyle w:val="ListParagraph"/>
-        <w:numPr>
-          <w:ilvl w:val="0"/>
-          <w:numId w:val="2"/>
-        </w:numPr>
-        <w:tabs>
-          <w:tab w:val="left" w:pos="385"/>
-        </w:tabs>
-        <w:spacing w:before="164"/>
-        <w:ind w:left="385" w:hanging="220"/>
-        <w:rPr>
-          <w:rFonts w:asciiTheme="majorHAnsi" w:hAnsiTheme="majorHAnsi"/>
+      <w:r>
+        <w:rPr>
+          <w:rFonts w:ascii="Times New Roman" w:hAnsi="Times New Roman" w:cs="Times New Roman"/>
           <w:sz w:val="18"/>
-        </w:rPr>
-      </w:pPr>
-      <w:r>
-        <w:rPr>
-          <w:rFonts w:asciiTheme="majorHAnsi" w:hAnsiTheme="majorHAnsi"/>
+          <w:szCs w:val="18"/>
+        </w:rPr>
+        <w:t xml:space="preserve">{docCommercialRegistration} Commercial Registration or the CR Extraction of the concern entity (CR).</w:t>
+      </w:r>
+    </w:p>
+    <w:p>
+      <w:r>
+        <w:rPr>
+          <w:rFonts w:ascii="Times New Roman" w:hAnsi="Times New Roman" w:cs="Times New Roman"/>
           <w:sz w:val="18"/>
-        </w:rPr>
-        <w:t>Commercial</w:t>
-      </w:r>
-      <w:r>
-        <w:rPr>
-          <w:rFonts w:asciiTheme="majorHAnsi" w:hAnsiTheme="majorHAnsi"/>
-          <w:spacing w:val="-2"/>
+          <w:szCs w:val="18"/>
+        </w:rPr>
+        <w:t xml:space="preserve">{docEntityCard} Entity Card/Computer card of the concern entity.</w:t>
+      </w:r>
+    </w:p>
+    <w:p>
+      <w:r>
+        <w:rPr>
+          <w:rFonts w:ascii="Times New Roman" w:hAnsi="Times New Roman" w:cs="Times New Roman"/>
           <w:sz w:val="18"/>
-        </w:rPr>
-        <w:t xml:space="preserve"> </w:t>
-      </w:r>
-      <w:r>
-        <w:rPr>
-          <w:rFonts w:asciiTheme="majorHAnsi" w:hAnsiTheme="majorHAnsi"/>
+          <w:szCs w:val="18"/>
+        </w:rPr>
+        <w:t xml:space="preserve">{docCertificateOfIncorporation} Certificate of Incorporation of the Concern entity.</w:t>
+      </w:r>
+    </w:p>
+    <w:p>
+      <w:r>
+        <w:rPr>
+          <w:rFonts w:ascii="Times New Roman" w:hAnsi="Times New Roman" w:cs="Times New Roman"/>
           <w:sz w:val="18"/>
-        </w:rPr>
-        <w:t>Registration</w:t>
-      </w:r>
-      <w:r>
-        <w:rPr>
-          <w:rFonts w:asciiTheme="majorHAnsi" w:hAnsiTheme="majorHAnsi"/>
-          <w:spacing w:val="-1"/>
+          <w:szCs w:val="18"/>
+        </w:rPr>
+        <w:t xml:space="preserve">{docArticlesOfAssociation} Articles of Association of the Concern Entity.</w:t>
+      </w:r>
+    </w:p>
+    <w:p>
+      <w:r>
+        <w:rPr>
+          <w:rFonts w:ascii="Times New Roman" w:hAnsi="Times New Roman" w:cs="Times New Roman"/>
           <w:sz w:val="18"/>
-        </w:rPr>
-        <w:t xml:space="preserve"> </w:t>
-      </w:r>
-      <w:r>
-        <w:rPr>
-          <w:rFonts w:asciiTheme="majorHAnsi" w:hAnsiTheme="majorHAnsi"/>
+          <w:szCs w:val="18"/>
+        </w:rPr>
+        <w:t xml:space="preserve">{docIdentityCopies} Qatar IDs/passport copies of all-natural person, direct and indirect, shareholders, UBOs, Directors, SEF, Secretory and authorized signatories up to and including its ultimate beneficial owners.</w:t>
+      </w:r>
+    </w:p>
+    <w:p>
+      <w:r>
+        <w:rPr>
+          <w:rFonts w:ascii="Times New Roman" w:hAnsi="Times New Roman" w:cs="Times New Roman"/>
           <w:sz w:val="18"/>
-        </w:rPr>
-        <w:t>or</w:t>
-      </w:r>
-      <w:r>
-        <w:rPr>
-          <w:rFonts w:asciiTheme="majorHAnsi" w:hAnsiTheme="majorHAnsi"/>
-          <w:spacing w:val="-4"/>
+          <w:szCs w:val="18"/>
+        </w:rPr>
+        <w:t xml:space="preserve">{docLegalEntityShareholderCr} If Shareholders are legal entities not the natural persons, please provide the CR of all legal entities until natural persons</w:t>
+      </w:r>
+    </w:p>
+    <w:p>
+      <w:r>
+        <w:rPr>
+          <w:rFonts w:ascii="Times New Roman" w:hAnsi="Times New Roman" w:cs="Times New Roman"/>
           <w:sz w:val="18"/>
-        </w:rPr>
-        <w:t xml:space="preserve"> </w:t>
-      </w:r>
-      <w:r>
-        <w:rPr>
-          <w:rFonts w:asciiTheme="majorHAnsi" w:hAnsiTheme="majorHAnsi"/>
+          <w:szCs w:val="18"/>
+        </w:rPr>
+        <w:t xml:space="preserve">{docNationalAddressCertificates} National address certificates for the legal entities and natural persons residents in the state of Qatar.</w:t>
+      </w:r>
+    </w:p>
+    <w:p>
+      <w:r>
+        <w:rPr>
+          <w:rFonts w:ascii="Times New Roman" w:hAnsi="Times New Roman" w:cs="Times New Roman"/>
           <w:sz w:val="18"/>
-        </w:rPr>
-        <w:t>the</w:t>
-      </w:r>
-      <w:r>
-        <w:rPr>
-          <w:rFonts w:asciiTheme="majorHAnsi" w:hAnsiTheme="majorHAnsi"/>
-          <w:spacing w:val="-2"/>
+          <w:szCs w:val="18"/>
+        </w:rPr>
+        <w:t xml:space="preserve">{docAuditedFinancialStatements} Latest Audited Financial Statements.</w:t>
+      </w:r>
+    </w:p>
+    <w:p>
+      <w:r>
+        <w:rPr>
+          <w:rFonts w:ascii="Times New Roman" w:hAnsi="Times New Roman" w:cs="Times New Roman"/>
           <w:sz w:val="18"/>
-        </w:rPr>
-        <w:t xml:space="preserve"> </w:t>
-      </w:r>
-      <w:r>
-        <w:rPr>
-          <w:rFonts w:asciiTheme="majorHAnsi" w:hAnsiTheme="majorHAnsi"/>
+          <w:szCs w:val="18"/>
+        </w:rPr>
+        <w:t xml:space="preserve">{docTaxCard} Tax Card of the concern entity.</w:t>
+      </w:r>
+    </w:p>
+    <w:p>
+      <w:r>
+        <w:rPr>
+          <w:rFonts w:ascii="Times New Roman" w:hAnsi="Times New Roman" w:cs="Times New Roman"/>
           <w:sz w:val="18"/>
-        </w:rPr>
-        <w:t>CR</w:t>
-      </w:r>
-      <w:r>
-        <w:rPr>
-          <w:rFonts w:asciiTheme="majorHAnsi" w:hAnsiTheme="majorHAnsi"/>
-          <w:spacing w:val="-1"/>
+          <w:szCs w:val="18"/>
+        </w:rPr>
+        <w:t xml:space="preserve">Additional documents: {additionalDocumentsText}</w:t>
+      </w:r>
+    </w:p>
+    <w:p>
+      <w:r>
+        <w:rPr>
+          <w:rFonts w:ascii="Times New Roman" w:hAnsi="Times New Roman" w:cs="Times New Roman"/>
           <w:sz w:val="18"/>
-        </w:rPr>
-        <w:t xml:space="preserve"> </w:t>
-      </w:r>
-      <w:r>
-        <w:rPr>
-          <w:rFonts w:asciiTheme="majorHAnsi" w:hAnsiTheme="majorHAnsi"/>
-          <w:sz w:val="18"/>
-        </w:rPr>
-        <w:t>Extraction</w:t>
-      </w:r>
-      <w:r>
-        <w:rPr>
-          <w:rFonts w:asciiTheme="majorHAnsi" w:hAnsiTheme="majorHAnsi"/>
-          <w:spacing w:val="-1"/>
-          <w:sz w:val="18"/>
-        </w:rPr>
-        <w:t xml:space="preserve"> </w:t>
-      </w:r>
-      <w:r>
-        <w:rPr>
-          <w:rFonts w:asciiTheme="majorHAnsi" w:hAnsiTheme="majorHAnsi"/>
-          <w:sz w:val="18"/>
-        </w:rPr>
-        <w:t>of</w:t>
-      </w:r>
-      <w:r>
-        <w:rPr>
-          <w:rFonts w:asciiTheme="majorHAnsi" w:hAnsiTheme="majorHAnsi"/>
-          <w:spacing w:val="-3"/>
-          <w:sz w:val="18"/>
-        </w:rPr>
-        <w:t xml:space="preserve"> </w:t>
-      </w:r>
-      <w:r>
-        <w:rPr>
-          <w:rFonts w:asciiTheme="majorHAnsi" w:hAnsiTheme="majorHAnsi"/>
-          <w:sz w:val="18"/>
-        </w:rPr>
-        <w:t>the</w:t>
-      </w:r>
-      <w:r>
-        <w:rPr>
-          <w:rFonts w:asciiTheme="majorHAnsi" w:hAnsiTheme="majorHAnsi"/>
-          <w:spacing w:val="-2"/>
-          <w:sz w:val="18"/>
-        </w:rPr>
-        <w:t xml:space="preserve"> </w:t>
-      </w:r>
-      <w:r>
-        <w:rPr>
-          <w:rFonts w:asciiTheme="majorHAnsi" w:hAnsiTheme="majorHAnsi"/>
-          <w:sz w:val="18"/>
-        </w:rPr>
-        <w:t>concern</w:t>
-      </w:r>
-      <w:r>
-        <w:rPr>
-          <w:rFonts w:asciiTheme="majorHAnsi" w:hAnsiTheme="majorHAnsi"/>
-          <w:spacing w:val="-1"/>
-          <w:sz w:val="18"/>
-        </w:rPr>
-        <w:t xml:space="preserve"> </w:t>
-      </w:r>
-      <w:r>
-        <w:rPr>
-          <w:rFonts w:asciiTheme="majorHAnsi" w:hAnsiTheme="majorHAnsi"/>
-          <w:sz w:val="18"/>
-        </w:rPr>
-        <w:t>entity</w:t>
-      </w:r>
-      <w:r>
-        <w:rPr>
-          <w:rFonts w:asciiTheme="majorHAnsi" w:hAnsiTheme="majorHAnsi"/>
-          <w:spacing w:val="-1"/>
-          <w:sz w:val="18"/>
-        </w:rPr>
-        <w:t xml:space="preserve"> </w:t>
-      </w:r>
-      <w:r>
-        <w:rPr>
-          <w:rFonts w:asciiTheme="majorHAnsi" w:hAnsiTheme="majorHAnsi"/>
-          <w:spacing w:val="-4"/>
-          <w:sz w:val="18"/>
-        </w:rPr>
-        <w:t>(CR).</w:t>
-      </w:r>
-    </w:p>
-    <w:p>
-      <w:r>
-        <w:t xml:space="preserve">{docEntityCard} Entity Card/Computer card of the concern entity.</w:t>
-      </w:r>
-    </w:p>
-    <w:p>
-      <w:pPr>
-        <w:pStyle w:val="ListParagraph"/>
-        <w:numPr>
-          <w:ilvl w:val="0"/>
-          <w:numId w:val="2"/>
-        </w:numPr>
-        <w:tabs>
-          <w:tab w:val="left" w:pos="385"/>
-        </w:tabs>
-        <w:spacing w:before="179"/>
-        <w:ind w:left="385" w:hanging="220"/>
-        <w:rPr>
-          <w:rFonts w:asciiTheme="majorHAnsi" w:hAnsiTheme="majorHAnsi"/>
-          <w:sz w:val="18"/>
-        </w:rPr>
-      </w:pPr>
-      <w:r>
-        <w:rPr>
-          <w:rFonts w:asciiTheme="majorHAnsi" w:hAnsiTheme="majorHAnsi"/>
-          <w:sz w:val="18"/>
-        </w:rPr>
-        <w:t>Certificate</w:t>
-      </w:r>
-      <w:r>
-        <w:rPr>
-          <w:rFonts w:asciiTheme="majorHAnsi" w:hAnsiTheme="majorHAnsi"/>
-          <w:spacing w:val="-2"/>
-          <w:sz w:val="18"/>
-        </w:rPr>
-        <w:t xml:space="preserve"> </w:t>
-      </w:r>
-      <w:r>
-        <w:rPr>
-          <w:rFonts w:asciiTheme="majorHAnsi" w:hAnsiTheme="majorHAnsi"/>
-          <w:sz w:val="18"/>
-        </w:rPr>
-        <w:t>of</w:t>
-      </w:r>
-      <w:r>
-        <w:rPr>
-          <w:rFonts w:asciiTheme="majorHAnsi" w:hAnsiTheme="majorHAnsi"/>
-          <w:spacing w:val="-2"/>
-          <w:sz w:val="18"/>
-        </w:rPr>
-        <w:t xml:space="preserve"> </w:t>
-      </w:r>
-      <w:r>
-        <w:rPr>
-          <w:rFonts w:asciiTheme="majorHAnsi" w:hAnsiTheme="majorHAnsi"/>
-          <w:sz w:val="18"/>
-        </w:rPr>
-        <w:t>Incorporation</w:t>
-      </w:r>
-      <w:r>
-        <w:rPr>
-          <w:rFonts w:asciiTheme="majorHAnsi" w:hAnsiTheme="majorHAnsi"/>
-          <w:spacing w:val="-2"/>
-          <w:sz w:val="18"/>
-        </w:rPr>
-        <w:t xml:space="preserve"> </w:t>
-      </w:r>
-      <w:r>
-        <w:rPr>
-          <w:rFonts w:asciiTheme="majorHAnsi" w:hAnsiTheme="majorHAnsi"/>
-          <w:sz w:val="18"/>
-        </w:rPr>
-        <w:t>of</w:t>
-      </w:r>
-      <w:r>
-        <w:rPr>
-          <w:rFonts w:asciiTheme="majorHAnsi" w:hAnsiTheme="majorHAnsi"/>
-          <w:spacing w:val="-3"/>
-          <w:sz w:val="18"/>
-        </w:rPr>
-        <w:t xml:space="preserve"> </w:t>
-      </w:r>
-      <w:r>
-        <w:rPr>
-          <w:rFonts w:asciiTheme="majorHAnsi" w:hAnsiTheme="majorHAnsi"/>
-          <w:sz w:val="18"/>
-        </w:rPr>
-        <w:t>the</w:t>
-      </w:r>
-      <w:r>
-        <w:rPr>
-          <w:rFonts w:asciiTheme="majorHAnsi" w:hAnsiTheme="majorHAnsi"/>
-          <w:spacing w:val="-2"/>
-          <w:sz w:val="18"/>
-        </w:rPr>
-        <w:t xml:space="preserve"> </w:t>
-      </w:r>
-      <w:r>
-        <w:rPr>
-          <w:rFonts w:asciiTheme="majorHAnsi" w:hAnsiTheme="majorHAnsi"/>
-          <w:sz w:val="18"/>
-        </w:rPr>
-        <w:t>Concern</w:t>
-      </w:r>
-      <w:r>
-        <w:rPr>
-          <w:rFonts w:asciiTheme="majorHAnsi" w:hAnsiTheme="majorHAnsi"/>
-          <w:spacing w:val="-1"/>
-          <w:sz w:val="18"/>
-        </w:rPr>
-        <w:t xml:space="preserve"> </w:t>
-      </w:r>
-      <w:r>
-        <w:rPr>
-          <w:rFonts w:asciiTheme="majorHAnsi" w:hAnsiTheme="majorHAnsi"/>
-          <w:spacing w:val="-2"/>
-          <w:sz w:val="18"/>
-        </w:rPr>
-        <w:t>entity.</w:t>
-      </w:r>
-    </w:p>
-    <w:p>
-      <w:pPr>
-        <w:pStyle w:val="ListParagraph"/>
-        <w:numPr>
-          <w:ilvl w:val="0"/>
-          <w:numId w:val="2"/>
-        </w:numPr>
-        <w:tabs>
-          <w:tab w:val="left" w:pos="385"/>
-        </w:tabs>
-        <w:spacing w:before="183"/>
-        <w:ind w:left="385" w:hanging="220"/>
-        <w:rPr>
-          <w:rFonts w:asciiTheme="majorHAnsi" w:hAnsiTheme="majorHAnsi"/>
-          <w:sz w:val="18"/>
-        </w:rPr>
-      </w:pPr>
-      <w:r>
-        <w:rPr>
-          <w:rFonts w:asciiTheme="majorHAnsi" w:hAnsiTheme="majorHAnsi"/>
-          <w:sz w:val="18"/>
-        </w:rPr>
-        <w:t>Articles</w:t>
-      </w:r>
-      <w:r>
-        <w:rPr>
-          <w:rFonts w:asciiTheme="majorHAnsi" w:hAnsiTheme="majorHAnsi"/>
-          <w:spacing w:val="-4"/>
-          <w:sz w:val="18"/>
-        </w:rPr>
-        <w:t xml:space="preserve"> </w:t>
-      </w:r>
-      <w:r>
-        <w:rPr>
-          <w:rFonts w:asciiTheme="majorHAnsi" w:hAnsiTheme="majorHAnsi"/>
-          <w:sz w:val="18"/>
-        </w:rPr>
-        <w:t>of</w:t>
-      </w:r>
-      <w:r>
-        <w:rPr>
-          <w:rFonts w:asciiTheme="majorHAnsi" w:hAnsiTheme="majorHAnsi"/>
-          <w:spacing w:val="-2"/>
-          <w:sz w:val="18"/>
-        </w:rPr>
-        <w:t xml:space="preserve"> </w:t>
-      </w:r>
-      <w:r>
-        <w:rPr>
-          <w:rFonts w:asciiTheme="majorHAnsi" w:hAnsiTheme="majorHAnsi"/>
-          <w:sz w:val="18"/>
-        </w:rPr>
-        <w:t>Association</w:t>
-      </w:r>
-      <w:r>
-        <w:rPr>
-          <w:rFonts w:asciiTheme="majorHAnsi" w:hAnsiTheme="majorHAnsi"/>
-          <w:spacing w:val="-2"/>
-          <w:sz w:val="18"/>
-        </w:rPr>
-        <w:t xml:space="preserve"> </w:t>
-      </w:r>
-      <w:r>
-        <w:rPr>
-          <w:rFonts w:asciiTheme="majorHAnsi" w:hAnsiTheme="majorHAnsi"/>
-          <w:sz w:val="18"/>
-        </w:rPr>
-        <w:t>of</w:t>
-      </w:r>
-      <w:r>
-        <w:rPr>
-          <w:rFonts w:asciiTheme="majorHAnsi" w:hAnsiTheme="majorHAnsi"/>
-          <w:spacing w:val="-2"/>
-          <w:sz w:val="18"/>
-        </w:rPr>
-        <w:t xml:space="preserve"> </w:t>
-      </w:r>
-      <w:r>
-        <w:rPr>
-          <w:rFonts w:asciiTheme="majorHAnsi" w:hAnsiTheme="majorHAnsi"/>
-          <w:sz w:val="18"/>
-        </w:rPr>
-        <w:t>the</w:t>
-      </w:r>
-      <w:r>
-        <w:rPr>
-          <w:rFonts w:asciiTheme="majorHAnsi" w:hAnsiTheme="majorHAnsi"/>
-          <w:spacing w:val="-2"/>
-          <w:sz w:val="18"/>
-        </w:rPr>
-        <w:t xml:space="preserve"> </w:t>
-      </w:r>
-      <w:r>
-        <w:rPr>
-          <w:rFonts w:asciiTheme="majorHAnsi" w:hAnsiTheme="majorHAnsi"/>
-          <w:sz w:val="18"/>
-        </w:rPr>
-        <w:t>Concern</w:t>
-      </w:r>
-      <w:r>
-        <w:rPr>
-          <w:rFonts w:asciiTheme="majorHAnsi" w:hAnsiTheme="majorHAnsi"/>
-          <w:spacing w:val="-1"/>
-          <w:sz w:val="18"/>
-        </w:rPr>
-        <w:t xml:space="preserve"> </w:t>
-      </w:r>
-      <w:r>
-        <w:rPr>
-          <w:rFonts w:asciiTheme="majorHAnsi" w:hAnsiTheme="majorHAnsi"/>
-          <w:spacing w:val="-2"/>
-          <w:sz w:val="18"/>
-        </w:rPr>
-        <w:t>Entity.</w:t>
-      </w:r>
-    </w:p>
-    <w:p>
-      <w:r>
-        <w:t xml:space="preserve">{docIdentityCopies} Qatar IDs/passport copies of all-natural person, direct and indirect, shareholders, UBOs, Directors, SEF, Secretory and authorized signatories up to and including its ultimate beneficial owners.</w:t>
-      </w:r>
-    </w:p>
-    <w:p>
-      <w:pPr>
-        <w:pStyle w:val="ListParagraph"/>
-        <w:numPr>
-          <w:ilvl w:val="0"/>
-          <w:numId w:val="2"/>
-        </w:numPr>
-        <w:tabs>
-          <w:tab w:val="left" w:pos="385"/>
-        </w:tabs>
-        <w:spacing w:before="161"/>
-        <w:ind w:left="385" w:hanging="220"/>
-        <w:rPr>
-          <w:rFonts w:asciiTheme="majorHAnsi" w:hAnsiTheme="majorHAnsi"/>
-          <w:sz w:val="18"/>
-        </w:rPr>
-      </w:pPr>
-      <w:r>
-        <w:rPr>
-          <w:rFonts w:asciiTheme="majorHAnsi" w:hAnsiTheme="majorHAnsi"/>
-          <w:sz w:val="18"/>
-        </w:rPr>
-        <w:t>If</w:t>
-      </w:r>
-      <w:r>
-        <w:rPr>
-          <w:rFonts w:asciiTheme="majorHAnsi" w:hAnsiTheme="majorHAnsi"/>
-          <w:spacing w:val="-6"/>
-          <w:sz w:val="18"/>
-        </w:rPr>
-        <w:t xml:space="preserve"> </w:t>
-      </w:r>
-      <w:r>
-        <w:rPr>
-          <w:rFonts w:asciiTheme="majorHAnsi" w:hAnsiTheme="majorHAnsi"/>
-          <w:sz w:val="18"/>
-        </w:rPr>
-        <w:t>Shareholders</w:t>
-      </w:r>
-      <w:r>
-        <w:rPr>
-          <w:rFonts w:asciiTheme="majorHAnsi" w:hAnsiTheme="majorHAnsi"/>
-          <w:spacing w:val="-1"/>
-          <w:sz w:val="18"/>
-        </w:rPr>
-        <w:t xml:space="preserve"> </w:t>
-      </w:r>
-      <w:r>
-        <w:rPr>
-          <w:rFonts w:asciiTheme="majorHAnsi" w:hAnsiTheme="majorHAnsi"/>
-          <w:sz w:val="18"/>
-        </w:rPr>
-        <w:t>are</w:t>
-      </w:r>
-      <w:r>
-        <w:rPr>
-          <w:rFonts w:asciiTheme="majorHAnsi" w:hAnsiTheme="majorHAnsi"/>
-          <w:spacing w:val="-3"/>
-          <w:sz w:val="18"/>
-        </w:rPr>
-        <w:t xml:space="preserve"> </w:t>
-      </w:r>
-      <w:r>
-        <w:rPr>
-          <w:rFonts w:asciiTheme="majorHAnsi" w:hAnsiTheme="majorHAnsi"/>
-          <w:sz w:val="18"/>
-        </w:rPr>
-        <w:t>legal</w:t>
-      </w:r>
-      <w:r>
-        <w:rPr>
-          <w:rFonts w:asciiTheme="majorHAnsi" w:hAnsiTheme="majorHAnsi"/>
-          <w:spacing w:val="-1"/>
-          <w:sz w:val="18"/>
-        </w:rPr>
-        <w:t xml:space="preserve"> </w:t>
-      </w:r>
-      <w:r>
-        <w:rPr>
-          <w:rFonts w:asciiTheme="majorHAnsi" w:hAnsiTheme="majorHAnsi"/>
-          <w:sz w:val="18"/>
-        </w:rPr>
-        <w:t>entities</w:t>
-      </w:r>
-      <w:r>
-        <w:rPr>
-          <w:rFonts w:asciiTheme="majorHAnsi" w:hAnsiTheme="majorHAnsi"/>
-          <w:spacing w:val="-2"/>
-          <w:sz w:val="18"/>
-        </w:rPr>
-        <w:t xml:space="preserve"> </w:t>
-      </w:r>
-      <w:r>
-        <w:rPr>
-          <w:rFonts w:asciiTheme="majorHAnsi" w:hAnsiTheme="majorHAnsi"/>
-          <w:sz w:val="18"/>
-        </w:rPr>
-        <w:t>not</w:t>
-      </w:r>
-      <w:r>
-        <w:rPr>
-          <w:rFonts w:asciiTheme="majorHAnsi" w:hAnsiTheme="majorHAnsi"/>
-          <w:spacing w:val="-1"/>
-          <w:sz w:val="18"/>
-        </w:rPr>
-        <w:t xml:space="preserve"> </w:t>
-      </w:r>
-      <w:r>
-        <w:rPr>
-          <w:rFonts w:asciiTheme="majorHAnsi" w:hAnsiTheme="majorHAnsi"/>
-          <w:sz w:val="18"/>
-        </w:rPr>
-        <w:t>the</w:t>
-      </w:r>
-      <w:r>
-        <w:rPr>
-          <w:rFonts w:asciiTheme="majorHAnsi" w:hAnsiTheme="majorHAnsi"/>
-          <w:spacing w:val="-3"/>
-          <w:sz w:val="18"/>
-        </w:rPr>
-        <w:t xml:space="preserve"> </w:t>
-      </w:r>
-      <w:r>
-        <w:rPr>
-          <w:rFonts w:asciiTheme="majorHAnsi" w:hAnsiTheme="majorHAnsi"/>
-          <w:sz w:val="18"/>
-        </w:rPr>
-        <w:t>natural</w:t>
-      </w:r>
-      <w:r>
-        <w:rPr>
-          <w:rFonts w:asciiTheme="majorHAnsi" w:hAnsiTheme="majorHAnsi"/>
-          <w:spacing w:val="-1"/>
-          <w:sz w:val="18"/>
-        </w:rPr>
-        <w:t xml:space="preserve"> </w:t>
-      </w:r>
-      <w:r>
-        <w:rPr>
-          <w:rFonts w:asciiTheme="majorHAnsi" w:hAnsiTheme="majorHAnsi"/>
-          <w:sz w:val="18"/>
-        </w:rPr>
-        <w:t>persons,</w:t>
-      </w:r>
-      <w:r>
-        <w:rPr>
-          <w:rFonts w:asciiTheme="majorHAnsi" w:hAnsiTheme="majorHAnsi"/>
-          <w:spacing w:val="-3"/>
-          <w:sz w:val="18"/>
-        </w:rPr>
-        <w:t xml:space="preserve"> </w:t>
-      </w:r>
-      <w:r>
-        <w:rPr>
-          <w:rFonts w:asciiTheme="majorHAnsi" w:hAnsiTheme="majorHAnsi"/>
-          <w:sz w:val="18"/>
-        </w:rPr>
-        <w:t>please</w:t>
-      </w:r>
-      <w:r>
-        <w:rPr>
-          <w:rFonts w:asciiTheme="majorHAnsi" w:hAnsiTheme="majorHAnsi"/>
-          <w:spacing w:val="-4"/>
-          <w:sz w:val="18"/>
-        </w:rPr>
-        <w:t xml:space="preserve"> </w:t>
-      </w:r>
-      <w:r>
-        <w:rPr>
-          <w:rFonts w:asciiTheme="majorHAnsi" w:hAnsiTheme="majorHAnsi"/>
-          <w:sz w:val="18"/>
-        </w:rPr>
-        <w:t>provide</w:t>
-      </w:r>
-      <w:r>
-        <w:rPr>
-          <w:rFonts w:asciiTheme="majorHAnsi" w:hAnsiTheme="majorHAnsi"/>
-          <w:spacing w:val="-3"/>
-          <w:sz w:val="18"/>
-        </w:rPr>
-        <w:t xml:space="preserve"> </w:t>
-      </w:r>
-      <w:r>
-        <w:rPr>
-          <w:rFonts w:asciiTheme="majorHAnsi" w:hAnsiTheme="majorHAnsi"/>
-          <w:sz w:val="18"/>
-        </w:rPr>
-        <w:t>the</w:t>
-      </w:r>
-      <w:r>
-        <w:rPr>
-          <w:rFonts w:asciiTheme="majorHAnsi" w:hAnsiTheme="majorHAnsi"/>
-          <w:spacing w:val="-2"/>
-          <w:sz w:val="18"/>
-        </w:rPr>
-        <w:t xml:space="preserve"> </w:t>
-      </w:r>
-      <w:r>
-        <w:rPr>
-          <w:rFonts w:asciiTheme="majorHAnsi" w:hAnsiTheme="majorHAnsi"/>
-          <w:sz w:val="18"/>
-        </w:rPr>
-        <w:t>CR</w:t>
-      </w:r>
-      <w:r>
-        <w:rPr>
-          <w:rFonts w:asciiTheme="majorHAnsi" w:hAnsiTheme="majorHAnsi"/>
-          <w:spacing w:val="-3"/>
-          <w:sz w:val="18"/>
-        </w:rPr>
-        <w:t xml:space="preserve"> </w:t>
-      </w:r>
-      <w:r>
-        <w:rPr>
-          <w:rFonts w:asciiTheme="majorHAnsi" w:hAnsiTheme="majorHAnsi"/>
-          <w:sz w:val="18"/>
-        </w:rPr>
-        <w:t>of</w:t>
-      </w:r>
-      <w:r>
-        <w:rPr>
-          <w:rFonts w:asciiTheme="majorHAnsi" w:hAnsiTheme="majorHAnsi"/>
-          <w:spacing w:val="-3"/>
-          <w:sz w:val="18"/>
-        </w:rPr>
-        <w:t xml:space="preserve"> </w:t>
-      </w:r>
-      <w:r>
-        <w:rPr>
-          <w:rFonts w:asciiTheme="majorHAnsi" w:hAnsiTheme="majorHAnsi"/>
-          <w:sz w:val="18"/>
-        </w:rPr>
-        <w:t>all</w:t>
-      </w:r>
-      <w:r>
-        <w:rPr>
-          <w:rFonts w:asciiTheme="majorHAnsi" w:hAnsiTheme="majorHAnsi"/>
-          <w:spacing w:val="-3"/>
-          <w:sz w:val="18"/>
-        </w:rPr>
-        <w:t xml:space="preserve"> </w:t>
-      </w:r>
-      <w:r>
-        <w:rPr>
-          <w:rFonts w:asciiTheme="majorHAnsi" w:hAnsiTheme="majorHAnsi"/>
-          <w:sz w:val="18"/>
-        </w:rPr>
-        <w:t>legal</w:t>
-      </w:r>
-      <w:r>
-        <w:rPr>
-          <w:rFonts w:asciiTheme="majorHAnsi" w:hAnsiTheme="majorHAnsi"/>
-          <w:spacing w:val="-2"/>
-          <w:sz w:val="18"/>
-        </w:rPr>
-        <w:t xml:space="preserve"> </w:t>
-      </w:r>
-      <w:r>
-        <w:rPr>
-          <w:rFonts w:asciiTheme="majorHAnsi" w:hAnsiTheme="majorHAnsi"/>
-          <w:sz w:val="18"/>
-        </w:rPr>
-        <w:t>entities</w:t>
-      </w:r>
-      <w:r>
-        <w:rPr>
-          <w:rFonts w:asciiTheme="majorHAnsi" w:hAnsiTheme="majorHAnsi"/>
-          <w:spacing w:val="-1"/>
-          <w:sz w:val="18"/>
-        </w:rPr>
-        <w:t xml:space="preserve"> </w:t>
-      </w:r>
-      <w:r>
-        <w:rPr>
-          <w:rFonts w:asciiTheme="majorHAnsi" w:hAnsiTheme="majorHAnsi"/>
-          <w:sz w:val="18"/>
-        </w:rPr>
-        <w:t>until</w:t>
-      </w:r>
-      <w:r>
-        <w:rPr>
-          <w:rFonts w:asciiTheme="majorHAnsi" w:hAnsiTheme="majorHAnsi"/>
-          <w:spacing w:val="-2"/>
-          <w:sz w:val="18"/>
-        </w:rPr>
-        <w:t xml:space="preserve"> </w:t>
-      </w:r>
-      <w:r>
-        <w:rPr>
-          <w:rFonts w:asciiTheme="majorHAnsi" w:hAnsiTheme="majorHAnsi"/>
-          <w:sz w:val="18"/>
-        </w:rPr>
-        <w:t>natural</w:t>
-      </w:r>
-      <w:r>
-        <w:rPr>
-          <w:rFonts w:asciiTheme="majorHAnsi" w:hAnsiTheme="majorHAnsi"/>
-          <w:spacing w:val="-1"/>
-          <w:sz w:val="18"/>
-        </w:rPr>
-        <w:t xml:space="preserve"> </w:t>
-      </w:r>
-      <w:r>
-        <w:rPr>
-          <w:rFonts w:asciiTheme="majorHAnsi" w:hAnsiTheme="majorHAnsi"/>
-          <w:spacing w:val="-2"/>
-          <w:sz w:val="18"/>
-        </w:rPr>
-        <w:t>persons</w:t>
-      </w:r>
-    </w:p>
-    <w:p>
-      <w:r>
-        <w:t xml:space="preserve">{docNationalAddressCertificates} National address certificates for the legal entities and natural persons residents in the state of Qatar.</w:t>
-      </w:r>
-    </w:p>
-    <w:p>
-      <w:pPr>
-        <w:pStyle w:val="ListParagraph"/>
-        <w:numPr>
-          <w:ilvl w:val="0"/>
-          <w:numId w:val="2"/>
-        </w:numPr>
-        <w:tabs>
-          <w:tab w:val="left" w:pos="385"/>
-        </w:tabs>
-        <w:spacing w:before="180"/>
-        <w:ind w:left="385" w:hanging="220"/>
-        <w:rPr>
-          <w:rFonts w:asciiTheme="majorHAnsi" w:hAnsiTheme="majorHAnsi"/>
-          <w:sz w:val="18"/>
-        </w:rPr>
-      </w:pPr>
-      <w:r>
-        <w:rPr>
-          <w:rFonts w:asciiTheme="majorHAnsi" w:hAnsiTheme="majorHAnsi"/>
-          <w:sz w:val="18"/>
-        </w:rPr>
-        <w:t>Latest</w:t>
-      </w:r>
-      <w:r>
-        <w:rPr>
-          <w:rFonts w:asciiTheme="majorHAnsi" w:hAnsiTheme="majorHAnsi"/>
-          <w:spacing w:val="-2"/>
-          <w:sz w:val="18"/>
-        </w:rPr>
-        <w:t xml:space="preserve"> </w:t>
-      </w:r>
-      <w:r>
-        <w:rPr>
-          <w:rFonts w:asciiTheme="majorHAnsi" w:hAnsiTheme="majorHAnsi"/>
-          <w:sz w:val="18"/>
-        </w:rPr>
-        <w:t>Audited</w:t>
-      </w:r>
-      <w:r>
-        <w:rPr>
-          <w:rFonts w:asciiTheme="majorHAnsi" w:hAnsiTheme="majorHAnsi"/>
-          <w:spacing w:val="-2"/>
-          <w:sz w:val="18"/>
-        </w:rPr>
-        <w:t xml:space="preserve"> </w:t>
-      </w:r>
-      <w:r>
-        <w:rPr>
-          <w:rFonts w:asciiTheme="majorHAnsi" w:hAnsiTheme="majorHAnsi"/>
-          <w:sz w:val="18"/>
-        </w:rPr>
-        <w:t>Financial</w:t>
-      </w:r>
-      <w:r>
-        <w:rPr>
-          <w:rFonts w:asciiTheme="majorHAnsi" w:hAnsiTheme="majorHAnsi"/>
-          <w:spacing w:val="-2"/>
-          <w:sz w:val="18"/>
-        </w:rPr>
-        <w:t xml:space="preserve"> Statements.</w:t>
-      </w:r>
-    </w:p>
-    <w:p>
-      <w:r>
-        <w:t xml:space="preserve">{docTaxCard} Tax Card of the concern entity.</w:t>
-      </w:r>
-    </w:p>
-    <w:p>
-      <w:r>
-        <w:t xml:space="preserve">Additional documents: {additionalDocumentsText}</w:t>
-      </w:r>
-    </w:p>
-    <w:p>
-      <w:r>
+          <w:szCs w:val="18"/>
+        </w:rPr>
         <w:t xml:space="preserve">Additional notes for KYC preparation documents: {uploadedFilesNote}</w:t>
       </w:r>
     </w:p>
@@ -7573,6 +6161,11 @@
           </w:tcPr>
           <w:p>
             <w:r>
+              <w:rPr>
+                <w:rFonts w:ascii="Times New Roman" w:hAnsi="Times New Roman" w:cs="Times New Roman"/>
+                <w:sz w:val="18"/>
+                <w:szCs w:val="18"/>
+              </w:rPr>
               <w:t xml:space="preserve">{declarationFullName}</w:t>
             </w:r>
           </w:p>
@@ -7611,6 +6204,11 @@
           </w:tcPr>
           <w:p>
             <w:r>
+              <w:rPr>
+                <w:rFonts w:ascii="Times New Roman" w:hAnsi="Times New Roman" w:cs="Times New Roman"/>
+                <w:sz w:val="18"/>
+                <w:szCs w:val="18"/>
+              </w:rPr>
               <w:t xml:space="preserve">{declarationPosition}</w:t>
             </w:r>
           </w:p>
@@ -7649,6 +6247,11 @@
           </w:tcPr>
           <w:p>
             <w:r>
+              <w:rPr>
+                <w:rFonts w:ascii="Times New Roman" w:hAnsi="Times New Roman" w:cs="Times New Roman"/>
+                <w:sz w:val="18"/>
+                <w:szCs w:val="18"/>
+              </w:rPr>
               <w:t xml:space="preserve">{declarationDate}</w:t>
             </w:r>
           </w:p>
@@ -7696,6 +6299,11 @@
           </w:tcPr>
           <w:p>
             <w:r>
+              <w:rPr>
+                <w:rFonts w:ascii="Times New Roman" w:hAnsi="Times New Roman" w:cs="Times New Roman"/>
+                <w:sz w:val="18"/>
+                <w:szCs w:val="18"/>
+              </w:rPr>
               <w:t xml:space="preserve">{signatureFileName}</w:t>
             </w:r>
           </w:p>
@@ -7752,6 +6360,11 @@
           </w:tcPr>
           <w:p>
             <w:r>
+              <w:rPr>
+                <w:rFonts w:ascii="Times New Roman" w:hAnsi="Times New Roman" w:cs="Times New Roman"/>
+                <w:sz w:val="18"/>
+                <w:szCs w:val="18"/>
+              </w:rPr>
               <w:t xml:space="preserve">{stampFileName}</w:t>
             </w:r>
           </w:p>
@@ -7946,63 +6559,13 @@
       </w:pPr>
     </w:p>
     <w:p>
-      <w:pPr>
-        <w:pStyle w:val="BodyText"/>
-        <w:tabs>
-          <w:tab w:val="left" w:pos="1077"/>
-          <w:tab w:val="left" w:pos="1533"/>
-        </w:tabs>
-        <w:spacing w:before="7"/>
-        <w:ind w:left="165"/>
-        <w:rPr>
-          <w:rFonts w:asciiTheme="majorHAnsi" w:hAnsiTheme="majorHAnsi"/>
-        </w:rPr>
-      </w:pPr>
-      <w:r>
-        <w:rPr>
-          <w:rFonts w:asciiTheme="majorHAnsi" w:hAnsiTheme="majorHAnsi"/>
-          <w:spacing w:val="-5"/>
-        </w:rPr>
-        <w:t>Yes</w:t>
-      </w:r>
-      <w:r>
-        <w:rPr>
-          <w:rFonts w:asciiTheme="majorHAnsi" w:hAnsiTheme="majorHAnsi"/>
-        </w:rPr>
-        <w:t xml:space="preserve"> </w:t>
-      </w:r>
-      <w:r>
-        <w:rPr>
-          <w:rFonts w:ascii="Segoe UI Symbol" w:hAnsi="Segoe UI Symbol" w:cs="Segoe UI Symbol"/>
-          <w:spacing w:val="-12"/>
-        </w:rPr>
-        <w:t>☐</w:t>
-      </w:r>
-      <w:r>
-        <w:rPr>
-          <w:rFonts w:asciiTheme="majorHAnsi" w:hAnsiTheme="majorHAnsi"/>
-        </w:rPr>
-        <w:tab/>
-      </w:r>
-      <w:r>
-        <w:rPr>
-          <w:rFonts w:asciiTheme="majorHAnsi" w:hAnsiTheme="majorHAnsi"/>
-          <w:spacing w:val="-5"/>
-        </w:rPr>
-        <w:t>No</w:t>
-      </w:r>
-      <w:r>
-        <w:rPr>
-          <w:rFonts w:asciiTheme="majorHAnsi" w:hAnsiTheme="majorHAnsi"/>
-        </w:rPr>
-        <w:t xml:space="preserve"> </w:t>
-      </w:r>
-      <w:r>
-        <w:rPr>
-          <w:rFonts w:ascii="Segoe UI Symbol" w:hAnsi="Segoe UI Symbol" w:cs="Segoe UI Symbol"/>
-          <w:spacing w:val="-12"/>
-        </w:rPr>
-        <w:t>☐</w:t>
+      <w:r>
+        <w:rPr>
+          <w:rFonts w:ascii="Times New Roman" w:hAnsi="Times New Roman" w:cs="Times New Roman"/>
+          <w:sz w:val="18"/>
+          <w:szCs w:val="18"/>
+        </w:rPr>
+        <w:t xml:space="preserve">Yes {amlAccuracyYes}    No {amlAccuracyNo}</w:t>
       </w:r>
     </w:p>
     <w:p>
@@ -8029,31 +6592,13 @@
       </w:r>
     </w:p>
     <w:p>
-      <w:pPr>
-        <w:pStyle w:val="BodyText"/>
-        <w:spacing w:before="4" w:line="276" w:lineRule="auto"/>
-        <w:ind w:left="165"/>
-        <w:rPr>
-          <w:rFonts w:asciiTheme="majorHAnsi" w:hAnsiTheme="majorHAnsi"/>
-        </w:rPr>
-      </w:pPr>
-      <w:r>
-        <w:rPr>
-          <w:rFonts w:asciiTheme="majorHAnsi" w:hAnsiTheme="majorHAnsi"/>
-        </w:rPr>
-        <w:t>If No</w:t>
-      </w:r>
-      <w:r>
-        <w:rPr>
-          <w:rFonts w:asciiTheme="majorHAnsi" w:hAnsiTheme="majorHAnsi"/>
-        </w:rPr>
-        <w:t>,</w:t>
-      </w:r>
-      <w:r>
-        <w:rPr>
-          <w:rFonts w:asciiTheme="majorHAnsi" w:hAnsiTheme="majorHAnsi"/>
-        </w:rPr>
-        <w:t xml:space="preserve"> please provide clarification and findings.</w:t>
+      <w:r>
+        <w:rPr>
+          <w:rFonts w:ascii="Times New Roman" w:hAnsi="Times New Roman" w:cs="Times New Roman"/>
+          <w:sz w:val="18"/>
+          <w:szCs w:val="18"/>
+        </w:rPr>
+        <w:t xml:space="preserve">If No, please provide clarification and findings: {amlClarificationFindings}</w:t>
       </w:r>
     </w:p>
     <w:p>
@@ -8498,6 +7043,11 @@
           </w:tcPr>
           <w:p>
             <w:r>
+              <w:rPr>
+                <w:rFonts w:ascii="Times New Roman" w:hAnsi="Times New Roman" w:cs="Times New Roman"/>
+                <w:sz w:val="18"/>
+                <w:szCs w:val="18"/>
+              </w:rPr>
               <w:t xml:space="preserve">{amlName}</w:t>
             </w:r>
           </w:p>
@@ -8537,6 +7087,11 @@
           </w:tcPr>
           <w:p>
             <w:r>
+              <w:rPr>
+                <w:rFonts w:ascii="Times New Roman" w:hAnsi="Times New Roman" w:cs="Times New Roman"/>
+                <w:sz w:val="18"/>
+                <w:szCs w:val="18"/>
+              </w:rPr>
               <w:t xml:space="preserve">{amlSignatureFileName}</w:t>
             </w:r>
           </w:p>
@@ -8573,6 +7128,11 @@
           </w:tcPr>
           <w:p>
             <w:r>
+              <w:rPr>
+                <w:rFonts w:ascii="Times New Roman" w:hAnsi="Times New Roman" w:cs="Times New Roman"/>
+                <w:sz w:val="18"/>
+                <w:szCs w:val="18"/>
+              </w:rPr>
               <w:t xml:space="preserve">{amlDate}</w:t>
             </w:r>
           </w:p>
@@ -8612,6 +7172,11 @@
           </w:tcPr>
           <w:p>
             <w:r>
+              <w:rPr>
+                <w:rFonts w:ascii="Times New Roman" w:hAnsi="Times New Roman" w:cs="Times New Roman"/>
+                <w:sz w:val="18"/>
+                <w:szCs w:val="18"/>
+              </w:rPr>
               <w:t xml:space="preserve">{amlComments}</w:t>
             </w:r>
           </w:p>
@@ -8735,6 +7300,11 @@
           </w:tcPr>
           <w:p>
             <w:r>
+              <w:rPr>
+                <w:rFonts w:ascii="Times New Roman" w:hAnsi="Times New Roman" w:cs="Times New Roman"/>
+                <w:sz w:val="18"/>
+                <w:szCs w:val="18"/>
+              </w:rPr>
               <w:t xml:space="preserve">{dmlroName}</w:t>
             </w:r>
           </w:p>
@@ -8774,6 +7344,11 @@
           </w:tcPr>
           <w:p>
             <w:r>
+              <w:rPr>
+                <w:rFonts w:ascii="Times New Roman" w:hAnsi="Times New Roman" w:cs="Times New Roman"/>
+                <w:sz w:val="18"/>
+                <w:szCs w:val="18"/>
+              </w:rPr>
               <w:t xml:space="preserve">{dmlroSignatureFileName}</w:t>
             </w:r>
           </w:p>
@@ -8810,6 +7385,11 @@
           </w:tcPr>
           <w:p>
             <w:r>
+              <w:rPr>
+                <w:rFonts w:ascii="Times New Roman" w:hAnsi="Times New Roman" w:cs="Times New Roman"/>
+                <w:sz w:val="18"/>
+                <w:szCs w:val="18"/>
+              </w:rPr>
               <w:t xml:space="preserve">{dmlroDate}</w:t>
             </w:r>
           </w:p>
@@ -8849,6 +7429,11 @@
           </w:tcPr>
           <w:p>
             <w:r>
+              <w:rPr>
+                <w:rFonts w:ascii="Times New Roman" w:hAnsi="Times New Roman" w:cs="Times New Roman"/>
+                <w:sz w:val="18"/>
+                <w:szCs w:val="18"/>
+              </w:rPr>
               <w:t xml:space="preserve">{dmlroComments}</w:t>
             </w:r>
           </w:p>
@@ -9133,6 +7718,11 @@
           </w:tcPr>
           <w:p>
             <w:r>
+              <w:rPr>
+                <w:rFonts w:ascii="Times New Roman" w:hAnsi="Times New Roman" w:cs="Times New Roman"/>
+                <w:sz w:val="18"/>
+                <w:szCs w:val="18"/>
+              </w:rPr>
               <w:t xml:space="preserve">{mlroName}</w:t>
             </w:r>
           </w:p>
@@ -9172,6 +7762,11 @@
           </w:tcPr>
           <w:p>
             <w:r>
+              <w:rPr>
+                <w:rFonts w:ascii="Times New Roman" w:hAnsi="Times New Roman" w:cs="Times New Roman"/>
+                <w:sz w:val="18"/>
+                <w:szCs w:val="18"/>
+              </w:rPr>
               <w:t xml:space="preserve">{mlroSignatureFileName}</w:t>
             </w:r>
           </w:p>
@@ -9208,6 +7803,11 @@
           </w:tcPr>
           <w:p>
             <w:r>
+              <w:rPr>
+                <w:rFonts w:ascii="Times New Roman" w:hAnsi="Times New Roman" w:cs="Times New Roman"/>
+                <w:sz w:val="18"/>
+                <w:szCs w:val="18"/>
+              </w:rPr>
               <w:t xml:space="preserve">{mlroDate}</w:t>
             </w:r>
           </w:p>
@@ -9247,6 +7847,11 @@
           </w:tcPr>
           <w:p>
             <w:r>
+              <w:rPr>
+                <w:rFonts w:ascii="Times New Roman" w:hAnsi="Times New Roman" w:cs="Times New Roman"/>
+                <w:sz w:val="18"/>
+                <w:szCs w:val="18"/>
+              </w:rPr>
               <w:t xml:space="preserve">{mlroComments}</w:t>
             </w:r>
           </w:p>
@@ -9365,6 +7970,11 @@
           </w:tcPr>
           <w:p>
             <w:r>
+              <w:rPr>
+                <w:rFonts w:ascii="Times New Roman" w:hAnsi="Times New Roman" w:cs="Times New Roman"/>
+                <w:sz w:val="18"/>
+                <w:szCs w:val="18"/>
+              </w:rPr>
               <w:t xml:space="preserve">{sefName}</w:t>
             </w:r>
           </w:p>
@@ -9404,6 +8014,11 @@
           </w:tcPr>
           <w:p>
             <w:r>
+              <w:rPr>
+                <w:rFonts w:ascii="Times New Roman" w:hAnsi="Times New Roman" w:cs="Times New Roman"/>
+                <w:sz w:val="18"/>
+                <w:szCs w:val="18"/>
+              </w:rPr>
               <w:t xml:space="preserve">{sefSignatureFileName}</w:t>
             </w:r>
           </w:p>
@@ -9440,6 +8055,11 @@
           </w:tcPr>
           <w:p>
             <w:r>
+              <w:rPr>
+                <w:rFonts w:ascii="Times New Roman" w:hAnsi="Times New Roman" w:cs="Times New Roman"/>
+                <w:sz w:val="18"/>
+                <w:szCs w:val="18"/>
+              </w:rPr>
               <w:t xml:space="preserve">{sefDate}</w:t>
             </w:r>
           </w:p>
@@ -9479,6 +8099,11 @@
           </w:tcPr>
           <w:p>
             <w:r>
+              <w:rPr>
+                <w:rFonts w:ascii="Times New Roman" w:hAnsi="Times New Roman" w:cs="Times New Roman"/>
+                <w:sz w:val="18"/>
+                <w:szCs w:val="18"/>
+              </w:rPr>
               <w:t xml:space="preserve">{sefComments}</w:t>
             </w:r>
           </w:p>

</xml_diff>

<commit_message>
Polish ownership diagram DOCX export
</commit_message>
<xml_diff>
--- a/backend/templates/kyc-part-1-template.docx
+++ b/backend/templates/kyc-part-1-template.docx
@@ -2744,6 +2744,18 @@
           <w:szCs w:val="18"/>
         </w:rPr>
         <w:t xml:space="preserve">If yes, please provide UBOs/Group structure and details. UBOs/ Group structure: {uboGroupStructureNotes}</w:t>
+      </w:r>
+    </w:p>
+    <w:p>
+      <w:r>
+        <w:rPr>
+          <w:rFonts w:ascii="Times New Roman" w:hAnsi="Times New Roman" w:cs="Times New Roman"/>
+          <w:sz w:val="18"/>
+          <w:szCs w:val="18"/>
+        </w:rPr>
+        <w:t xml:space="preserve">Auto-generated ownership structure:</w:t>
+        <w:br/>
+        <w:t xml:space="preserve">{ownershipStructureText}</w:t>
       </w:r>
     </w:p>
     <w:p>

</xml_diff>

<commit_message>
fix: correct KYC document exports
</commit_message>
<xml_diff>
--- a/backend/templates/kyc-part-1-template.docx
+++ b/backend/templates/kyc-part-1-template.docx
@@ -384,12 +384,16 @@
             <w:tcW w:w="5677" w:type="dxa"/>
           </w:tcPr>
           <w:p>
-            <w:r>
-              <w:rPr>
-                <w:rFonts w:ascii="Times New Roman" w:hAnsi="Times New Roman" w:cs="Times New Roman"/>
-                <w:sz w:val="18"/>
-                <w:szCs w:val="18"/>
-              </w:rPr>
+            <w:pPr>
+              <w:pStyle w:val="TableParagraph"/>
+              <w:spacing w:before="2"/>
+              <w:ind w:left="108"/>
+              <w:rPr>
+                <w:rFonts w:asciiTheme="majorHAnsi" w:hAnsiTheme="majorHAnsi"/>
+                <w:sz w:val="18"/>
+              </w:rPr>
+            </w:pPr>
+            <w:r>
               <w:t xml:space="preserve">{legalName}</w:t>
             </w:r>
           </w:p>
@@ -521,12 +525,16 @@
             <w:tcW w:w="5677" w:type="dxa"/>
           </w:tcPr>
           <w:p>
-            <w:r>
-              <w:rPr>
-                <w:rFonts w:ascii="Times New Roman" w:hAnsi="Times New Roman" w:cs="Times New Roman"/>
-                <w:sz w:val="18"/>
-                <w:szCs w:val="18"/>
-              </w:rPr>
+            <w:pPr>
+              <w:pStyle w:val="TableParagraph"/>
+              <w:spacing w:before="1"/>
+              <w:ind w:left="149"/>
+              <w:rPr>
+                <w:rFonts w:asciiTheme="majorHAnsi" w:hAnsiTheme="majorHAnsi"/>
+                <w:sz w:val="18"/>
+              </w:rPr>
+            </w:pPr>
+            <w:r>
               <w:t xml:space="preserve">{commercialRegistrationNo}</w:t>
             </w:r>
           </w:p>
@@ -657,12 +665,16 @@
             <w:tcW w:w="5677" w:type="dxa"/>
           </w:tcPr>
           <w:p>
-            <w:r>
-              <w:rPr>
-                <w:rFonts w:ascii="Times New Roman" w:hAnsi="Times New Roman" w:cs="Times New Roman"/>
-                <w:sz w:val="18"/>
-                <w:szCs w:val="18"/>
-              </w:rPr>
+            <w:pPr>
+              <w:pStyle w:val="TableParagraph"/>
+              <w:spacing w:before="1"/>
+              <w:ind w:left="149"/>
+              <w:rPr>
+                <w:rFonts w:asciiTheme="majorHAnsi" w:hAnsiTheme="majorHAnsi"/>
+                <w:sz w:val="18"/>
+              </w:rPr>
+            </w:pPr>
+            <w:r>
               <w:t xml:space="preserve">{taxIdentificationNo}</w:t>
             </w:r>
           </w:p>
@@ -770,11 +782,19 @@
             <w:tcW w:w="5677" w:type="dxa"/>
           </w:tcPr>
           <w:p>
-            <w:r>
-              <w:rPr>
-                <w:rFonts w:ascii="Times New Roman" w:hAnsi="Times New Roman" w:cs="Times New Roman"/>
-                <w:sz w:val="18"/>
-                <w:szCs w:val="18"/>
+            <w:pPr>
+              <w:pStyle w:val="TableParagraph"/>
+              <w:spacing w:line="219" w:lineRule="exact"/>
+              <w:ind w:left="108"/>
+              <w:rPr>
+                <w:rFonts w:asciiTheme="majorHAnsi" w:hAnsiTheme="majorHAnsi"/>
+                <w:sz w:val="18"/>
+              </w:rPr>
+            </w:pPr>
+            <w:r>
+              <w:rPr>
+                <w:rFonts w:asciiTheme="majorHAnsi" w:hAnsiTheme="majorHAnsi"/>
+                <w:sz w:val="18"/>
               </w:rPr>
               <w:t xml:space="preserve">Date: {dateOfIncorporation}</w:t>
               <w:br/>
@@ -863,11 +883,19 @@
             <w:tcW w:w="5677" w:type="dxa"/>
           </w:tcPr>
           <w:p>
-            <w:r>
-              <w:rPr>
-                <w:rFonts w:ascii="Times New Roman" w:hAnsi="Times New Roman" w:cs="Times New Roman"/>
-                <w:sz w:val="18"/>
-                <w:szCs w:val="18"/>
+            <w:pPr>
+              <w:pStyle w:val="TableParagraph"/>
+              <w:spacing w:line="230" w:lineRule="exact"/>
+              <w:ind w:left="108"/>
+              <w:rPr>
+                <w:rFonts w:asciiTheme="majorHAnsi" w:hAnsiTheme="majorHAnsi"/>
+                <w:sz w:val="18"/>
+              </w:rPr>
+            </w:pPr>
+            <w:r>
+              <w:rPr>
+                <w:rFonts w:asciiTheme="majorHAnsi" w:hAnsiTheme="majorHAnsi"/>
+                <w:sz w:val="18"/>
               </w:rPr>
               <w:t xml:space="preserve">{legalForm}</w:t>
             </w:r>
@@ -961,11 +989,23 @@
             <w:tcW w:w="5677" w:type="dxa"/>
           </w:tcPr>
           <w:p>
-            <w:r>
-              <w:rPr>
-                <w:rFonts w:ascii="Times New Roman" w:hAnsi="Times New Roman" w:cs="Times New Roman"/>
-                <w:sz w:val="18"/>
-                <w:szCs w:val="18"/>
+            <w:pPr>
+              <w:pStyle w:val="TableParagraph"/>
+              <w:tabs>
+                <w:tab w:val="left" w:pos="1594"/>
+                <w:tab w:val="left" w:pos="2944"/>
+              </w:tabs>
+              <w:spacing w:before="1"/>
+              <w:ind w:left="108"/>
+              <w:rPr>
+                <w:rFonts w:asciiTheme="majorHAnsi" w:hAnsiTheme="majorHAnsi"/>
+                <w:sz w:val="18"/>
+              </w:rPr>
+            </w:pPr>
+            <w:r>
+              <w:rPr>
+                <w:rFonts w:asciiTheme="majorHAnsi" w:hAnsiTheme="majorHAnsi"/>
+                <w:sz w:val="18"/>
               </w:rPr>
               <w:t xml:space="preserve">{registeredOfficeAddress}</w:t>
             </w:r>
@@ -1052,12 +1092,16 @@
             <w:tcW w:w="5677" w:type="dxa"/>
           </w:tcPr>
           <w:p>
-            <w:r>
-              <w:rPr>
-                <w:rFonts w:ascii="Times New Roman" w:hAnsi="Times New Roman" w:cs="Times New Roman"/>
-                <w:sz w:val="18"/>
-                <w:szCs w:val="18"/>
-              </w:rPr>
+            <w:pPr>
+              <w:pStyle w:val="TableParagraph"/>
+              <w:spacing w:line="219" w:lineRule="exact"/>
+              <w:ind w:left="108"/>
+              <w:rPr>
+                <w:rFonts w:asciiTheme="majorHAnsi" w:hAnsiTheme="majorHAnsi"/>
+                <w:sz w:val="18"/>
+              </w:rPr>
+            </w:pPr>
+            <w:r>
               <w:t xml:space="preserve">{telephone}</w:t>
             </w:r>
           </w:p>
@@ -1135,12 +1179,16 @@
             <w:tcW w:w="5677" w:type="dxa"/>
           </w:tcPr>
           <w:p>
-            <w:r>
-              <w:rPr>
-                <w:rFonts w:ascii="Times New Roman" w:hAnsi="Times New Roman" w:cs="Times New Roman"/>
-                <w:sz w:val="18"/>
-                <w:szCs w:val="18"/>
-              </w:rPr>
+            <w:pPr>
+              <w:pStyle w:val="TableParagraph"/>
+              <w:spacing w:before="1"/>
+              <w:ind w:left="108"/>
+              <w:rPr>
+                <w:rFonts w:asciiTheme="majorHAnsi" w:hAnsiTheme="majorHAnsi"/>
+                <w:sz w:val="18"/>
+              </w:rPr>
+            </w:pPr>
+            <w:r>
               <w:t xml:space="preserve">{email}</w:t>
             </w:r>
           </w:p>
@@ -1211,12 +1259,14 @@
             <w:tcW w:w="5677" w:type="dxa"/>
           </w:tcPr>
           <w:p>
-            <w:r>
-              <w:rPr>
-                <w:rFonts w:ascii="Times New Roman" w:hAnsi="Times New Roman" w:cs="Times New Roman"/>
-                <w:sz w:val="18"/>
-                <w:szCs w:val="18"/>
-              </w:rPr>
+            <w:pPr>
+              <w:pStyle w:val="TableParagraph"/>
+              <w:rPr>
+                <w:rFonts w:asciiTheme="majorHAnsi" w:hAnsiTheme="majorHAnsi"/>
+                <w:sz w:val="18"/>
+              </w:rPr>
+            </w:pPr>
+            <w:r>
               <w:t xml:space="preserve">{website}</w:t>
             </w:r>
           </w:p>
@@ -1382,12 +1432,15 @@
             <w:tcW w:w="5677" w:type="dxa"/>
           </w:tcPr>
           <w:p>
-            <w:r>
-              <w:rPr>
-                <w:rFonts w:ascii="Times New Roman" w:hAnsi="Times New Roman" w:cs="Times New Roman"/>
-                <w:sz w:val="18"/>
-                <w:szCs w:val="18"/>
-              </w:rPr>
+            <w:pPr>
+              <w:pStyle w:val="TableParagraph"/>
+              <w:ind w:left="108" w:right="47"/>
+              <w:rPr>
+                <w:rFonts w:asciiTheme="majorHAnsi" w:hAnsiTheme="majorHAnsi"/>
+                <w:sz w:val="18"/>
+              </w:rPr>
+            </w:pPr>
+            <w:r>
               <w:t xml:space="preserve">{businessNature}</w:t>
             </w:r>
           </w:p>
@@ -1465,12 +1518,17 @@
             <w:tcW w:w="5677" w:type="dxa"/>
           </w:tcPr>
           <w:p>
-            <w:r>
-              <w:rPr>
-                <w:rFonts w:ascii="Times New Roman" w:hAnsi="Times New Roman" w:cs="Times New Roman"/>
-                <w:sz w:val="18"/>
-                <w:szCs w:val="18"/>
-              </w:rPr>
+            <w:pPr>
+              <w:pStyle w:val="TableParagraph"/>
+              <w:spacing w:before="1"/>
+              <w:ind w:left="108" w:right="93"/>
+              <w:jc w:val="both"/>
+              <w:rPr>
+                <w:rFonts w:asciiTheme="majorHAnsi" w:hAnsiTheme="majorHAnsi"/>
+                <w:sz w:val="18"/>
+              </w:rPr>
+            </w:pPr>
+            <w:r>
               <w:t xml:space="preserve">{licenseActivities}</w:t>
             </w:r>
           </w:p>
@@ -1548,11 +1606,23 @@
             <w:tcW w:w="5677" w:type="dxa"/>
           </w:tcPr>
           <w:p>
-            <w:r>
-              <w:rPr>
-                <w:rFonts w:ascii="Times New Roman" w:hAnsi="Times New Roman" w:cs="Times New Roman"/>
-                <w:sz w:val="18"/>
-                <w:szCs w:val="18"/>
+            <w:pPr>
+              <w:pStyle w:val="TableParagraph"/>
+              <w:tabs>
+                <w:tab w:val="left" w:pos="4033"/>
+              </w:tabs>
+              <w:spacing w:line="242" w:lineRule="auto"/>
+              <w:ind w:left="108" w:right="92"/>
+              <w:jc w:val="both"/>
+              <w:rPr>
+                <w:rFonts w:asciiTheme="majorHAnsi" w:hAnsiTheme="majorHAnsi"/>
+                <w:sz w:val="18"/>
+              </w:rPr>
+            </w:pPr>
+            <w:r>
+              <w:rPr>
+                <w:rFonts w:asciiTheme="majorHAnsi" w:hAnsiTheme="majorHAnsi"/>
+                <w:sz w:val="18"/>
               </w:rPr>
               <w:t xml:space="preserve">{relatedIndustry}</w:t>
             </w:r>
@@ -1736,11 +1806,25 @@
             <w:tcW w:w="5677" w:type="dxa"/>
           </w:tcPr>
           <w:p>
-            <w:r>
-              <w:rPr>
-                <w:rFonts w:ascii="Times New Roman" w:hAnsi="Times New Roman" w:cs="Times New Roman"/>
-                <w:sz w:val="18"/>
-                <w:szCs w:val="18"/>
+            <w:pPr>
+              <w:pStyle w:val="TableParagraph"/>
+              <w:numPr>
+                <w:ilvl w:val="0"/>
+                <w:numId w:val="6"/>
+              </w:numPr>
+              <w:tabs>
+                <w:tab w:val="left" w:pos="331"/>
+              </w:tabs>
+              <w:ind w:left="331" w:hanging="223"/>
+              <w:rPr>
+                <w:rFonts w:asciiTheme="majorHAnsi" w:hAnsiTheme="majorHAnsi"/>
+                <w:sz w:val="18"/>
+              </w:rPr>
+            </w:pPr>
+            <w:r>
+              <w:rPr>
+                <w:rFonts w:asciiTheme="majorHAnsi" w:hAnsiTheme="majorHAnsi"/>
+                <w:sz w:val="18"/>
               </w:rPr>
               <w:t xml:space="preserve">{prospectiveService}</w:t>
             </w:r>
@@ -2145,12 +2229,16 @@
             </w:tcBorders>
           </w:tcPr>
           <w:p>
-            <w:r>
-              <w:rPr>
-                <w:rFonts w:ascii="Times New Roman" w:hAnsi="Times New Roman" w:cs="Times New Roman"/>
-                <w:sz w:val="18"/>
-                <w:szCs w:val="18"/>
-              </w:rPr>
+            <w:pPr>
+              <w:pStyle w:val="TableParagraph"/>
+              <w:spacing w:before="1" w:line="216" w:lineRule="exact"/>
+              <w:ind w:left="4"/>
+              <w:rPr>
+                <w:rFonts w:asciiTheme="majorHAnsi" w:hAnsiTheme="majorHAnsi"/>
+                <w:sz w:val="18"/>
+              </w:rPr>
+            </w:pPr>
+            <w:r>
               <w:t xml:space="preserve">{#shareholders}{shareholderNo}</w:t>
             </w:r>
           </w:p>
@@ -2163,12 +2251,16 @@
             </w:tcBorders>
           </w:tcPr>
           <w:p>
-            <w:r>
-              <w:rPr>
-                <w:rFonts w:ascii="Times New Roman" w:hAnsi="Times New Roman" w:cs="Times New Roman"/>
-                <w:sz w:val="18"/>
-                <w:szCs w:val="18"/>
-              </w:rPr>
+            <w:pPr>
+              <w:pStyle w:val="TableParagraph"/>
+              <w:spacing w:before="1" w:line="216" w:lineRule="exact"/>
+              <w:ind w:left="5"/>
+              <w:rPr>
+                <w:rFonts w:asciiTheme="majorHAnsi" w:hAnsiTheme="majorHAnsi"/>
+                <w:sz w:val="18"/>
+              </w:rPr>
+            </w:pPr>
+            <w:r>
               <w:t xml:space="preserve">{shareholderFullName}</w:t>
             </w:r>
           </w:p>
@@ -2181,12 +2273,16 @@
             </w:tcBorders>
           </w:tcPr>
           <w:p>
-            <w:r>
-              <w:rPr>
-                <w:rFonts w:ascii="Times New Roman" w:hAnsi="Times New Roman" w:cs="Times New Roman"/>
-                <w:sz w:val="18"/>
-                <w:szCs w:val="18"/>
-              </w:rPr>
+            <w:pPr>
+              <w:pStyle w:val="TableParagraph"/>
+              <w:spacing w:before="1" w:line="216" w:lineRule="exact"/>
+              <w:ind w:left="4"/>
+              <w:rPr>
+                <w:rFonts w:asciiTheme="majorHAnsi" w:hAnsiTheme="majorHAnsi"/>
+                <w:sz w:val="18"/>
+              </w:rPr>
+            </w:pPr>
+            <w:r>
               <w:t xml:space="preserve">{shareholderNationality}</w:t>
             </w:r>
           </w:p>
@@ -2199,12 +2295,16 @@
             </w:tcBorders>
           </w:tcPr>
           <w:p>
-            <w:r>
-              <w:rPr>
-                <w:rFonts w:ascii="Times New Roman" w:hAnsi="Times New Roman" w:cs="Times New Roman"/>
-                <w:sz w:val="18"/>
-                <w:szCs w:val="18"/>
-              </w:rPr>
+            <w:pPr>
+              <w:pStyle w:val="TableParagraph"/>
+              <w:spacing w:before="1" w:line="216" w:lineRule="exact"/>
+              <w:ind w:left="4"/>
+              <w:rPr>
+                <w:rFonts w:asciiTheme="majorHAnsi" w:hAnsiTheme="majorHAnsi"/>
+                <w:sz w:val="18"/>
+              </w:rPr>
+            </w:pPr>
+            <w:r>
               <w:t xml:space="preserve">{shareholderDateOfBirth}</w:t>
             </w:r>
           </w:p>
@@ -2217,12 +2317,16 @@
             </w:tcBorders>
           </w:tcPr>
           <w:p>
-            <w:r>
-              <w:rPr>
-                <w:rFonts w:ascii="Times New Roman" w:hAnsi="Times New Roman" w:cs="Times New Roman"/>
-                <w:sz w:val="18"/>
-                <w:szCs w:val="18"/>
-              </w:rPr>
+            <w:pPr>
+              <w:pStyle w:val="TableParagraph"/>
+              <w:spacing w:before="1" w:line="216" w:lineRule="exact"/>
+              <w:ind w:left="4"/>
+              <w:rPr>
+                <w:rFonts w:asciiTheme="majorHAnsi" w:hAnsiTheme="majorHAnsi"/>
+                <w:sz w:val="18"/>
+              </w:rPr>
+            </w:pPr>
+            <w:r>
               <w:t xml:space="preserve">{shareholderIdentityNumber}</w:t>
             </w:r>
           </w:p>
@@ -2235,12 +2339,16 @@
             </w:tcBorders>
           </w:tcPr>
           <w:p>
-            <w:r>
-              <w:rPr>
-                <w:rFonts w:ascii="Times New Roman" w:hAnsi="Times New Roman" w:cs="Times New Roman"/>
-                <w:sz w:val="18"/>
-                <w:szCs w:val="18"/>
-              </w:rPr>
+            <w:pPr>
+              <w:pStyle w:val="TableParagraph"/>
+              <w:spacing w:before="1" w:line="216" w:lineRule="exact"/>
+              <w:ind w:left="3"/>
+              <w:rPr>
+                <w:rFonts w:asciiTheme="majorHAnsi" w:hAnsiTheme="majorHAnsi"/>
+                <w:sz w:val="18"/>
+              </w:rPr>
+            </w:pPr>
+            <w:r>
               <w:t xml:space="preserve">{shareholderOwnershipPercentage}</w:t>
             </w:r>
           </w:p>
@@ -2253,12 +2361,16 @@
             </w:tcBorders>
           </w:tcPr>
           <w:p>
-            <w:r>
-              <w:rPr>
-                <w:rFonts w:ascii="Times New Roman" w:hAnsi="Times New Roman" w:cs="Times New Roman"/>
-                <w:sz w:val="18"/>
-                <w:szCs w:val="18"/>
-              </w:rPr>
+            <w:pPr>
+              <w:pStyle w:val="TableParagraph"/>
+              <w:spacing w:before="1" w:line="216" w:lineRule="exact"/>
+              <w:ind w:left="3"/>
+              <w:rPr>
+                <w:rFonts w:asciiTheme="majorHAnsi" w:hAnsiTheme="majorHAnsi"/>
+                <w:sz w:val="18"/>
+              </w:rPr>
+            </w:pPr>
+            <w:r>
               <w:t xml:space="preserve">{shareholderResidenceAddress}{/shareholders}</w:t>
             </w:r>
           </w:p>
@@ -2393,6 +2505,9 @@
                 <w:sz w:val="18"/>
               </w:rPr>
             </w:pPr>
+            <w:r>
+              <w:t xml:space="preserve">{totalOwnershipPercentage}</w:t>
+            </w:r>
           </w:p>
         </w:tc>
         <w:tc>
@@ -2400,14 +2515,13 @@
             <w:tcW w:w="1419" w:type="dxa"/>
           </w:tcPr>
           <w:p>
-            <w:r>
-              <w:rPr>
-                <w:rFonts w:ascii="Times New Roman" w:hAnsi="Times New Roman" w:cs="Times New Roman"/>
-                <w:sz w:val="18"/>
-                <w:szCs w:val="18"/>
-              </w:rPr>
-              <w:t xml:space="preserve">{totalOwnershipPercentage}</w:t>
-            </w:r>
+            <w:pPr>
+              <w:pStyle w:val="TableParagraph"/>
+              <w:rPr>
+                <w:rFonts w:asciiTheme="majorHAnsi" w:hAnsiTheme="majorHAnsi"/>
+                <w:sz w:val="14"/>
+              </w:rPr>
+            </w:pPr>
           </w:p>
         </w:tc>
       </w:tr>
@@ -2727,31 +2841,54 @@
       </w:pPr>
     </w:p>
     <w:p>
-      <w:r>
-        <w:rPr>
-          <w:rFonts w:ascii="Times New Roman" w:hAnsi="Times New Roman" w:cs="Times New Roman"/>
-          <w:sz w:val="18"/>
-          <w:szCs w:val="18"/>
+      <w:pPr>
+        <w:pStyle w:val="BodyText"/>
+        <w:tabs>
+          <w:tab w:val="left" w:pos="1077"/>
+          <w:tab w:val="left" w:pos="1533"/>
+        </w:tabs>
+        <w:spacing w:before="7"/>
+        <w:ind w:left="165"/>
+        <w:rPr>
+          <w:rFonts w:asciiTheme="majorHAnsi" w:hAnsiTheme="majorHAnsi"/>
+        </w:rPr>
+      </w:pPr>
+      <w:r>
+        <w:rPr>
+          <w:rFonts w:asciiTheme="majorHAnsi" w:hAnsiTheme="majorHAnsi"/>
+          <w:spacing w:val="-5"/>
         </w:rPr>
         <w:t xml:space="preserve">Yes {uboDifferentYes}    No {uboDifferentNo}</w:t>
       </w:r>
     </w:p>
     <w:p>
-      <w:r>
-        <w:rPr>
-          <w:rFonts w:ascii="Times New Roman" w:hAnsi="Times New Roman" w:cs="Times New Roman"/>
-          <w:sz w:val="18"/>
-          <w:szCs w:val="18"/>
+      <w:pPr>
+        <w:pStyle w:val="BodyText"/>
+        <w:spacing w:before="176" w:line="434" w:lineRule="auto"/>
+        <w:ind w:left="165" w:right="4730"/>
+        <w:rPr>
+          <w:rFonts w:asciiTheme="majorHAnsi" w:hAnsiTheme="majorHAnsi"/>
+        </w:rPr>
+      </w:pPr>
+      <w:r>
+        <w:rPr>
+          <w:rFonts w:asciiTheme="majorHAnsi" w:hAnsiTheme="majorHAnsi"/>
         </w:rPr>
         <w:t xml:space="preserve">If yes, please provide UBOs/Group structure and details. UBOs/ Group structure: {uboGroupStructureNotes}</w:t>
       </w:r>
     </w:p>
     <w:p>
-      <w:r>
-        <w:rPr>
-          <w:rFonts w:ascii="Times New Roman" w:hAnsi="Times New Roman" w:cs="Times New Roman"/>
-          <w:sz w:val="18"/>
-          <w:szCs w:val="18"/>
+      <w:pPr>
+        <w:pStyle w:val="BodyText"/>
+        <w:spacing w:before="176" w:line="434" w:lineRule="auto"/>
+        <w:ind w:left="165" w:right="4730"/>
+        <w:rPr>
+          <w:rFonts w:asciiTheme="majorHAnsi" w:hAnsiTheme="majorHAnsi"/>
+        </w:rPr>
+      </w:pPr>
+      <w:r>
+        <w:rPr>
+          <w:rFonts w:asciiTheme="majorHAnsi" w:hAnsiTheme="majorHAnsi"/>
         </w:rPr>
         <w:t xml:space="preserve">Auto-generated ownership structure:</w:t>
         <w:br/>
@@ -3215,12 +3352,16 @@
             </w:tcBorders>
           </w:tcPr>
           <w:p>
-            <w:r>
-              <w:rPr>
-                <w:rFonts w:ascii="Times New Roman" w:hAnsi="Times New Roman" w:cs="Times New Roman"/>
-                <w:sz w:val="18"/>
-                <w:szCs w:val="18"/>
-              </w:rPr>
+            <w:pPr>
+              <w:pStyle w:val="TableParagraph"/>
+              <w:spacing w:before="1" w:line="216" w:lineRule="exact"/>
+              <w:ind w:left="4"/>
+              <w:rPr>
+                <w:rFonts w:asciiTheme="majorHAnsi" w:hAnsiTheme="majorHAnsi"/>
+                <w:sz w:val="18"/>
+              </w:rPr>
+            </w:pPr>
+            <w:r>
               <w:t xml:space="preserve">{#ubos}{uboNo}</w:t>
             </w:r>
           </w:p>
@@ -3233,12 +3374,16 @@
             </w:tcBorders>
           </w:tcPr>
           <w:p>
-            <w:r>
-              <w:rPr>
-                <w:rFonts w:ascii="Times New Roman" w:hAnsi="Times New Roman" w:cs="Times New Roman"/>
-                <w:sz w:val="18"/>
-                <w:szCs w:val="18"/>
-              </w:rPr>
+            <w:pPr>
+              <w:pStyle w:val="TableParagraph"/>
+              <w:spacing w:before="1" w:line="216" w:lineRule="exact"/>
+              <w:ind w:left="5"/>
+              <w:rPr>
+                <w:rFonts w:asciiTheme="majorHAnsi" w:hAnsiTheme="majorHAnsi"/>
+                <w:sz w:val="18"/>
+              </w:rPr>
+            </w:pPr>
+            <w:r>
               <w:t xml:space="preserve">{uboFullName}</w:t>
             </w:r>
           </w:p>
@@ -3251,12 +3396,16 @@
             </w:tcBorders>
           </w:tcPr>
           <w:p>
-            <w:r>
-              <w:rPr>
-                <w:rFonts w:ascii="Times New Roman" w:hAnsi="Times New Roman" w:cs="Times New Roman"/>
-                <w:sz w:val="18"/>
-                <w:szCs w:val="18"/>
-              </w:rPr>
+            <w:pPr>
+              <w:pStyle w:val="TableParagraph"/>
+              <w:spacing w:before="1" w:line="216" w:lineRule="exact"/>
+              <w:ind w:left="4"/>
+              <w:rPr>
+                <w:rFonts w:asciiTheme="majorHAnsi" w:hAnsiTheme="majorHAnsi"/>
+                <w:sz w:val="18"/>
+              </w:rPr>
+            </w:pPr>
+            <w:r>
               <w:t xml:space="preserve">{uboNationality}</w:t>
             </w:r>
           </w:p>
@@ -3269,12 +3418,16 @@
             </w:tcBorders>
           </w:tcPr>
           <w:p>
-            <w:r>
-              <w:rPr>
-                <w:rFonts w:ascii="Times New Roman" w:hAnsi="Times New Roman" w:cs="Times New Roman"/>
-                <w:sz w:val="18"/>
-                <w:szCs w:val="18"/>
-              </w:rPr>
+            <w:pPr>
+              <w:pStyle w:val="TableParagraph"/>
+              <w:spacing w:before="1" w:line="216" w:lineRule="exact"/>
+              <w:ind w:left="4"/>
+              <w:rPr>
+                <w:rFonts w:asciiTheme="majorHAnsi" w:hAnsiTheme="majorHAnsi"/>
+                <w:sz w:val="18"/>
+              </w:rPr>
+            </w:pPr>
+            <w:r>
               <w:t xml:space="preserve">{uboDateOfBirth}</w:t>
             </w:r>
           </w:p>
@@ -3287,12 +3440,16 @@
             </w:tcBorders>
           </w:tcPr>
           <w:p>
-            <w:r>
-              <w:rPr>
-                <w:rFonts w:ascii="Times New Roman" w:hAnsi="Times New Roman" w:cs="Times New Roman"/>
-                <w:sz w:val="18"/>
-                <w:szCs w:val="18"/>
-              </w:rPr>
+            <w:pPr>
+              <w:pStyle w:val="TableParagraph"/>
+              <w:spacing w:before="1" w:line="216" w:lineRule="exact"/>
+              <w:ind w:left="4"/>
+              <w:rPr>
+                <w:rFonts w:asciiTheme="majorHAnsi" w:hAnsiTheme="majorHAnsi"/>
+                <w:sz w:val="18"/>
+              </w:rPr>
+            </w:pPr>
+            <w:r>
               <w:t xml:space="preserve">{uboIdentityNumber}</w:t>
             </w:r>
           </w:p>
@@ -3305,12 +3462,16 @@
             </w:tcBorders>
           </w:tcPr>
           <w:p>
-            <w:r>
-              <w:rPr>
-                <w:rFonts w:ascii="Times New Roman" w:hAnsi="Times New Roman" w:cs="Times New Roman"/>
-                <w:sz w:val="18"/>
-                <w:szCs w:val="18"/>
-              </w:rPr>
+            <w:pPr>
+              <w:pStyle w:val="TableParagraph"/>
+              <w:spacing w:before="1" w:line="216" w:lineRule="exact"/>
+              <w:ind w:left="3"/>
+              <w:rPr>
+                <w:rFonts w:asciiTheme="majorHAnsi" w:hAnsiTheme="majorHAnsi"/>
+                <w:sz w:val="18"/>
+              </w:rPr>
+            </w:pPr>
+            <w:r>
               <w:t xml:space="preserve">{uboOwnershipPercentage}</w:t>
             </w:r>
           </w:p>
@@ -3323,12 +3484,16 @@
             </w:tcBorders>
           </w:tcPr>
           <w:p>
-            <w:r>
-              <w:rPr>
-                <w:rFonts w:ascii="Times New Roman" w:hAnsi="Times New Roman" w:cs="Times New Roman"/>
-                <w:sz w:val="18"/>
-                <w:szCs w:val="18"/>
-              </w:rPr>
+            <w:pPr>
+              <w:pStyle w:val="TableParagraph"/>
+              <w:spacing w:before="1" w:line="216" w:lineRule="exact"/>
+              <w:ind w:left="3"/>
+              <w:rPr>
+                <w:rFonts w:asciiTheme="majorHAnsi" w:hAnsiTheme="majorHAnsi"/>
+                <w:sz w:val="18"/>
+              </w:rPr>
+            </w:pPr>
+            <w:r>
               <w:t xml:space="preserve">{uboResidenceAddress}{/ubos}</w:t>
             </w:r>
           </w:p>
@@ -3463,6 +3628,9 @@
                 <w:sz w:val="18"/>
               </w:rPr>
             </w:pPr>
+            <w:r>
+              <w:t xml:space="preserve">{totalUboPercentage}</w:t>
+            </w:r>
           </w:p>
         </w:tc>
         <w:tc>
@@ -3470,14 +3638,13 @@
             <w:tcW w:w="1419" w:type="dxa"/>
           </w:tcPr>
           <w:p>
-            <w:r>
-              <w:rPr>
-                <w:rFonts w:ascii="Times New Roman" w:hAnsi="Times New Roman" w:cs="Times New Roman"/>
-                <w:sz w:val="18"/>
-                <w:szCs w:val="18"/>
-              </w:rPr>
-              <w:t xml:space="preserve">{totalUboPercentage}</w:t>
-            </w:r>
+            <w:pPr>
+              <w:pStyle w:val="TableParagraph"/>
+              <w:rPr>
+                <w:rFonts w:asciiTheme="majorHAnsi" w:hAnsiTheme="majorHAnsi"/>
+                <w:sz w:val="14"/>
+              </w:rPr>
+            </w:pPr>
           </w:p>
         </w:tc>
       </w:tr>
@@ -4102,11 +4269,19 @@
             <w:tcW w:w="450" w:type="dxa"/>
           </w:tcPr>
           <w:p>
-            <w:r>
-              <w:rPr>
-                <w:rFonts w:ascii="Times New Roman" w:hAnsi="Times New Roman" w:cs="Times New Roman"/>
-                <w:sz w:val="18"/>
-                <w:szCs w:val="18"/>
+            <w:pPr>
+              <w:jc w:val="center"/>
+              <w:rPr>
+                <w:rFonts w:asciiTheme="majorHAnsi" w:hAnsiTheme="majorHAnsi"/>
+                <w:sz w:val="18"/>
+                <w:szCs w:val="20"/>
+              </w:rPr>
+            </w:pPr>
+            <w:r>
+              <w:rPr>
+                <w:rFonts w:asciiTheme="majorHAnsi" w:hAnsiTheme="majorHAnsi"/>
+                <w:sz w:val="18"/>
+                <w:szCs w:val="20"/>
               </w:rPr>
               <w:t xml:space="preserve">{#managers}{managerNo}</w:t>
             </w:r>
@@ -4117,12 +4292,14 @@
             <w:tcW w:w="1115" w:type="dxa"/>
           </w:tcPr>
           <w:p>
-            <w:r>
-              <w:rPr>
-                <w:rFonts w:ascii="Times New Roman" w:hAnsi="Times New Roman" w:cs="Times New Roman"/>
-                <w:sz w:val="18"/>
-                <w:szCs w:val="18"/>
-              </w:rPr>
+            <w:pPr>
+              <w:rPr>
+                <w:rFonts w:asciiTheme="majorHAnsi" w:hAnsiTheme="majorHAnsi"/>
+                <w:sz w:val="18"/>
+                <w:szCs w:val="20"/>
+              </w:rPr>
+            </w:pPr>
+            <w:r>
               <w:t xml:space="preserve">{managerFullName}</w:t>
             </w:r>
           </w:p>
@@ -4132,12 +4309,14 @@
             <w:tcW w:w="950" w:type="dxa"/>
           </w:tcPr>
           <w:p>
-            <w:r>
-              <w:rPr>
-                <w:rFonts w:ascii="Times New Roman" w:hAnsi="Times New Roman" w:cs="Times New Roman"/>
-                <w:sz w:val="18"/>
-                <w:szCs w:val="18"/>
-              </w:rPr>
+            <w:pPr>
+              <w:rPr>
+                <w:rFonts w:asciiTheme="majorHAnsi" w:hAnsiTheme="majorHAnsi"/>
+                <w:sz w:val="18"/>
+                <w:szCs w:val="20"/>
+              </w:rPr>
+            </w:pPr>
+            <w:r>
               <w:t xml:space="preserve">{managerPosition}</w:t>
             </w:r>
           </w:p>
@@ -4147,12 +4326,14 @@
             <w:tcW w:w="918" w:type="dxa"/>
           </w:tcPr>
           <w:p>
-            <w:r>
-              <w:rPr>
-                <w:rFonts w:ascii="Times New Roman" w:hAnsi="Times New Roman" w:cs="Times New Roman"/>
-                <w:sz w:val="18"/>
-                <w:szCs w:val="18"/>
-              </w:rPr>
+            <w:pPr>
+              <w:rPr>
+                <w:rFonts w:asciiTheme="majorHAnsi" w:hAnsiTheme="majorHAnsi"/>
+                <w:sz w:val="18"/>
+                <w:szCs w:val="20"/>
+              </w:rPr>
+            </w:pPr>
+            <w:r>
               <w:t xml:space="preserve">{managerEntityName}</w:t>
             </w:r>
           </w:p>
@@ -4162,12 +4343,14 @@
             <w:tcW w:w="1138" w:type="dxa"/>
           </w:tcPr>
           <w:p>
-            <w:r>
-              <w:rPr>
-                <w:rFonts w:ascii="Times New Roman" w:hAnsi="Times New Roman" w:cs="Times New Roman"/>
-                <w:sz w:val="18"/>
-                <w:szCs w:val="18"/>
-              </w:rPr>
+            <w:pPr>
+              <w:rPr>
+                <w:rFonts w:asciiTheme="majorHAnsi" w:hAnsiTheme="majorHAnsi"/>
+                <w:sz w:val="18"/>
+                <w:szCs w:val="20"/>
+              </w:rPr>
+            </w:pPr>
+            <w:r>
               <w:t xml:space="preserve">{managerNationality}</w:t>
             </w:r>
           </w:p>
@@ -4177,12 +4360,14 @@
             <w:tcW w:w="948" w:type="dxa"/>
           </w:tcPr>
           <w:p>
-            <w:r>
-              <w:rPr>
-                <w:rFonts w:ascii="Times New Roman" w:hAnsi="Times New Roman" w:cs="Times New Roman"/>
-                <w:sz w:val="18"/>
-                <w:szCs w:val="18"/>
-              </w:rPr>
+            <w:pPr>
+              <w:rPr>
+                <w:rFonts w:asciiTheme="majorHAnsi" w:hAnsiTheme="majorHAnsi"/>
+                <w:sz w:val="18"/>
+                <w:szCs w:val="20"/>
+              </w:rPr>
+            </w:pPr>
+            <w:r>
               <w:t xml:space="preserve">{managerAddress}</w:t>
             </w:r>
           </w:p>
@@ -4192,12 +4377,14 @@
             <w:tcW w:w="1084" w:type="dxa"/>
           </w:tcPr>
           <w:p>
-            <w:r>
-              <w:rPr>
-                <w:rFonts w:ascii="Times New Roman" w:hAnsi="Times New Roman" w:cs="Times New Roman"/>
-                <w:sz w:val="18"/>
-                <w:szCs w:val="18"/>
-              </w:rPr>
+            <w:pPr>
+              <w:rPr>
+                <w:rFonts w:asciiTheme="majorHAnsi" w:hAnsiTheme="majorHAnsi"/>
+                <w:sz w:val="18"/>
+                <w:szCs w:val="20"/>
+              </w:rPr>
+            </w:pPr>
+            <w:r>
               <w:t xml:space="preserve">{managerDateOfBirth}</w:t>
             </w:r>
           </w:p>
@@ -4207,12 +4394,14 @@
             <w:tcW w:w="1353" w:type="dxa"/>
           </w:tcPr>
           <w:p>
-            <w:r>
-              <w:rPr>
-                <w:rFonts w:ascii="Times New Roman" w:hAnsi="Times New Roman" w:cs="Times New Roman"/>
-                <w:sz w:val="18"/>
-                <w:szCs w:val="18"/>
-              </w:rPr>
+            <w:pPr>
+              <w:rPr>
+                <w:rFonts w:asciiTheme="majorHAnsi" w:hAnsiTheme="majorHAnsi"/>
+                <w:sz w:val="18"/>
+                <w:szCs w:val="20"/>
+              </w:rPr>
+            </w:pPr>
+            <w:r>
               <w:t xml:space="preserve">{managerIdentityNumber}</w:t>
             </w:r>
           </w:p>
@@ -4222,12 +4411,14 @@
             <w:tcW w:w="1146" w:type="dxa"/>
           </w:tcPr>
           <w:p>
-            <w:r>
-              <w:rPr>
-                <w:rFonts w:ascii="Times New Roman" w:hAnsi="Times New Roman" w:cs="Times New Roman"/>
-                <w:sz w:val="18"/>
-                <w:szCs w:val="18"/>
-              </w:rPr>
+            <w:pPr>
+              <w:rPr>
+                <w:rFonts w:asciiTheme="majorHAnsi" w:hAnsiTheme="majorHAnsi"/>
+                <w:sz w:val="18"/>
+                <w:szCs w:val="20"/>
+              </w:rPr>
+            </w:pPr>
+            <w:r>
               <w:t xml:space="preserve">{managerAuthorizedSignatory}{/managers}</w:t>
             </w:r>
           </w:p>
@@ -4342,11 +4533,25 @@
       </w:r>
     </w:p>
     <w:p>
-      <w:r>
-        <w:rPr>
-          <w:rFonts w:ascii="Times New Roman" w:hAnsi="Times New Roman" w:cs="Times New Roman"/>
+      <w:pPr>
+        <w:pStyle w:val="ListParagraph"/>
+        <w:numPr>
+          <w:ilvl w:val="0"/>
+          <w:numId w:val="5"/>
+        </w:numPr>
+        <w:tabs>
+          <w:tab w:val="left" w:pos="525"/>
+        </w:tabs>
+        <w:spacing w:before="179"/>
+        <w:rPr>
+          <w:rFonts w:asciiTheme="majorHAnsi" w:hAnsiTheme="majorHAnsi"/>
           <w:sz w:val="18"/>
-          <w:szCs w:val="18"/>
+        </w:rPr>
+      </w:pPr>
+      <w:r>
+        <w:rPr>
+          <w:rFonts w:asciiTheme="majorHAnsi" w:hAnsiTheme="majorHAnsi"/>
+          <w:sz w:val="18"/>
         </w:rPr>
         <w:t xml:space="preserve">1. Are any of the following people considered as Politically Exposed Persons (PEPs):</w:t>
       </w:r>
@@ -4669,21 +4874,39 @@
       </w:r>
     </w:p>
     <w:p>
-      <w:r>
-        <w:rPr>
-          <w:rFonts w:ascii="Times New Roman" w:hAnsi="Times New Roman" w:cs="Times New Roman"/>
-          <w:sz w:val="18"/>
-          <w:szCs w:val="18"/>
-        </w:rPr>
-        <w:t xml:space="preserve">Yes, if yes, please provide full details: {pepQuestion}</w:t>
-      </w:r>
-    </w:p>
-    <w:p>
-      <w:r>
-        <w:rPr>
-          <w:rFonts w:ascii="Times New Roman" w:hAnsi="Times New Roman" w:cs="Times New Roman"/>
-          <w:sz w:val="18"/>
-          <w:szCs w:val="18"/>
+      <w:pPr>
+        <w:pStyle w:val="BodyText"/>
+        <w:numPr>
+          <w:ilvl w:val="0"/>
+          <w:numId w:val="7"/>
+        </w:numPr>
+        <w:spacing w:before="182"/>
+        <w:rPr>
+          <w:rFonts w:asciiTheme="majorHAnsi" w:hAnsiTheme="majorHAnsi"/>
+        </w:rPr>
+      </w:pPr>
+      <w:r>
+        <w:rPr>
+          <w:rFonts w:asciiTheme="majorHAnsi" w:hAnsiTheme="majorHAnsi"/>
+        </w:rPr>
+        <w:t xml:space="preserve">Yes {pepQuestion}    No {pepNo}</w:t>
+      </w:r>
+    </w:p>
+    <w:p>
+      <w:pPr>
+        <w:pStyle w:val="BodyText"/>
+        <w:numPr>
+          <w:ilvl w:val="0"/>
+          <w:numId w:val="7"/>
+        </w:numPr>
+        <w:spacing w:before="182"/>
+        <w:rPr>
+          <w:rFonts w:asciiTheme="majorHAnsi" w:hAnsiTheme="majorHAnsi"/>
+        </w:rPr>
+      </w:pPr>
+      <w:r>
+        <w:rPr>
+          <w:rFonts w:asciiTheme="majorHAnsi" w:hAnsiTheme="majorHAnsi"/>
         </w:rPr>
         <w:t xml:space="preserve">{pepDetails}</w:t>
       </w:r>
@@ -4692,13 +4915,14 @@
       <w:pPr>
         <w:pStyle w:val="ListParagraph"/>
         <w:numPr>
-          <w:ilvl w:val="2"/>
+          <w:ilvl w:val="0"/>
           <w:numId w:val="5"/>
         </w:numPr>
         <w:tabs>
-          <w:tab w:val="left" w:pos="1105"/>
+          <w:tab w:val="left" w:pos="523"/>
         </w:tabs>
-        <w:ind w:left="1105" w:hanging="220"/>
+        <w:spacing w:before="181" w:line="256" w:lineRule="auto"/>
+        <w:ind w:left="523" w:right="161" w:hanging="358"/>
         <w:rPr>
           <w:rFonts w:asciiTheme="majorHAnsi" w:hAnsiTheme="majorHAnsi"/>
           <w:sz w:val="18"/>
@@ -4707,18 +4931,7 @@
       <w:r>
         <w:rPr>
           <w:rFonts w:asciiTheme="majorHAnsi" w:hAnsiTheme="majorHAnsi"/>
-          <w:spacing w:val="-5"/>
           <w:sz w:val="18"/>
-        </w:rPr>
-        <w:t>No</w:t>
-      </w:r>
-    </w:p>
-    <w:p>
-      <w:r>
-        <w:rPr>
-          <w:rFonts w:ascii="Times New Roman" w:hAnsi="Times New Roman" w:cs="Times New Roman"/>
-          <w:sz w:val="18"/>
-          <w:szCs w:val="18"/>
         </w:rPr>
         <w:t xml:space="preserve">2. Has any of the individuals or entities referred above have ever been sanctioned by any government or regulatory body including but not limited to the NCTC, United Nations, U.S.A., E.U, U.K, Qatar and FATF member countries?</w:t>
       </w:r>
@@ -4733,21 +4946,49 @@
       </w:pPr>
     </w:p>
     <w:p>
-      <w:r>
-        <w:rPr>
-          <w:rFonts w:ascii="Times New Roman" w:hAnsi="Times New Roman" w:cs="Times New Roman"/>
+      <w:pPr>
+        <w:pStyle w:val="ListParagraph"/>
+        <w:numPr>
+          <w:ilvl w:val="0"/>
+          <w:numId w:val="4"/>
+        </w:numPr>
+        <w:tabs>
+          <w:tab w:val="left" w:pos="1081"/>
+        </w:tabs>
+        <w:ind w:left="1081" w:hanging="196"/>
+        <w:rPr>
+          <w:rFonts w:asciiTheme="majorHAnsi" w:hAnsiTheme="majorHAnsi"/>
           <w:sz w:val="18"/>
-          <w:szCs w:val="18"/>
-        </w:rPr>
-        <w:t xml:space="preserve">Yes, if yes, please provide full details of any sanctions applied and the current state of such sanctions: {sanctionQuestion}</w:t>
-      </w:r>
-    </w:p>
-    <w:p>
-      <w:r>
-        <w:rPr>
-          <w:rFonts w:ascii="Times New Roman" w:hAnsi="Times New Roman" w:cs="Times New Roman"/>
+        </w:rPr>
+      </w:pPr>
+      <w:r>
+        <w:rPr>
+          <w:rFonts w:asciiTheme="majorHAnsi" w:hAnsiTheme="majorHAnsi"/>
           <w:sz w:val="18"/>
-          <w:szCs w:val="18"/>
+        </w:rPr>
+        <w:t xml:space="preserve">Yes {sanctionQuestion}    No {sanctionNo}</w:t>
+      </w:r>
+    </w:p>
+    <w:p>
+      <w:pPr>
+        <w:pStyle w:val="ListParagraph"/>
+        <w:numPr>
+          <w:ilvl w:val="0"/>
+          <w:numId w:val="4"/>
+        </w:numPr>
+        <w:tabs>
+          <w:tab w:val="left" w:pos="1081"/>
+        </w:tabs>
+        <w:ind w:left="1081" w:hanging="196"/>
+        <w:rPr>
+          <w:rFonts w:asciiTheme="majorHAnsi" w:hAnsiTheme="majorHAnsi"/>
+          <w:sz w:val="18"/>
+        </w:rPr>
+      </w:pPr>
+      <w:r>
+        <w:rPr>
+          <w:rFonts w:asciiTheme="majorHAnsi" w:hAnsiTheme="majorHAnsi"/>
+          <w:sz w:val="18"/>
         </w:rPr>
         <w:t xml:space="preserve">{sanctionDetails}</w:t>
       </w:r>
@@ -4889,57 +5130,82 @@
     <w:p>
       <w:pPr>
         <w:pStyle w:val="BodyText"/>
+        <w:spacing w:before="139"/>
+        <w:rPr>
+          <w:rFonts w:asciiTheme="majorHAnsi" w:hAnsiTheme="majorHAnsi"/>
+        </w:rPr>
+      </w:pPr>
+    </w:p>
+    <w:p>
+      <w:pPr>
+        <w:pStyle w:val="ListParagraph"/>
         <w:numPr>
           <w:ilvl w:val="0"/>
-          <w:numId w:val="8"/>
+          <w:numId w:val="5"/>
         </w:numPr>
-        <w:rPr>
-          <w:rFonts w:asciiTheme="majorHAnsi" w:hAnsiTheme="majorHAnsi"/>
-        </w:rPr>
-      </w:pPr>
-      <w:r>
-        <w:rPr>
-          <w:rFonts w:asciiTheme="majorHAnsi" w:hAnsiTheme="majorHAnsi"/>
-          <w:spacing w:val="-5"/>
-        </w:rPr>
-        <w:t>No</w:t>
-      </w:r>
-    </w:p>
-    <w:p>
-      <w:pPr>
-        <w:pStyle w:val="BodyText"/>
-        <w:spacing w:before="139"/>
-        <w:rPr>
-          <w:rFonts w:asciiTheme="majorHAnsi" w:hAnsiTheme="majorHAnsi"/>
-        </w:rPr>
-      </w:pPr>
-    </w:p>
-    <w:p>
-      <w:r>
-        <w:rPr>
-          <w:rFonts w:ascii="Times New Roman" w:hAnsi="Times New Roman" w:cs="Times New Roman"/>
+        <w:tabs>
+          <w:tab w:val="left" w:pos="522"/>
+        </w:tabs>
+        <w:ind w:left="522" w:hanging="357"/>
+        <w:rPr>
+          <w:rFonts w:asciiTheme="majorHAnsi" w:hAnsiTheme="majorHAnsi"/>
           <w:sz w:val="18"/>
-          <w:szCs w:val="18"/>
+        </w:rPr>
+      </w:pPr>
+      <w:r>
+        <w:rPr>
+          <w:rFonts w:asciiTheme="majorHAnsi" w:hAnsiTheme="majorHAnsi"/>
+          <w:sz w:val="18"/>
         </w:rPr>
         <w:t xml:space="preserve">3. Whether the beneficial owners or key management having dual citizenship?</w:t>
       </w:r>
     </w:p>
     <w:p>
-      <w:r>
-        <w:rPr>
-          <w:rFonts w:ascii="Times New Roman" w:hAnsi="Times New Roman" w:cs="Times New Roman"/>
+      <w:pPr>
+        <w:pStyle w:val="ListParagraph"/>
+        <w:numPr>
+          <w:ilvl w:val="0"/>
+          <w:numId w:val="3"/>
+        </w:numPr>
+        <w:tabs>
+          <w:tab w:val="left" w:pos="1081"/>
+        </w:tabs>
+        <w:spacing w:before="17" w:line="242" w:lineRule="exact"/>
+        <w:ind w:left="1081" w:hanging="196"/>
+        <w:rPr>
+          <w:rFonts w:asciiTheme="majorHAnsi" w:hAnsiTheme="majorHAnsi"/>
           <w:sz w:val="18"/>
-          <w:szCs w:val="18"/>
-        </w:rPr>
-        <w:t xml:space="preserve">Yes, if yes, please provide details and passport copy: {dualCitizenshipQuestion}</w:t>
-      </w:r>
-    </w:p>
-    <w:p>
-      <w:r>
-        <w:rPr>
-          <w:rFonts w:ascii="Times New Roman" w:hAnsi="Times New Roman" w:cs="Times New Roman"/>
+        </w:rPr>
+      </w:pPr>
+      <w:r>
+        <w:rPr>
+          <w:rFonts w:asciiTheme="majorHAnsi" w:hAnsiTheme="majorHAnsi"/>
           <w:sz w:val="18"/>
-          <w:szCs w:val="18"/>
+        </w:rPr>
+        <w:t xml:space="preserve">Yes {dualCitizenshipQuestion}    No {dualCitizenshipNo}</w:t>
+      </w:r>
+    </w:p>
+    <w:p>
+      <w:pPr>
+        <w:pStyle w:val="ListParagraph"/>
+        <w:numPr>
+          <w:ilvl w:val="0"/>
+          <w:numId w:val="3"/>
+        </w:numPr>
+        <w:tabs>
+          <w:tab w:val="left" w:pos="1081"/>
+        </w:tabs>
+        <w:spacing w:before="17" w:line="242" w:lineRule="exact"/>
+        <w:ind w:left="1081" w:hanging="196"/>
+        <w:rPr>
+          <w:rFonts w:asciiTheme="majorHAnsi" w:hAnsiTheme="majorHAnsi"/>
+          <w:sz w:val="18"/>
+        </w:rPr>
+      </w:pPr>
+      <w:r>
+        <w:rPr>
+          <w:rFonts w:asciiTheme="majorHAnsi" w:hAnsiTheme="majorHAnsi"/>
+          <w:sz w:val="18"/>
         </w:rPr>
         <w:t xml:space="preserve">{dualCitizenshipDetails}</w:t>
         <w:br/>
@@ -5082,25 +5348,6 @@
     </w:p>
     <w:p>
       <w:pPr>
-        <w:pStyle w:val="BodyText"/>
-        <w:numPr>
-          <w:ilvl w:val="0"/>
-          <w:numId w:val="8"/>
-        </w:numPr>
-        <w:rPr>
-          <w:rFonts w:asciiTheme="majorHAnsi" w:hAnsiTheme="majorHAnsi"/>
-        </w:rPr>
-      </w:pPr>
-      <w:r>
-        <w:rPr>
-          <w:rFonts w:asciiTheme="majorHAnsi" w:hAnsiTheme="majorHAnsi"/>
-          <w:spacing w:val="-5"/>
-        </w:rPr>
-        <w:t>No</w:t>
-      </w:r>
-    </w:p>
-    <w:p>
-      <w:pPr>
         <w:pStyle w:val="ListParagraph"/>
         <w:rPr>
           <w:rFonts w:asciiTheme="majorHAnsi" w:hAnsiTheme="majorHAnsi"/>
@@ -5269,12 +5516,16 @@
             <w:tcW w:w="6487" w:type="dxa"/>
           </w:tcPr>
           <w:p>
-            <w:r>
-              <w:rPr>
-                <w:rFonts w:ascii="Times New Roman" w:hAnsi="Times New Roman" w:cs="Times New Roman"/>
-                <w:sz w:val="18"/>
-                <w:szCs w:val="18"/>
-              </w:rPr>
+            <w:pPr>
+              <w:pStyle w:val="TableParagraph"/>
+              <w:spacing w:before="1" w:line="199" w:lineRule="exact"/>
+              <w:ind w:left="108"/>
+              <w:rPr>
+                <w:rFonts w:asciiTheme="majorHAnsi" w:hAnsiTheme="majorHAnsi"/>
+                <w:sz w:val="18"/>
+              </w:rPr>
+            </w:pPr>
+            <w:r>
               <w:t xml:space="preserve">{communicationFullName}</w:t>
             </w:r>
           </w:p>
@@ -5382,12 +5633,16 @@
             <w:tcW w:w="6487" w:type="dxa"/>
           </w:tcPr>
           <w:p>
-            <w:r>
-              <w:rPr>
-                <w:rFonts w:ascii="Times New Roman" w:hAnsi="Times New Roman" w:cs="Times New Roman"/>
-                <w:sz w:val="18"/>
-                <w:szCs w:val="18"/>
-              </w:rPr>
+            <w:pPr>
+              <w:pStyle w:val="TableParagraph"/>
+              <w:spacing w:before="1" w:line="199" w:lineRule="exact"/>
+              <w:ind w:left="108"/>
+              <w:rPr>
+                <w:rFonts w:asciiTheme="majorHAnsi" w:hAnsiTheme="majorHAnsi"/>
+                <w:sz w:val="18"/>
+              </w:rPr>
+            </w:pPr>
+            <w:r>
               <w:t xml:space="preserve">{communicationPosition}</w:t>
             </w:r>
           </w:p>
@@ -5458,12 +5713,16 @@
             <w:tcW w:w="6487" w:type="dxa"/>
           </w:tcPr>
           <w:p>
-            <w:r>
-              <w:rPr>
-                <w:rFonts w:ascii="Times New Roman" w:hAnsi="Times New Roman" w:cs="Times New Roman"/>
-                <w:sz w:val="18"/>
-                <w:szCs w:val="18"/>
-              </w:rPr>
+            <w:pPr>
+              <w:pStyle w:val="TableParagraph"/>
+              <w:spacing w:line="198" w:lineRule="exact"/>
+              <w:ind w:left="108"/>
+              <w:rPr>
+                <w:rFonts w:asciiTheme="majorHAnsi" w:hAnsiTheme="majorHAnsi"/>
+                <w:sz w:val="18"/>
+              </w:rPr>
+            </w:pPr>
+            <w:r>
               <w:t xml:space="preserve">{communicationNationality}</w:t>
             </w:r>
           </w:p>
@@ -5579,12 +5838,16 @@
             <w:tcW w:w="6487" w:type="dxa"/>
           </w:tcPr>
           <w:p>
-            <w:r>
-              <w:rPr>
-                <w:rFonts w:ascii="Times New Roman" w:hAnsi="Times New Roman" w:cs="Times New Roman"/>
-                <w:sz w:val="18"/>
-                <w:szCs w:val="18"/>
-              </w:rPr>
+            <w:pPr>
+              <w:pStyle w:val="TableParagraph"/>
+              <w:spacing w:before="1" w:line="199" w:lineRule="exact"/>
+              <w:ind w:left="108"/>
+              <w:rPr>
+                <w:rFonts w:asciiTheme="majorHAnsi" w:hAnsiTheme="majorHAnsi"/>
+                <w:sz w:val="18"/>
+              </w:rPr>
+            </w:pPr>
+            <w:r>
               <w:t xml:space="preserve">{communicationIdentityNumber}</w:t>
             </w:r>
           </w:p>
@@ -5670,12 +5933,16 @@
             <w:tcW w:w="6487" w:type="dxa"/>
           </w:tcPr>
           <w:p>
-            <w:r>
-              <w:rPr>
-                <w:rFonts w:ascii="Times New Roman" w:hAnsi="Times New Roman" w:cs="Times New Roman"/>
-                <w:sz w:val="18"/>
-                <w:szCs w:val="18"/>
-              </w:rPr>
+            <w:pPr>
+              <w:pStyle w:val="TableParagraph"/>
+              <w:spacing w:before="1" w:line="199" w:lineRule="exact"/>
+              <w:ind w:left="108"/>
+              <w:rPr>
+                <w:rFonts w:asciiTheme="majorHAnsi" w:hAnsiTheme="majorHAnsi"/>
+                <w:sz w:val="18"/>
+              </w:rPr>
+            </w:pPr>
+            <w:r>
               <w:t xml:space="preserve">{communicationMobile}</w:t>
             </w:r>
           </w:p>
@@ -5753,12 +6020,16 @@
             <w:tcW w:w="6487" w:type="dxa"/>
           </w:tcPr>
           <w:p>
-            <w:r>
-              <w:rPr>
-                <w:rFonts w:ascii="Times New Roman" w:hAnsi="Times New Roman" w:cs="Times New Roman"/>
-                <w:sz w:val="18"/>
-                <w:szCs w:val="18"/>
-              </w:rPr>
+            <w:pPr>
+              <w:pStyle w:val="TableParagraph"/>
+              <w:spacing w:before="1" w:line="199" w:lineRule="exact"/>
+              <w:ind w:left="108"/>
+              <w:rPr>
+                <w:rFonts w:asciiTheme="majorHAnsi" w:hAnsiTheme="majorHAnsi"/>
+                <w:sz w:val="18"/>
+              </w:rPr>
+            </w:pPr>
+            <w:r>
               <w:t xml:space="preserve">{communicationEmail}</w:t>
             </w:r>
           </w:p>
@@ -5893,111 +6164,276 @@
       </w:r>
     </w:p>
     <w:p>
-      <w:r>
-        <w:rPr>
-          <w:rFonts w:ascii="Times New Roman" w:hAnsi="Times New Roman" w:cs="Times New Roman"/>
+      <w:pPr>
+        <w:pStyle w:val="ListParagraph"/>
+        <w:numPr>
+          <w:ilvl w:val="0"/>
+          <w:numId w:val="2"/>
+        </w:numPr>
+        <w:tabs>
+          <w:tab w:val="left" w:pos="385"/>
+        </w:tabs>
+        <w:spacing w:before="164"/>
+        <w:ind w:left="385" w:hanging="220"/>
+        <w:rPr>
+          <w:rFonts w:asciiTheme="majorHAnsi" w:hAnsiTheme="majorHAnsi"/>
           <w:sz w:val="18"/>
-          <w:szCs w:val="18"/>
+        </w:rPr>
+      </w:pPr>
+      <w:r>
+        <w:rPr>
+          <w:rFonts w:asciiTheme="majorHAnsi" w:hAnsiTheme="majorHAnsi"/>
+          <w:sz w:val="18"/>
         </w:rPr>
         <w:t xml:space="preserve">{docCommercialRegistration} Commercial Registration or the CR Extraction of the concern entity (CR).</w:t>
       </w:r>
     </w:p>
     <w:p>
-      <w:r>
-        <w:rPr>
-          <w:rFonts w:ascii="Times New Roman" w:hAnsi="Times New Roman" w:cs="Times New Roman"/>
+      <w:pPr>
+        <w:pStyle w:val="ListParagraph"/>
+        <w:numPr>
+          <w:ilvl w:val="0"/>
+          <w:numId w:val="2"/>
+        </w:numPr>
+        <w:tabs>
+          <w:tab w:val="left" w:pos="385"/>
+        </w:tabs>
+        <w:spacing w:before="164"/>
+        <w:ind w:left="385" w:hanging="220"/>
+        <w:rPr>
+          <w:rFonts w:asciiTheme="majorHAnsi" w:hAnsiTheme="majorHAnsi"/>
           <w:sz w:val="18"/>
-          <w:szCs w:val="18"/>
+        </w:rPr>
+      </w:pPr>
+      <w:r>
+        <w:rPr>
+          <w:rFonts w:asciiTheme="majorHAnsi" w:hAnsiTheme="majorHAnsi"/>
+          <w:sz w:val="18"/>
         </w:rPr>
         <w:t xml:space="preserve">{docEntityCard} Entity Card/Computer card of the concern entity.</w:t>
       </w:r>
     </w:p>
     <w:p>
-      <w:r>
-        <w:rPr>
-          <w:rFonts w:ascii="Times New Roman" w:hAnsi="Times New Roman" w:cs="Times New Roman"/>
+      <w:pPr>
+        <w:pStyle w:val="ListParagraph"/>
+        <w:numPr>
+          <w:ilvl w:val="0"/>
+          <w:numId w:val="2"/>
+        </w:numPr>
+        <w:tabs>
+          <w:tab w:val="left" w:pos="385"/>
+        </w:tabs>
+        <w:spacing w:before="179"/>
+        <w:ind w:left="385" w:hanging="220"/>
+        <w:rPr>
+          <w:rFonts w:asciiTheme="majorHAnsi" w:hAnsiTheme="majorHAnsi"/>
           <w:sz w:val="18"/>
-          <w:szCs w:val="18"/>
+        </w:rPr>
+      </w:pPr>
+      <w:r>
+        <w:rPr>
+          <w:rFonts w:asciiTheme="majorHAnsi" w:hAnsiTheme="majorHAnsi"/>
+          <w:sz w:val="18"/>
         </w:rPr>
         <w:t xml:space="preserve">{docCertificateOfIncorporation} Certificate of Incorporation of the Concern entity.</w:t>
       </w:r>
     </w:p>
     <w:p>
-      <w:r>
-        <w:rPr>
-          <w:rFonts w:ascii="Times New Roman" w:hAnsi="Times New Roman" w:cs="Times New Roman"/>
+      <w:pPr>
+        <w:pStyle w:val="ListParagraph"/>
+        <w:numPr>
+          <w:ilvl w:val="0"/>
+          <w:numId w:val="2"/>
+        </w:numPr>
+        <w:tabs>
+          <w:tab w:val="left" w:pos="385"/>
+        </w:tabs>
+        <w:spacing w:before="183"/>
+        <w:ind w:left="385" w:hanging="220"/>
+        <w:rPr>
+          <w:rFonts w:asciiTheme="majorHAnsi" w:hAnsiTheme="majorHAnsi"/>
           <w:sz w:val="18"/>
-          <w:szCs w:val="18"/>
+        </w:rPr>
+      </w:pPr>
+      <w:r>
+        <w:rPr>
+          <w:rFonts w:asciiTheme="majorHAnsi" w:hAnsiTheme="majorHAnsi"/>
+          <w:sz w:val="18"/>
         </w:rPr>
         <w:t xml:space="preserve">{docArticlesOfAssociation} Articles of Association of the Concern Entity.</w:t>
       </w:r>
     </w:p>
     <w:p>
-      <w:r>
-        <w:rPr>
-          <w:rFonts w:ascii="Times New Roman" w:hAnsi="Times New Roman" w:cs="Times New Roman"/>
+      <w:pPr>
+        <w:pStyle w:val="ListParagraph"/>
+        <w:numPr>
+          <w:ilvl w:val="0"/>
+          <w:numId w:val="2"/>
+        </w:numPr>
+        <w:tabs>
+          <w:tab w:val="left" w:pos="385"/>
+        </w:tabs>
+        <w:spacing w:before="164"/>
+        <w:ind w:left="385" w:hanging="220"/>
+        <w:rPr>
+          <w:rFonts w:asciiTheme="majorHAnsi" w:hAnsiTheme="majorHAnsi"/>
           <w:sz w:val="18"/>
-          <w:szCs w:val="18"/>
+        </w:rPr>
+      </w:pPr>
+      <w:r>
+        <w:rPr>
+          <w:rFonts w:asciiTheme="majorHAnsi" w:hAnsiTheme="majorHAnsi"/>
+          <w:sz w:val="18"/>
         </w:rPr>
         <w:t xml:space="preserve">{docIdentityCopies} Qatar IDs/passport copies of all-natural person, direct and indirect, shareholders, UBOs, Directors, SEF, Secretory and authorized signatories up to and including its ultimate beneficial owners.</w:t>
       </w:r>
     </w:p>
     <w:p>
-      <w:r>
-        <w:rPr>
-          <w:rFonts w:ascii="Times New Roman" w:hAnsi="Times New Roman" w:cs="Times New Roman"/>
+      <w:pPr>
+        <w:pStyle w:val="ListParagraph"/>
+        <w:numPr>
+          <w:ilvl w:val="0"/>
+          <w:numId w:val="2"/>
+        </w:numPr>
+        <w:tabs>
+          <w:tab w:val="left" w:pos="385"/>
+        </w:tabs>
+        <w:spacing w:before="161"/>
+        <w:ind w:left="385" w:hanging="220"/>
+        <w:rPr>
+          <w:rFonts w:asciiTheme="majorHAnsi" w:hAnsiTheme="majorHAnsi"/>
           <w:sz w:val="18"/>
-          <w:szCs w:val="18"/>
+        </w:rPr>
+      </w:pPr>
+      <w:r>
+        <w:rPr>
+          <w:rFonts w:asciiTheme="majorHAnsi" w:hAnsiTheme="majorHAnsi"/>
+          <w:sz w:val="18"/>
         </w:rPr>
         <w:t xml:space="preserve">{docLegalEntityShareholderCr} If Shareholders are legal entities not the natural persons, please provide the CR of all legal entities until natural persons</w:t>
       </w:r>
     </w:p>
     <w:p>
-      <w:r>
-        <w:rPr>
-          <w:rFonts w:ascii="Times New Roman" w:hAnsi="Times New Roman" w:cs="Times New Roman"/>
+      <w:pPr>
+        <w:pStyle w:val="ListParagraph"/>
+        <w:numPr>
+          <w:ilvl w:val="0"/>
+          <w:numId w:val="2"/>
+        </w:numPr>
+        <w:tabs>
+          <w:tab w:val="left" w:pos="385"/>
+        </w:tabs>
+        <w:spacing w:before="164"/>
+        <w:ind w:left="385" w:hanging="220"/>
+        <w:rPr>
+          <w:rFonts w:asciiTheme="majorHAnsi" w:hAnsiTheme="majorHAnsi"/>
           <w:sz w:val="18"/>
-          <w:szCs w:val="18"/>
+        </w:rPr>
+      </w:pPr>
+      <w:r>
+        <w:rPr>
+          <w:rFonts w:asciiTheme="majorHAnsi" w:hAnsiTheme="majorHAnsi"/>
+          <w:sz w:val="18"/>
         </w:rPr>
         <w:t xml:space="preserve">{docNationalAddressCertificates} National address certificates for the legal entities and natural persons residents in the state of Qatar.</w:t>
       </w:r>
     </w:p>
     <w:p>
-      <w:r>
-        <w:rPr>
-          <w:rFonts w:ascii="Times New Roman" w:hAnsi="Times New Roman" w:cs="Times New Roman"/>
+      <w:pPr>
+        <w:pStyle w:val="ListParagraph"/>
+        <w:numPr>
+          <w:ilvl w:val="0"/>
+          <w:numId w:val="2"/>
+        </w:numPr>
+        <w:tabs>
+          <w:tab w:val="left" w:pos="385"/>
+        </w:tabs>
+        <w:spacing w:before="180"/>
+        <w:ind w:left="385" w:hanging="220"/>
+        <w:rPr>
+          <w:rFonts w:asciiTheme="majorHAnsi" w:hAnsiTheme="majorHAnsi"/>
           <w:sz w:val="18"/>
-          <w:szCs w:val="18"/>
+        </w:rPr>
+      </w:pPr>
+      <w:r>
+        <w:rPr>
+          <w:rFonts w:asciiTheme="majorHAnsi" w:hAnsiTheme="majorHAnsi"/>
+          <w:sz w:val="18"/>
         </w:rPr>
         <w:t xml:space="preserve">{docAuditedFinancialStatements} Latest Audited Financial Statements.</w:t>
       </w:r>
     </w:p>
     <w:p>
-      <w:r>
-        <w:rPr>
-          <w:rFonts w:ascii="Times New Roman" w:hAnsi="Times New Roman" w:cs="Times New Roman"/>
+      <w:pPr>
+        <w:pStyle w:val="ListParagraph"/>
+        <w:numPr>
+          <w:ilvl w:val="0"/>
+          <w:numId w:val="2"/>
+        </w:numPr>
+        <w:tabs>
+          <w:tab w:val="left" w:pos="385"/>
+        </w:tabs>
+        <w:spacing w:before="164"/>
+        <w:ind w:left="385" w:hanging="220"/>
+        <w:rPr>
+          <w:rFonts w:asciiTheme="majorHAnsi" w:hAnsiTheme="majorHAnsi"/>
           <w:sz w:val="18"/>
-          <w:szCs w:val="18"/>
+        </w:rPr>
+      </w:pPr>
+      <w:r>
+        <w:rPr>
+          <w:rFonts w:asciiTheme="majorHAnsi" w:hAnsiTheme="majorHAnsi"/>
+          <w:spacing w:val="-50"/>
         </w:rPr>
         <w:t xml:space="preserve">{docTaxCard} Tax Card of the concern entity.</w:t>
       </w:r>
     </w:p>
     <w:p>
-      <w:r>
-        <w:rPr>
-          <w:rFonts w:ascii="Times New Roman" w:hAnsi="Times New Roman" w:cs="Times New Roman"/>
+      <w:pPr>
+        <w:pStyle w:val="ListParagraph"/>
+        <w:numPr>
+          <w:ilvl w:val="0"/>
+          <w:numId w:val="2"/>
+        </w:numPr>
+        <w:tabs>
+          <w:tab w:val="left" w:pos="385"/>
+        </w:tabs>
+        <w:spacing w:before="164"/>
+        <w:ind w:left="385" w:hanging="220"/>
+        <w:rPr>
+          <w:rFonts w:asciiTheme="majorHAnsi" w:hAnsiTheme="majorHAnsi"/>
           <w:sz w:val="18"/>
-          <w:szCs w:val="18"/>
+        </w:rPr>
+      </w:pPr>
+      <w:r>
+        <w:rPr>
+          <w:rFonts w:asciiTheme="majorHAnsi" w:hAnsiTheme="majorHAnsi"/>
+          <w:spacing w:val="-50"/>
         </w:rPr>
         <w:t xml:space="preserve">Additional documents: {additionalDocumentsText}</w:t>
       </w:r>
     </w:p>
     <w:p>
-      <w:r>
-        <w:rPr>
-          <w:rFonts w:ascii="Times New Roman" w:hAnsi="Times New Roman" w:cs="Times New Roman"/>
+      <w:pPr>
+        <w:pStyle w:val="ListParagraph"/>
+        <w:numPr>
+          <w:ilvl w:val="0"/>
+          <w:numId w:val="2"/>
+        </w:numPr>
+        <w:tabs>
+          <w:tab w:val="left" w:pos="385"/>
+        </w:tabs>
+        <w:spacing w:before="164"/>
+        <w:ind w:left="385" w:hanging="220"/>
+        <w:rPr>
+          <w:rFonts w:asciiTheme="majorHAnsi" w:hAnsiTheme="majorHAnsi"/>
           <w:sz w:val="18"/>
-          <w:szCs w:val="18"/>
+        </w:rPr>
+      </w:pPr>
+      <w:r>
+        <w:rPr>
+          <w:rFonts w:asciiTheme="majorHAnsi" w:hAnsiTheme="majorHAnsi"/>
+          <w:spacing w:val="-50"/>
         </w:rPr>
         <w:t xml:space="preserve">Additional notes for KYC preparation documents: {uploadedFilesNote}</w:t>
       </w:r>
@@ -6172,12 +6608,14 @@
             <w:tcW w:w="7029" w:type="dxa"/>
           </w:tcPr>
           <w:p>
-            <w:r>
-              <w:rPr>
-                <w:rFonts w:ascii="Times New Roman" w:hAnsi="Times New Roman" w:cs="Times New Roman"/>
+            <w:pPr>
+              <w:rPr>
+                <w:rFonts w:asciiTheme="majorHAnsi" w:hAnsiTheme="majorHAnsi"/>
                 <w:sz w:val="18"/>
                 <w:szCs w:val="18"/>
               </w:rPr>
+            </w:pPr>
+            <w:r>
               <w:t xml:space="preserve">{declarationFullName}</w:t>
             </w:r>
           </w:p>
@@ -6215,12 +6653,14 @@
             <w:tcW w:w="7029" w:type="dxa"/>
           </w:tcPr>
           <w:p>
-            <w:r>
-              <w:rPr>
-                <w:rFonts w:ascii="Times New Roman" w:hAnsi="Times New Roman" w:cs="Times New Roman"/>
+            <w:pPr>
+              <w:rPr>
+                <w:rFonts w:asciiTheme="majorHAnsi" w:hAnsiTheme="majorHAnsi"/>
                 <w:sz w:val="18"/>
                 <w:szCs w:val="18"/>
               </w:rPr>
+            </w:pPr>
+            <w:r>
               <w:t xml:space="preserve">{declarationPosition}</w:t>
             </w:r>
           </w:p>
@@ -6258,12 +6698,14 @@
             <w:tcW w:w="7029" w:type="dxa"/>
           </w:tcPr>
           <w:p>
-            <w:r>
-              <w:rPr>
-                <w:rFonts w:ascii="Times New Roman" w:hAnsi="Times New Roman" w:cs="Times New Roman"/>
+            <w:pPr>
+              <w:rPr>
+                <w:rFonts w:asciiTheme="majorHAnsi" w:hAnsiTheme="majorHAnsi"/>
                 <w:sz w:val="18"/>
                 <w:szCs w:val="18"/>
               </w:rPr>
+            </w:pPr>
+            <w:r>
               <w:t xml:space="preserve">{declarationDate}</w:t>
             </w:r>
           </w:p>
@@ -6310,12 +6752,14 @@
             <w:tcW w:w="7029" w:type="dxa"/>
           </w:tcPr>
           <w:p>
-            <w:r>
-              <w:rPr>
-                <w:rFonts w:ascii="Times New Roman" w:hAnsi="Times New Roman" w:cs="Times New Roman"/>
+            <w:pPr>
+              <w:rPr>
+                <w:rFonts w:asciiTheme="majorHAnsi" w:hAnsiTheme="majorHAnsi"/>
                 <w:sz w:val="18"/>
                 <w:szCs w:val="18"/>
               </w:rPr>
+            </w:pPr>
+            <w:r>
               <w:t xml:space="preserve">{signatureFileName}</w:t>
             </w:r>
           </w:p>
@@ -6371,12 +6815,14 @@
             <w:tcW w:w="7029" w:type="dxa"/>
           </w:tcPr>
           <w:p>
-            <w:r>
-              <w:rPr>
-                <w:rFonts w:ascii="Times New Roman" w:hAnsi="Times New Roman" w:cs="Times New Roman"/>
+            <w:pPr>
+              <w:rPr>
+                <w:rFonts w:asciiTheme="majorHAnsi" w:hAnsiTheme="majorHAnsi"/>
                 <w:sz w:val="18"/>
                 <w:szCs w:val="18"/>
               </w:rPr>
+            </w:pPr>
+            <w:r>
               <w:t xml:space="preserve">{stampFileName}</w:t>
             </w:r>
           </w:p>
@@ -6571,11 +7017,22 @@
       </w:pPr>
     </w:p>
     <w:p>
-      <w:r>
-        <w:rPr>
-          <w:rFonts w:ascii="Times New Roman" w:hAnsi="Times New Roman" w:cs="Times New Roman"/>
-          <w:sz w:val="18"/>
-          <w:szCs w:val="18"/>
+      <w:pPr>
+        <w:pStyle w:val="BodyText"/>
+        <w:tabs>
+          <w:tab w:val="left" w:pos="1077"/>
+          <w:tab w:val="left" w:pos="1533"/>
+        </w:tabs>
+        <w:spacing w:before="7"/>
+        <w:ind w:left="165"/>
+        <w:rPr>
+          <w:rFonts w:asciiTheme="majorHAnsi" w:hAnsiTheme="majorHAnsi"/>
+        </w:rPr>
+      </w:pPr>
+      <w:r>
+        <w:rPr>
+          <w:rFonts w:asciiTheme="majorHAnsi" w:hAnsiTheme="majorHAnsi"/>
+          <w:spacing w:val="-5"/>
         </w:rPr>
         <w:t xml:space="preserve">Yes {amlAccuracyYes}    No {amlAccuracyNo}</w:t>
       </w:r>
@@ -6604,11 +7061,17 @@
       </w:r>
     </w:p>
     <w:p>
-      <w:r>
-        <w:rPr>
-          <w:rFonts w:ascii="Times New Roman" w:hAnsi="Times New Roman" w:cs="Times New Roman"/>
-          <w:sz w:val="18"/>
-          <w:szCs w:val="18"/>
+      <w:pPr>
+        <w:pStyle w:val="BodyText"/>
+        <w:spacing w:before="4" w:line="276" w:lineRule="auto"/>
+        <w:ind w:left="165"/>
+        <w:rPr>
+          <w:rFonts w:asciiTheme="majorHAnsi" w:hAnsiTheme="majorHAnsi"/>
+        </w:rPr>
+      </w:pPr>
+      <w:r>
+        <w:rPr>
+          <w:rFonts w:asciiTheme="majorHAnsi" w:hAnsiTheme="majorHAnsi"/>
         </w:rPr>
         <w:t xml:space="preserve">If No, please provide clarification and findings: {amlClarificationFindings}</w:t>
       </w:r>
@@ -6771,80 +7234,7 @@
         <w:rPr>
           <w:rFonts w:asciiTheme="majorHAnsi" w:hAnsiTheme="majorHAnsi"/>
         </w:rPr>
-        <w:t xml:space="preserve">High Risk </w:t>
-      </w:r>
-      <w:r>
-        <w:rPr>
-          <w:rFonts w:ascii="Segoe UI Symbol" w:hAnsi="Segoe UI Symbol" w:cs="Segoe UI Symbol"/>
-        </w:rPr>
-        <w:t>☐</w:t>
-      </w:r>
-      <w:r>
-        <w:rPr>
-          <w:rFonts w:asciiTheme="majorHAnsi" w:hAnsiTheme="majorHAnsi"/>
-        </w:rPr>
-        <w:t xml:space="preserve"> </w:t>
-      </w:r>
-      <w:r>
-        <w:rPr>
-          <w:rFonts w:asciiTheme="majorHAnsi" w:hAnsiTheme="majorHAnsi"/>
-        </w:rPr>
-        <w:t xml:space="preserve">    M</w:t>
-      </w:r>
-      <w:r>
-        <w:rPr>
-          <w:rFonts w:asciiTheme="majorHAnsi" w:hAnsiTheme="majorHAnsi"/>
-        </w:rPr>
-        <w:t>e</w:t>
-      </w:r>
-      <w:r>
-        <w:rPr>
-          <w:rFonts w:asciiTheme="majorHAnsi" w:hAnsiTheme="majorHAnsi"/>
-        </w:rPr>
-        <w:t xml:space="preserve">dium Risk </w:t>
-      </w:r>
-      <w:r>
-        <w:rPr>
-          <w:rFonts w:ascii="Segoe UI Symbol" w:hAnsi="Segoe UI Symbol" w:cs="Segoe UI Symbol"/>
-        </w:rPr>
-        <w:t>☐</w:t>
-      </w:r>
-      <w:r>
-        <w:rPr>
-          <w:rFonts w:ascii="Segoe UI Symbol" w:hAnsi="Segoe UI Symbol" w:cs="Segoe UI Symbol"/>
-        </w:rPr>
-        <w:t xml:space="preserve">   </w:t>
-      </w:r>
-      <w:r>
-        <w:rPr>
-          <w:rFonts w:ascii="Segoe UI Symbol" w:hAnsi="Segoe UI Symbol" w:cs="Segoe UI Symbol"/>
-        </w:rPr>
-        <w:t xml:space="preserve"> </w:t>
-      </w:r>
-      <w:r>
-        <w:rPr>
-          <w:rFonts w:ascii="Segoe UI Symbol" w:hAnsi="Segoe UI Symbol" w:cs="Segoe UI Symbol"/>
-        </w:rPr>
-        <w:t>Low</w:t>
-      </w:r>
-      <w:r>
-        <w:rPr>
-          <w:rFonts w:asciiTheme="majorHAnsi" w:hAnsiTheme="majorHAnsi"/>
-        </w:rPr>
-        <w:t xml:space="preserve"> Risk </w:t>
-      </w:r>
-      <w:r>
-        <w:rPr>
-          <w:rFonts w:ascii="Segoe UI Symbol" w:hAnsi="Segoe UI Symbol" w:cs="Segoe UI Symbol"/>
-        </w:rPr>
-        <w:t>☐</w:t>
-      </w:r>
-      <w:r>
-        <w:rPr>
-          <w:rFonts w:asciiTheme="majorHAnsi" w:hAnsiTheme="majorHAnsi"/>
-          <w:spacing w:val="80"/>
-        </w:rPr>
-        <w:t xml:space="preserve">    </w:t>
+        <w:t xml:space="preserve">High Risk {riskHigh}    Medium Risk {riskMedium}    Low Risk {riskLow}</w:t>
       </w:r>
     </w:p>
     <w:p>
@@ -6885,86 +7275,7 @@
         <w:rPr>
           <w:rFonts w:asciiTheme="majorHAnsi" w:hAnsiTheme="majorHAnsi"/>
         </w:rPr>
-        <w:t>Simplified Due Diligence</w:t>
-      </w:r>
-      <w:r>
-        <w:rPr>
-          <w:rFonts w:asciiTheme="majorHAnsi" w:hAnsiTheme="majorHAnsi"/>
-        </w:rPr>
-        <w:t xml:space="preserve"> </w:t>
-      </w:r>
-      <w:r>
-        <w:rPr>
-          <w:rFonts w:ascii="Segoe UI Symbol" w:hAnsi="Segoe UI Symbol" w:cs="Segoe UI Symbol"/>
-        </w:rPr>
-        <w:t>☐</w:t>
-      </w:r>
-      <w:r>
-        <w:rPr>
-          <w:rFonts w:asciiTheme="majorHAnsi" w:hAnsiTheme="majorHAnsi"/>
-        </w:rPr>
-        <w:t xml:space="preserve"> </w:t>
-      </w:r>
-      <w:r>
-        <w:rPr>
-          <w:rFonts w:asciiTheme="majorHAnsi" w:hAnsiTheme="majorHAnsi"/>
-        </w:rPr>
-        <w:t xml:space="preserve">    </w:t>
-      </w:r>
-      <w:r>
-        <w:rPr>
-          <w:rFonts w:asciiTheme="majorHAnsi" w:hAnsiTheme="majorHAnsi"/>
-        </w:rPr>
-        <w:t>Regular Due Diligence</w:t>
-      </w:r>
-      <w:r>
-        <w:rPr>
-          <w:rFonts w:asciiTheme="majorHAnsi" w:hAnsiTheme="majorHAnsi"/>
-        </w:rPr>
-        <w:t xml:space="preserve"> </w:t>
-      </w:r>
-      <w:r>
-        <w:rPr>
-          <w:rFonts w:ascii="Segoe UI Symbol" w:hAnsi="Segoe UI Symbol" w:cs="Segoe UI Symbol"/>
-        </w:rPr>
-        <w:t>☐</w:t>
-      </w:r>
-      <w:r>
-        <w:rPr>
-          <w:rFonts w:ascii="Segoe UI Symbol" w:hAnsi="Segoe UI Symbol" w:cs="Segoe UI Symbol"/>
-        </w:rPr>
-        <w:t xml:space="preserve">   </w:t>
-      </w:r>
-      <w:r>
-        <w:rPr>
-          <w:rFonts w:ascii="Segoe UI Symbol" w:hAnsi="Segoe UI Symbol" w:cs="Segoe UI Symbol"/>
-        </w:rPr>
-        <w:t xml:space="preserve"> </w:t>
-      </w:r>
-      <w:r>
-        <w:rPr>
-          <w:rFonts w:ascii="Segoe UI Symbol" w:hAnsi="Segoe UI Symbol" w:cs="Segoe UI Symbol"/>
-        </w:rPr>
-        <w:t>Enhanced Due Diligence</w:t>
-      </w:r>
-      <w:r>
-        <w:rPr>
-          <w:rFonts w:asciiTheme="majorHAnsi" w:hAnsiTheme="majorHAnsi"/>
-        </w:rPr>
-        <w:t xml:space="preserve"> </w:t>
-      </w:r>
-      <w:r>
-        <w:rPr>
-          <w:rFonts w:ascii="Segoe UI Symbol" w:hAnsi="Segoe UI Symbol" w:cs="Segoe UI Symbol"/>
-        </w:rPr>
-        <w:t>☐</w:t>
-      </w:r>
-      <w:r>
-        <w:rPr>
-          <w:rFonts w:asciiTheme="majorHAnsi" w:hAnsiTheme="majorHAnsi"/>
-          <w:spacing w:val="80"/>
-        </w:rPr>
-        <w:t xml:space="preserve">    </w:t>
+        <w:t xml:space="preserve">Simplified Due Diligence {dueSimplified}    Regular Due Diligence {dueRegular}    Enhanced Due Diligence {dueEnhanced}</w:t>
       </w:r>
     </w:p>
     <w:p>
@@ -7054,26 +7365,6 @@
             <w:tcW w:w="7110" w:type="dxa"/>
           </w:tcPr>
           <w:p>
-            <w:r>
-              <w:rPr>
-                <w:rFonts w:ascii="Times New Roman" w:hAnsi="Times New Roman" w:cs="Times New Roman"/>
-                <w:sz w:val="18"/>
-                <w:szCs w:val="18"/>
-              </w:rPr>
-              <w:t xml:space="preserve">{amlName}</w:t>
-            </w:r>
-          </w:p>
-        </w:tc>
-      </w:tr>
-      <w:tr>
-        <w:trPr>
-          <w:trHeight w:val="530"/>
-        </w:trPr>
-        <w:tc>
-          <w:tcPr>
-            <w:tcW w:w="1530" w:type="dxa"/>
-          </w:tcPr>
-          <w:p>
             <w:pPr>
               <w:pStyle w:val="BodyText"/>
               <w:widowControl w:val="0"/>
@@ -7086,30 +7377,15 @@
               </w:rPr>
             </w:pPr>
             <w:r>
-              <w:rPr>
-                <w:rFonts w:asciiTheme="majorHAnsi" w:hAnsiTheme="majorHAnsi"/>
-              </w:rPr>
-              <w:t>Signature:</w:t>
-            </w:r>
-          </w:p>
-        </w:tc>
-        <w:tc>
-          <w:tcPr>
-            <w:tcW w:w="7110" w:type="dxa"/>
-          </w:tcPr>
-          <w:p>
-            <w:r>
-              <w:rPr>
-                <w:rFonts w:ascii="Times New Roman" w:hAnsi="Times New Roman" w:cs="Times New Roman"/>
-                <w:sz w:val="18"/>
-                <w:szCs w:val="18"/>
-              </w:rPr>
-              <w:t xml:space="preserve">{amlSignatureFileName}</w:t>
+              <w:t xml:space="preserve">{amlName}</w:t>
             </w:r>
           </w:p>
         </w:tc>
       </w:tr>
       <w:tr>
+        <w:trPr>
+          <w:trHeight w:val="530"/>
+        </w:trPr>
         <w:tc>
           <w:tcPr>
             <w:tcW w:w="1530" w:type="dxa"/>
@@ -7130,33 +7406,13 @@
               <w:rPr>
                 <w:rFonts w:asciiTheme="majorHAnsi" w:hAnsiTheme="majorHAnsi"/>
               </w:rPr>
-              <w:t>Date:</w:t>
+              <w:t>Signature:</w:t>
             </w:r>
           </w:p>
         </w:tc>
         <w:tc>
           <w:tcPr>
             <w:tcW w:w="7110" w:type="dxa"/>
-          </w:tcPr>
-          <w:p>
-            <w:r>
-              <w:rPr>
-                <w:rFonts w:ascii="Times New Roman" w:hAnsi="Times New Roman" w:cs="Times New Roman"/>
-                <w:sz w:val="18"/>
-                <w:szCs w:val="18"/>
-              </w:rPr>
-              <w:t xml:space="preserve">{amlDate}</w:t>
-            </w:r>
-          </w:p>
-        </w:tc>
-      </w:tr>
-      <w:tr>
-        <w:trPr>
-          <w:trHeight w:val="753"/>
-        </w:trPr>
-        <w:tc>
-          <w:tcPr>
-            <w:tcW w:w="1530" w:type="dxa"/>
           </w:tcPr>
           <w:p>
             <w:pPr>
@@ -7171,6 +7427,82 @@
               </w:rPr>
             </w:pPr>
             <w:r>
+              <w:t xml:space="preserve">{amlSignatureFileName}</w:t>
+            </w:r>
+          </w:p>
+        </w:tc>
+      </w:tr>
+      <w:tr>
+        <w:tc>
+          <w:tcPr>
+            <w:tcW w:w="1530" w:type="dxa"/>
+          </w:tcPr>
+          <w:p>
+            <w:pPr>
+              <w:pStyle w:val="BodyText"/>
+              <w:widowControl w:val="0"/>
+              <w:autoSpaceDE w:val="0"/>
+              <w:autoSpaceDN w:val="0"/>
+              <w:spacing w:before="4"/>
+              <w:ind w:left="165"/>
+              <w:rPr>
+                <w:rFonts w:asciiTheme="majorHAnsi" w:hAnsiTheme="majorHAnsi"/>
+              </w:rPr>
+            </w:pPr>
+            <w:r>
+              <w:rPr>
+                <w:rFonts w:asciiTheme="majorHAnsi" w:hAnsiTheme="majorHAnsi"/>
+              </w:rPr>
+              <w:t>Date:</w:t>
+            </w:r>
+          </w:p>
+        </w:tc>
+        <w:tc>
+          <w:tcPr>
+            <w:tcW w:w="7110" w:type="dxa"/>
+          </w:tcPr>
+          <w:p>
+            <w:pPr>
+              <w:pStyle w:val="BodyText"/>
+              <w:widowControl w:val="0"/>
+              <w:autoSpaceDE w:val="0"/>
+              <w:autoSpaceDN w:val="0"/>
+              <w:spacing w:before="4"/>
+              <w:ind w:left="165"/>
+              <w:rPr>
+                <w:rFonts w:asciiTheme="majorHAnsi" w:hAnsiTheme="majorHAnsi"/>
+              </w:rPr>
+            </w:pPr>
+            <w:r>
+              <w:rPr>
+                <w:rFonts w:asciiTheme="majorHAnsi" w:hAnsiTheme="majorHAnsi"/>
+              </w:rPr>
+              <w:t xml:space="preserve">{amlDate}</w:t>
+            </w:r>
+          </w:p>
+        </w:tc>
+      </w:tr>
+      <w:tr>
+        <w:trPr>
+          <w:trHeight w:val="753"/>
+        </w:trPr>
+        <w:tc>
+          <w:tcPr>
+            <w:tcW w:w="1530" w:type="dxa"/>
+          </w:tcPr>
+          <w:p>
+            <w:pPr>
+              <w:pStyle w:val="BodyText"/>
+              <w:widowControl w:val="0"/>
+              <w:autoSpaceDE w:val="0"/>
+              <w:autoSpaceDN w:val="0"/>
+              <w:spacing w:before="4"/>
+              <w:ind w:left="165"/>
+              <w:rPr>
+                <w:rFonts w:asciiTheme="majorHAnsi" w:hAnsiTheme="majorHAnsi"/>
+              </w:rPr>
+            </w:pPr>
+            <w:r>
               <w:rPr>
                 <w:rFonts w:asciiTheme="majorHAnsi" w:hAnsiTheme="majorHAnsi"/>
               </w:rPr>
@@ -7183,12 +7515,18 @@
             <w:tcW w:w="7110" w:type="dxa"/>
           </w:tcPr>
           <w:p>
-            <w:r>
-              <w:rPr>
-                <w:rFonts w:ascii="Times New Roman" w:hAnsi="Times New Roman" w:cs="Times New Roman"/>
-                <w:sz w:val="18"/>
-                <w:szCs w:val="18"/>
-              </w:rPr>
+            <w:pPr>
+              <w:pStyle w:val="BodyText"/>
+              <w:widowControl w:val="0"/>
+              <w:autoSpaceDE w:val="0"/>
+              <w:autoSpaceDN w:val="0"/>
+              <w:spacing w:before="4"/>
+              <w:ind w:left="165"/>
+              <w:rPr>
+                <w:rFonts w:asciiTheme="majorHAnsi" w:hAnsiTheme="majorHAnsi"/>
+              </w:rPr>
+            </w:pPr>
+            <w:r>
               <w:t xml:space="preserve">{amlComments}</w:t>
             </w:r>
           </w:p>
@@ -7311,26 +7649,6 @@
             <w:tcW w:w="7110" w:type="dxa"/>
           </w:tcPr>
           <w:p>
-            <w:r>
-              <w:rPr>
-                <w:rFonts w:ascii="Times New Roman" w:hAnsi="Times New Roman" w:cs="Times New Roman"/>
-                <w:sz w:val="18"/>
-                <w:szCs w:val="18"/>
-              </w:rPr>
-              <w:t xml:space="preserve">{dmlroName}</w:t>
-            </w:r>
-          </w:p>
-        </w:tc>
-      </w:tr>
-      <w:tr>
-        <w:trPr>
-          <w:trHeight w:val="530"/>
-        </w:trPr>
-        <w:tc>
-          <w:tcPr>
-            <w:tcW w:w="1530" w:type="dxa"/>
-          </w:tcPr>
-          <w:p>
             <w:pPr>
               <w:pStyle w:val="BodyText"/>
               <w:widowControl w:val="0"/>
@@ -7343,30 +7661,15 @@
               </w:rPr>
             </w:pPr>
             <w:r>
-              <w:rPr>
-                <w:rFonts w:asciiTheme="majorHAnsi" w:hAnsiTheme="majorHAnsi"/>
-              </w:rPr>
-              <w:t>Signature:</w:t>
-            </w:r>
-          </w:p>
-        </w:tc>
-        <w:tc>
-          <w:tcPr>
-            <w:tcW w:w="7110" w:type="dxa"/>
-          </w:tcPr>
-          <w:p>
-            <w:r>
-              <w:rPr>
-                <w:rFonts w:ascii="Times New Roman" w:hAnsi="Times New Roman" w:cs="Times New Roman"/>
-                <w:sz w:val="18"/>
-                <w:szCs w:val="18"/>
-              </w:rPr>
-              <w:t xml:space="preserve">{dmlroSignatureFileName}</w:t>
+              <w:t xml:space="preserve">{dmlroName}</w:t>
             </w:r>
           </w:p>
         </w:tc>
       </w:tr>
       <w:tr>
+        <w:trPr>
+          <w:trHeight w:val="530"/>
+        </w:trPr>
         <w:tc>
           <w:tcPr>
             <w:tcW w:w="1530" w:type="dxa"/>
@@ -7387,33 +7690,13 @@
               <w:rPr>
                 <w:rFonts w:asciiTheme="majorHAnsi" w:hAnsiTheme="majorHAnsi"/>
               </w:rPr>
-              <w:t>Date:</w:t>
+              <w:t>Signature:</w:t>
             </w:r>
           </w:p>
         </w:tc>
         <w:tc>
           <w:tcPr>
             <w:tcW w:w="7110" w:type="dxa"/>
-          </w:tcPr>
-          <w:p>
-            <w:r>
-              <w:rPr>
-                <w:rFonts w:ascii="Times New Roman" w:hAnsi="Times New Roman" w:cs="Times New Roman"/>
-                <w:sz w:val="18"/>
-                <w:szCs w:val="18"/>
-              </w:rPr>
-              <w:t xml:space="preserve">{dmlroDate}</w:t>
-            </w:r>
-          </w:p>
-        </w:tc>
-      </w:tr>
-      <w:tr>
-        <w:trPr>
-          <w:trHeight w:val="708"/>
-        </w:trPr>
-        <w:tc>
-          <w:tcPr>
-            <w:tcW w:w="1530" w:type="dxa"/>
           </w:tcPr>
           <w:p>
             <w:pPr>
@@ -7428,6 +7711,82 @@
               </w:rPr>
             </w:pPr>
             <w:r>
+              <w:t xml:space="preserve">{dmlroSignatureFileName}</w:t>
+            </w:r>
+          </w:p>
+        </w:tc>
+      </w:tr>
+      <w:tr>
+        <w:tc>
+          <w:tcPr>
+            <w:tcW w:w="1530" w:type="dxa"/>
+          </w:tcPr>
+          <w:p>
+            <w:pPr>
+              <w:pStyle w:val="BodyText"/>
+              <w:widowControl w:val="0"/>
+              <w:autoSpaceDE w:val="0"/>
+              <w:autoSpaceDN w:val="0"/>
+              <w:spacing w:before="4"/>
+              <w:ind w:left="165"/>
+              <w:rPr>
+                <w:rFonts w:asciiTheme="majorHAnsi" w:hAnsiTheme="majorHAnsi"/>
+              </w:rPr>
+            </w:pPr>
+            <w:r>
+              <w:rPr>
+                <w:rFonts w:asciiTheme="majorHAnsi" w:hAnsiTheme="majorHAnsi"/>
+              </w:rPr>
+              <w:t>Date:</w:t>
+            </w:r>
+          </w:p>
+        </w:tc>
+        <w:tc>
+          <w:tcPr>
+            <w:tcW w:w="7110" w:type="dxa"/>
+          </w:tcPr>
+          <w:p>
+            <w:pPr>
+              <w:pStyle w:val="BodyText"/>
+              <w:widowControl w:val="0"/>
+              <w:autoSpaceDE w:val="0"/>
+              <w:autoSpaceDN w:val="0"/>
+              <w:spacing w:before="4"/>
+              <w:ind w:left="165"/>
+              <w:rPr>
+                <w:rFonts w:asciiTheme="majorHAnsi" w:hAnsiTheme="majorHAnsi"/>
+              </w:rPr>
+            </w:pPr>
+            <w:r>
+              <w:rPr>
+                <w:rFonts w:asciiTheme="majorHAnsi" w:hAnsiTheme="majorHAnsi"/>
+              </w:rPr>
+              <w:t xml:space="preserve">{dmlroDate}</w:t>
+            </w:r>
+          </w:p>
+        </w:tc>
+      </w:tr>
+      <w:tr>
+        <w:trPr>
+          <w:trHeight w:val="708"/>
+        </w:trPr>
+        <w:tc>
+          <w:tcPr>
+            <w:tcW w:w="1530" w:type="dxa"/>
+          </w:tcPr>
+          <w:p>
+            <w:pPr>
+              <w:pStyle w:val="BodyText"/>
+              <w:widowControl w:val="0"/>
+              <w:autoSpaceDE w:val="0"/>
+              <w:autoSpaceDN w:val="0"/>
+              <w:spacing w:before="4"/>
+              <w:ind w:left="165"/>
+              <w:rPr>
+                <w:rFonts w:asciiTheme="majorHAnsi" w:hAnsiTheme="majorHAnsi"/>
+              </w:rPr>
+            </w:pPr>
+            <w:r>
               <w:rPr>
                 <w:rFonts w:asciiTheme="majorHAnsi" w:hAnsiTheme="majorHAnsi"/>
               </w:rPr>
@@ -7440,12 +7799,18 @@
             <w:tcW w:w="7110" w:type="dxa"/>
           </w:tcPr>
           <w:p>
-            <w:r>
-              <w:rPr>
-                <w:rFonts w:ascii="Times New Roman" w:hAnsi="Times New Roman" w:cs="Times New Roman"/>
-                <w:sz w:val="18"/>
-                <w:szCs w:val="18"/>
-              </w:rPr>
+            <w:pPr>
+              <w:pStyle w:val="BodyText"/>
+              <w:widowControl w:val="0"/>
+              <w:autoSpaceDE w:val="0"/>
+              <w:autoSpaceDN w:val="0"/>
+              <w:spacing w:before="4"/>
+              <w:ind w:left="165"/>
+              <w:rPr>
+                <w:rFonts w:asciiTheme="majorHAnsi" w:hAnsiTheme="majorHAnsi"/>
+              </w:rPr>
+            </w:pPr>
+            <w:r>
               <w:t xml:space="preserve">{dmlroComments}</w:t>
             </w:r>
           </w:p>
@@ -7729,12 +8094,20 @@
             <w:tcW w:w="7560" w:type="dxa"/>
           </w:tcPr>
           <w:p>
-            <w:r>
-              <w:rPr>
-                <w:rFonts w:ascii="Times New Roman" w:hAnsi="Times New Roman" w:cs="Times New Roman"/>
+            <w:pPr>
+              <w:tabs>
+                <w:tab w:val="left" w:pos="1365"/>
+              </w:tabs>
+              <w:rPr>
+                <w:rFonts w:asciiTheme="majorHAnsi" w:hAnsiTheme="majorHAnsi" w:cstheme="majorHAnsi"/>
+                <w:b/>
+                <w:bCs/>
                 <w:sz w:val="18"/>
                 <w:szCs w:val="18"/>
-              </w:rPr>
+                <w:lang w:bidi="ar-QA"/>
+              </w:rPr>
+            </w:pPr>
+            <w:r>
               <w:t xml:space="preserve">{mlroName}</w:t>
             </w:r>
           </w:p>
@@ -7773,23 +8146,6 @@
             <w:tcW w:w="7560" w:type="dxa"/>
           </w:tcPr>
           <w:p>
-            <w:r>
-              <w:rPr>
-                <w:rFonts w:ascii="Times New Roman" w:hAnsi="Times New Roman" w:cs="Times New Roman"/>
-                <w:sz w:val="18"/>
-                <w:szCs w:val="18"/>
-              </w:rPr>
-              <w:t xml:space="preserve">{mlroSignatureFileName}</w:t>
-            </w:r>
-          </w:p>
-        </w:tc>
-      </w:tr>
-      <w:tr>
-        <w:tc>
-          <w:tcPr>
-            <w:tcW w:w="1530" w:type="dxa"/>
-          </w:tcPr>
-          <w:p>
             <w:pPr>
               <w:pStyle w:val="BodyText"/>
               <w:widowControl w:val="0"/>
@@ -7802,33 +8158,12 @@
               </w:rPr>
             </w:pPr>
             <w:r>
-              <w:rPr>
-                <w:rFonts w:asciiTheme="majorHAnsi" w:hAnsiTheme="majorHAnsi"/>
-              </w:rPr>
-              <w:t>Date:</w:t>
-            </w:r>
-          </w:p>
-        </w:tc>
-        <w:tc>
-          <w:tcPr>
-            <w:tcW w:w="7560" w:type="dxa"/>
-          </w:tcPr>
-          <w:p>
-            <w:r>
-              <w:rPr>
-                <w:rFonts w:ascii="Times New Roman" w:hAnsi="Times New Roman" w:cs="Times New Roman"/>
-                <w:sz w:val="18"/>
-                <w:szCs w:val="18"/>
-              </w:rPr>
-              <w:t xml:space="preserve">{mlroDate}</w:t>
+              <w:t xml:space="preserve">{mlroSignatureFileName}</w:t>
             </w:r>
           </w:p>
         </w:tc>
       </w:tr>
       <w:tr>
-        <w:trPr>
-          <w:trHeight w:val="708"/>
-        </w:trPr>
         <w:tc>
           <w:tcPr>
             <w:tcW w:w="1530" w:type="dxa"/>
@@ -7849,6 +8184,59 @@
               <w:rPr>
                 <w:rFonts w:asciiTheme="majorHAnsi" w:hAnsiTheme="majorHAnsi"/>
               </w:rPr>
+              <w:t>Date:</w:t>
+            </w:r>
+          </w:p>
+        </w:tc>
+        <w:tc>
+          <w:tcPr>
+            <w:tcW w:w="7560" w:type="dxa"/>
+          </w:tcPr>
+          <w:p>
+            <w:pPr>
+              <w:pStyle w:val="BodyText"/>
+              <w:widowControl w:val="0"/>
+              <w:autoSpaceDE w:val="0"/>
+              <w:autoSpaceDN w:val="0"/>
+              <w:spacing w:before="4"/>
+              <w:ind w:left="165"/>
+              <w:rPr>
+                <w:rFonts w:asciiTheme="majorHAnsi" w:hAnsiTheme="majorHAnsi"/>
+              </w:rPr>
+            </w:pPr>
+            <w:r>
+              <w:rPr>
+                <w:rFonts w:asciiTheme="majorHAnsi" w:hAnsiTheme="majorHAnsi"/>
+              </w:rPr>
+              <w:t xml:space="preserve">{mlroDate}</w:t>
+            </w:r>
+          </w:p>
+        </w:tc>
+      </w:tr>
+      <w:tr>
+        <w:trPr>
+          <w:trHeight w:val="708"/>
+        </w:trPr>
+        <w:tc>
+          <w:tcPr>
+            <w:tcW w:w="1530" w:type="dxa"/>
+          </w:tcPr>
+          <w:p>
+            <w:pPr>
+              <w:pStyle w:val="BodyText"/>
+              <w:widowControl w:val="0"/>
+              <w:autoSpaceDE w:val="0"/>
+              <w:autoSpaceDN w:val="0"/>
+              <w:spacing w:before="4"/>
+              <w:ind w:left="165"/>
+              <w:rPr>
+                <w:rFonts w:asciiTheme="majorHAnsi" w:hAnsiTheme="majorHAnsi"/>
+              </w:rPr>
+            </w:pPr>
+            <w:r>
+              <w:rPr>
+                <w:rFonts w:asciiTheme="majorHAnsi" w:hAnsiTheme="majorHAnsi"/>
+              </w:rPr>
               <w:t>Comments:</w:t>
             </w:r>
           </w:p>
@@ -7858,12 +8246,18 @@
             <w:tcW w:w="7560" w:type="dxa"/>
           </w:tcPr>
           <w:p>
-            <w:r>
-              <w:rPr>
-                <w:rFonts w:ascii="Times New Roman" w:hAnsi="Times New Roman" w:cs="Times New Roman"/>
-                <w:sz w:val="18"/>
-                <w:szCs w:val="18"/>
-              </w:rPr>
+            <w:pPr>
+              <w:pStyle w:val="BodyText"/>
+              <w:widowControl w:val="0"/>
+              <w:autoSpaceDE w:val="0"/>
+              <w:autoSpaceDN w:val="0"/>
+              <w:spacing w:before="4"/>
+              <w:ind w:left="165"/>
+              <w:rPr>
+                <w:rFonts w:asciiTheme="majorHAnsi" w:hAnsiTheme="majorHAnsi"/>
+              </w:rPr>
+            </w:pPr>
+            <w:r>
               <w:t xml:space="preserve">{mlroComments}</w:t>
             </w:r>
           </w:p>
@@ -7981,12 +8375,20 @@
             <w:tcW w:w="7560" w:type="dxa"/>
           </w:tcPr>
           <w:p>
-            <w:r>
-              <w:rPr>
-                <w:rFonts w:ascii="Times New Roman" w:hAnsi="Times New Roman" w:cs="Times New Roman"/>
+            <w:pPr>
+              <w:tabs>
+                <w:tab w:val="left" w:pos="1365"/>
+              </w:tabs>
+              <w:rPr>
+                <w:rFonts w:asciiTheme="majorHAnsi" w:hAnsiTheme="majorHAnsi" w:cstheme="majorHAnsi"/>
+                <w:b/>
+                <w:bCs/>
                 <w:sz w:val="18"/>
                 <w:szCs w:val="18"/>
-              </w:rPr>
+                <w:lang w:bidi="ar-QA"/>
+              </w:rPr>
+            </w:pPr>
+            <w:r>
               <w:t xml:space="preserve">{sefName}</w:t>
             </w:r>
           </w:p>
@@ -8025,23 +8427,6 @@
             <w:tcW w:w="7560" w:type="dxa"/>
           </w:tcPr>
           <w:p>
-            <w:r>
-              <w:rPr>
-                <w:rFonts w:ascii="Times New Roman" w:hAnsi="Times New Roman" w:cs="Times New Roman"/>
-                <w:sz w:val="18"/>
-                <w:szCs w:val="18"/>
-              </w:rPr>
-              <w:t xml:space="preserve">{sefSignatureFileName}</w:t>
-            </w:r>
-          </w:p>
-        </w:tc>
-      </w:tr>
-      <w:tr>
-        <w:tc>
-          <w:tcPr>
-            <w:tcW w:w="1530" w:type="dxa"/>
-          </w:tcPr>
-          <w:p>
             <w:pPr>
               <w:pStyle w:val="BodyText"/>
               <w:widowControl w:val="0"/>
@@ -8054,33 +8439,12 @@
               </w:rPr>
             </w:pPr>
             <w:r>
-              <w:rPr>
-                <w:rFonts w:asciiTheme="majorHAnsi" w:hAnsiTheme="majorHAnsi"/>
-              </w:rPr>
-              <w:t>Date:</w:t>
-            </w:r>
-          </w:p>
-        </w:tc>
-        <w:tc>
-          <w:tcPr>
-            <w:tcW w:w="7560" w:type="dxa"/>
-          </w:tcPr>
-          <w:p>
-            <w:r>
-              <w:rPr>
-                <w:rFonts w:ascii="Times New Roman" w:hAnsi="Times New Roman" w:cs="Times New Roman"/>
-                <w:sz w:val="18"/>
-                <w:szCs w:val="18"/>
-              </w:rPr>
-              <w:t xml:space="preserve">{sefDate}</w:t>
+              <w:t xml:space="preserve">{sefSignatureFileName}</w:t>
             </w:r>
           </w:p>
         </w:tc>
       </w:tr>
       <w:tr>
-        <w:trPr>
-          <w:trHeight w:val="708"/>
-        </w:trPr>
         <w:tc>
           <w:tcPr>
             <w:tcW w:w="1530" w:type="dxa"/>
@@ -8101,6 +8465,59 @@
               <w:rPr>
                 <w:rFonts w:asciiTheme="majorHAnsi" w:hAnsiTheme="majorHAnsi"/>
               </w:rPr>
+              <w:t>Date:</w:t>
+            </w:r>
+          </w:p>
+        </w:tc>
+        <w:tc>
+          <w:tcPr>
+            <w:tcW w:w="7560" w:type="dxa"/>
+          </w:tcPr>
+          <w:p>
+            <w:pPr>
+              <w:pStyle w:val="BodyText"/>
+              <w:widowControl w:val="0"/>
+              <w:autoSpaceDE w:val="0"/>
+              <w:autoSpaceDN w:val="0"/>
+              <w:spacing w:before="4"/>
+              <w:ind w:left="165"/>
+              <w:rPr>
+                <w:rFonts w:asciiTheme="majorHAnsi" w:hAnsiTheme="majorHAnsi"/>
+              </w:rPr>
+            </w:pPr>
+            <w:r>
+              <w:rPr>
+                <w:rFonts w:asciiTheme="majorHAnsi" w:hAnsiTheme="majorHAnsi"/>
+              </w:rPr>
+              <w:t xml:space="preserve">{sefDate}</w:t>
+            </w:r>
+          </w:p>
+        </w:tc>
+      </w:tr>
+      <w:tr>
+        <w:trPr>
+          <w:trHeight w:val="708"/>
+        </w:trPr>
+        <w:tc>
+          <w:tcPr>
+            <w:tcW w:w="1530" w:type="dxa"/>
+          </w:tcPr>
+          <w:p>
+            <w:pPr>
+              <w:pStyle w:val="BodyText"/>
+              <w:widowControl w:val="0"/>
+              <w:autoSpaceDE w:val="0"/>
+              <w:autoSpaceDN w:val="0"/>
+              <w:spacing w:before="4"/>
+              <w:ind w:left="165"/>
+              <w:rPr>
+                <w:rFonts w:asciiTheme="majorHAnsi" w:hAnsiTheme="majorHAnsi"/>
+              </w:rPr>
+            </w:pPr>
+            <w:r>
+              <w:rPr>
+                <w:rFonts w:asciiTheme="majorHAnsi" w:hAnsiTheme="majorHAnsi"/>
+              </w:rPr>
               <w:t>Comments:</w:t>
             </w:r>
           </w:p>
@@ -8110,12 +8527,18 @@
             <w:tcW w:w="7560" w:type="dxa"/>
           </w:tcPr>
           <w:p>
-            <w:r>
-              <w:rPr>
-                <w:rFonts w:ascii="Times New Roman" w:hAnsi="Times New Roman" w:cs="Times New Roman"/>
-                <w:sz w:val="18"/>
-                <w:szCs w:val="18"/>
-              </w:rPr>
+            <w:pPr>
+              <w:pStyle w:val="BodyText"/>
+              <w:widowControl w:val="0"/>
+              <w:autoSpaceDE w:val="0"/>
+              <w:autoSpaceDN w:val="0"/>
+              <w:spacing w:before="4"/>
+              <w:ind w:left="165"/>
+              <w:rPr>
+                <w:rFonts w:asciiTheme="majorHAnsi" w:hAnsiTheme="majorHAnsi"/>
+              </w:rPr>
+            </w:pPr>
+            <w:r>
               <w:t xml:space="preserve">{sefComments}</w:t>
             </w:r>
           </w:p>

</xml_diff>